<commit_message>
Update installation guide to include service management
Reorganize sections in the DOCX installation guide to place service management under Linux installation.

Replit-Commit-Author: Agent
Replit-Commit-Session-Id: a534d6f4-cb6c-4ba3-9913-1c0eaa8c71b7
Replit-Commit-Checkpoint-Type: full_checkpoint
Replit-Commit-Event-Id: 73c6b516-3b96-4699-b5e2-8b966f83221d
Replit-Commit-Screenshot-Url: https://storage.googleapis.com/screenshot-production-us-central1/20f5b981-52d4-47e2-8164-579b03149638/a534d6f4-cb6c-4ba3-9913-1c0eaa8c71b7/rq3YXOS
Replit-Helium-Checkpoint-Created: true
</commit_message>
<xml_diff>
--- a/guia_relay_instalacion.docx
+++ b/guia_relay_instalacion.docx
@@ -68,13 +68,6 @@
       <w:pPr>
         <w:pStyle w:val="Heading1"/>
         <w:spacing w:after="120" w:before="400"/>
-        <w:rPr>
-          <w:b/>
-          <w:bCs/>
-          <w:color w:val="1F4E79"/>
-          <w:sz w:val="28"/>
-          <w:szCs w:val="28"/>
-        </w:rPr>
       </w:pPr>
       <w:r>
         <w:t xml:space="preserve">1. ¿Qué es el Relay Daemon?</w:t>
@@ -161,13 +154,6 @@
       <w:pPr>
         <w:pStyle w:val="Heading1"/>
         <w:spacing w:after="120" w:before="400"/>
-        <w:rPr>
-          <w:b/>
-          <w:bCs/>
-          <w:color w:val="1F4E79"/>
-          <w:sz w:val="28"/>
-          <w:szCs w:val="28"/>
-        </w:rPr>
       </w:pPr>
       <w:r>
         <w:t xml:space="preserve">2. Hardware necesario</w:t>
@@ -220,7 +206,6 @@
           <w:p>
             <w:pPr>
               <w:spacing w:after="40" w:before="40"/>
-              <w:jc w:val="left"/>
             </w:pPr>
             <w:r>
               <w:rPr>
@@ -241,7 +226,6 @@
           <w:p>
             <w:pPr>
               <w:spacing w:after="40" w:before="40"/>
-              <w:jc w:val="left"/>
             </w:pPr>
             <w:r>
               <w:rPr>
@@ -262,7 +246,6 @@
           <w:p>
             <w:pPr>
               <w:spacing w:after="40" w:before="40"/>
-              <w:jc w:val="left"/>
             </w:pPr>
             <w:r>
               <w:rPr>
@@ -475,13 +458,6 @@
       <w:pPr>
         <w:pStyle w:val="Heading3"/>
         <w:spacing w:after="60" w:before="200"/>
-        <w:rPr>
-          <w:b/>
-          <w:bCs/>
-          <w:color w:val="404040"/>
-          <w:sz w:val="22"/>
-          <w:szCs w:val="22"/>
-        </w:rPr>
       </w:pPr>
       <w:r>
         <w:t xml:space="preserve">Conexiones físicas</w:t>
@@ -565,13 +541,6 @@
       <w:pPr>
         <w:pStyle w:val="Heading1"/>
         <w:spacing w:after="120" w:before="400"/>
-        <w:rPr>
-          <w:b/>
-          <w:bCs/>
-          <w:color w:val="1F4E79"/>
-          <w:sz w:val="28"/>
-          <w:szCs w:val="28"/>
-        </w:rPr>
       </w:pPr>
       <w:r>
         <w:t xml:space="preserve">3. Instalación en Linux / Raspberry Pi</w:t>
@@ -581,13 +550,6 @@
       <w:pPr>
         <w:pStyle w:val="Heading2"/>
         <w:spacing w:after="80" w:before="320"/>
-        <w:rPr>
-          <w:b/>
-          <w:bCs/>
-          <w:color w:val="1F4E79"/>
-          <w:sz w:val="24"/>
-          <w:szCs w:val="24"/>
-        </w:rPr>
       </w:pPr>
       <w:r>
         <w:t xml:space="preserve">3.1  Instalación automática (recomendado)</w:t>
@@ -816,13 +778,6 @@
       <w:pPr>
         <w:pStyle w:val="Heading2"/>
         <w:spacing w:after="80" w:before="320"/>
-        <w:rPr>
-          <w:b/>
-          <w:bCs/>
-          <w:color w:val="1F4E79"/>
-          <w:sz w:val="24"/>
-          <w:szCs w:val="24"/>
-        </w:rPr>
       </w:pPr>
       <w:r>
         <w:t xml:space="preserve">3.2  Instalación manual paso a paso</w:t>
@@ -850,13 +805,6 @@
       <w:pPr>
         <w:pStyle w:val="Heading3"/>
         <w:spacing w:after="60" w:before="200"/>
-        <w:rPr>
-          <w:b/>
-          <w:bCs/>
-          <w:color w:val="404040"/>
-          <w:sz w:val="22"/>
-          <w:szCs w:val="22"/>
-        </w:rPr>
       </w:pPr>
       <w:r>
         <w:t xml:space="preserve">Paso 1 — Instalar dependencias</w:t>
@@ -903,13 +851,6 @@
       <w:pPr>
         <w:pStyle w:val="Heading3"/>
         <w:spacing w:after="60" w:before="200"/>
-        <w:rPr>
-          <w:b/>
-          <w:bCs/>
-          <w:color w:val="404040"/>
-          <w:sz w:val="22"/>
-          <w:szCs w:val="22"/>
-        </w:rPr>
       </w:pPr>
       <w:r>
         <w:t xml:space="preserve">Paso 2 — Instalar pnpm y Node.js</w:t>
@@ -972,13 +913,6 @@
       <w:pPr>
         <w:pStyle w:val="Heading3"/>
         <w:spacing w:after="60" w:before="200"/>
-        <w:rPr>
-          <w:b/>
-          <w:bCs/>
-          <w:color w:val="404040"/>
-          <w:sz w:val="22"/>
-          <w:szCs w:val="22"/>
-        </w:rPr>
       </w:pPr>
       <w:r>
         <w:t xml:space="preserve">Paso 3 — Clonar el repositorio</w:t>
@@ -1025,13 +959,6 @@
       <w:pPr>
         <w:pStyle w:val="Heading3"/>
         <w:spacing w:after="60" w:before="200"/>
-        <w:rPr>
-          <w:b/>
-          <w:bCs/>
-          <w:color w:val="404040"/>
-          <w:sz w:val="22"/>
-          <w:szCs w:val="22"/>
-        </w:rPr>
       </w:pPr>
       <w:r>
         <w:t xml:space="preserve">Paso 4 — Compilar el relay daemon</w:t>
@@ -1078,13 +1005,6 @@
       <w:pPr>
         <w:pStyle w:val="Heading3"/>
         <w:spacing w:after="60" w:before="200"/>
-        <w:rPr>
-          <w:b/>
-          <w:bCs/>
-          <w:color w:val="404040"/>
-          <w:sz w:val="22"/>
-          <w:szCs w:val="22"/>
-        </w:rPr>
       </w:pPr>
       <w:r>
         <w:t xml:space="preserve">Paso 5 — Identificar los dispositivos</w:t>
@@ -1227,13 +1147,6 @@
       <w:pPr>
         <w:pStyle w:val="Heading3"/>
         <w:spacing w:after="60" w:before="200"/>
-        <w:rPr>
-          <w:b/>
-          <w:bCs/>
-          <w:color w:val="404040"/>
-          <w:sz w:val="22"/>
-          <w:szCs w:val="22"/>
-        </w:rPr>
       </w:pPr>
       <w:r>
         <w:t xml:space="preserve">Paso 6 — Crear la configuración</w:t>
@@ -1312,13 +1225,6 @@
       <w:pPr>
         <w:pStyle w:val="Heading3"/>
         <w:spacing w:after="60" w:before="200"/>
-        <w:rPr>
-          <w:b/>
-          <w:bCs/>
-          <w:color w:val="404040"/>
-          <w:sz w:val="22"/>
-          <w:szCs w:val="22"/>
-        </w:rPr>
       </w:pPr>
       <w:r>
         <w:t xml:space="preserve">Paso 7 — Instalar el servicio systemd</w:t>
@@ -1334,7 +1240,7 @@
           <w:sz w:val="20"/>
           <w:szCs w:val="20"/>
         </w:rPr>
-        <w:t xml:space="preserve">Crea el archivo /etc/systemd/system/eqso-relay@.service con el siguiente contenido (ajusta User y rutas):</w:t>
+        <w:t xml:space="preserve">Crea el archivo /etc/systemd/system/eqso-relay@.service (ajusta User y rutas):</w:t>
       </w:r>
     </w:p>
     <w:p>
@@ -1676,6 +1582,180 @@
           <w:szCs w:val="18"/>
         </w:rPr>
         <w:t xml:space="preserve">sudo systemctl start  eqso-relay@CB</w:t>
+      </w:r>
+    </w:p>
+    <w:p>
+      <w:pPr>
+        <w:spacing w:after="60" w:before="0"/>
+      </w:pPr>
+    </w:p>
+    <w:p>
+      <w:pPr>
+        <w:pStyle w:val="Heading2"/>
+        <w:spacing w:after="80" w:before="320"/>
+      </w:pPr>
+      <w:r>
+        <w:t xml:space="preserve">3.3  Gestión del servicio</w:t>
+      </w:r>
+    </w:p>
+    <w:p>
+      <w:pPr>
+        <w:shd w:fill="F2F2F2" w:color="F2F2F2" w:val="solid"/>
+        <w:spacing w:after="0" w:before="0"/>
+        <w:ind w:left="360" w:right="360"/>
+      </w:pPr>
+      <w:r>
+        <w:rPr>
+          <w:rFonts w:ascii="Courier New" w:cs="Courier New" w:eastAsia="Courier New" w:hAnsi="Courier New"/>
+          <w:color w:val="1C1C1C"/>
+          <w:sz w:val="18"/>
+          <w:szCs w:val="18"/>
+        </w:rPr>
+        <w:t xml:space="preserve"># Estado del servicio:</w:t>
+      </w:r>
+    </w:p>
+    <w:p>
+      <w:pPr>
+        <w:shd w:fill="F2F2F2" w:color="F2F2F2" w:val="solid"/>
+        <w:spacing w:after="0" w:before="0"/>
+        <w:ind w:left="360" w:right="360"/>
+      </w:pPr>
+      <w:r>
+        <w:rPr>
+          <w:rFonts w:ascii="Courier New" w:cs="Courier New" w:eastAsia="Courier New" w:hAnsi="Courier New"/>
+          <w:color w:val="1C1C1C"/>
+          <w:sz w:val="18"/>
+          <w:szCs w:val="18"/>
+        </w:rPr>
+        <w:t xml:space="preserve">sudo systemctl status eqso-relay@CB</w:t>
+      </w:r>
+    </w:p>
+    <w:p>
+      <w:pPr>
+        <w:shd w:fill="F2F2F2" w:color="F2F2F2" w:val="solid"/>
+        <w:spacing w:after="0" w:before="0"/>
+        <w:ind w:left="360" w:right="360"/>
+      </w:pPr>
+      <w:r>
+        <w:rPr>
+          <w:rFonts w:ascii="Courier New" w:cs="Courier New" w:eastAsia="Courier New" w:hAnsi="Courier New"/>
+          <w:color w:val="1C1C1C"/>
+          <w:sz w:val="18"/>
+          <w:szCs w:val="18"/>
+        </w:rPr>
+        <w:t xml:space="preserve"/>
+      </w:r>
+    </w:p>
+    <w:p>
+      <w:pPr>
+        <w:shd w:fill="F2F2F2" w:color="F2F2F2" w:val="solid"/>
+        <w:spacing w:after="0" w:before="0"/>
+        <w:ind w:left="360" w:right="360"/>
+      </w:pPr>
+      <w:r>
+        <w:rPr>
+          <w:rFonts w:ascii="Courier New" w:cs="Courier New" w:eastAsia="Courier New" w:hAnsi="Courier New"/>
+          <w:color w:val="1C1C1C"/>
+          <w:sz w:val="18"/>
+          <w:szCs w:val="18"/>
+        </w:rPr>
+        <w:t xml:space="preserve"># Ver logs en tiempo real:</w:t>
+      </w:r>
+    </w:p>
+    <w:p>
+      <w:pPr>
+        <w:shd w:fill="F2F2F2" w:color="F2F2F2" w:val="solid"/>
+        <w:spacing w:after="0" w:before="0"/>
+        <w:ind w:left="360" w:right="360"/>
+      </w:pPr>
+      <w:r>
+        <w:rPr>
+          <w:rFonts w:ascii="Courier New" w:cs="Courier New" w:eastAsia="Courier New" w:hAnsi="Courier New"/>
+          <w:color w:val="1C1C1C"/>
+          <w:sz w:val="18"/>
+          <w:szCs w:val="18"/>
+        </w:rPr>
+        <w:t xml:space="preserve">sudo journalctl -u eqso-relay@CB -f</w:t>
+      </w:r>
+    </w:p>
+    <w:p>
+      <w:pPr>
+        <w:shd w:fill="F2F2F2" w:color="F2F2F2" w:val="solid"/>
+        <w:spacing w:after="0" w:before="0"/>
+        <w:ind w:left="360" w:right="360"/>
+      </w:pPr>
+      <w:r>
+        <w:rPr>
+          <w:rFonts w:ascii="Courier New" w:cs="Courier New" w:eastAsia="Courier New" w:hAnsi="Courier New"/>
+          <w:color w:val="1C1C1C"/>
+          <w:sz w:val="18"/>
+          <w:szCs w:val="18"/>
+        </w:rPr>
+        <w:t xml:space="preserve"/>
+      </w:r>
+    </w:p>
+    <w:p>
+      <w:pPr>
+        <w:shd w:fill="F2F2F2" w:color="F2F2F2" w:val="solid"/>
+        <w:spacing w:after="0" w:before="0"/>
+        <w:ind w:left="360" w:right="360"/>
+      </w:pPr>
+      <w:r>
+        <w:rPr>
+          <w:rFonts w:ascii="Courier New" w:cs="Courier New" w:eastAsia="Courier New" w:hAnsi="Courier New"/>
+          <w:color w:val="1C1C1C"/>
+          <w:sz w:val="18"/>
+          <w:szCs w:val="18"/>
+        </w:rPr>
+        <w:t xml:space="preserve"># Parar / Arrancar / Reiniciar:</w:t>
+      </w:r>
+    </w:p>
+    <w:p>
+      <w:pPr>
+        <w:shd w:fill="F2F2F2" w:color="F2F2F2" w:val="solid"/>
+        <w:spacing w:after="0" w:before="0"/>
+        <w:ind w:left="360" w:right="360"/>
+      </w:pPr>
+      <w:r>
+        <w:rPr>
+          <w:rFonts w:ascii="Courier New" w:cs="Courier New" w:eastAsia="Courier New" w:hAnsi="Courier New"/>
+          <w:color w:val="1C1C1C"/>
+          <w:sz w:val="18"/>
+          <w:szCs w:val="18"/>
+        </w:rPr>
+        <w:t xml:space="preserve">sudo systemctl stop    eqso-relay@CB</w:t>
+      </w:r>
+    </w:p>
+    <w:p>
+      <w:pPr>
+        <w:shd w:fill="F2F2F2" w:color="F2F2F2" w:val="solid"/>
+        <w:spacing w:after="0" w:before="0"/>
+        <w:ind w:left="360" w:right="360"/>
+      </w:pPr>
+      <w:r>
+        <w:rPr>
+          <w:rFonts w:ascii="Courier New" w:cs="Courier New" w:eastAsia="Courier New" w:hAnsi="Courier New"/>
+          <w:color w:val="1C1C1C"/>
+          <w:sz w:val="18"/>
+          <w:szCs w:val="18"/>
+        </w:rPr>
+        <w:t xml:space="preserve">sudo systemctl start   eqso-relay@CB</w:t>
+      </w:r>
+    </w:p>
+    <w:p>
+      <w:pPr>
+        <w:shd w:fill="F2F2F2" w:color="F2F2F2" w:val="solid"/>
+        <w:spacing w:after="0" w:before="0"/>
+        <w:ind w:left="360" w:right="360"/>
+      </w:pPr>
+      <w:r>
+        <w:rPr>
+          <w:rFonts w:ascii="Courier New" w:cs="Courier New" w:eastAsia="Courier New" w:hAnsi="Courier New"/>
+          <w:color w:val="1C1C1C"/>
+          <w:sz w:val="18"/>
+          <w:szCs w:val="18"/>
+        </w:rPr>
+        <w:t xml:space="preserve">sudo systemctl restart eqso-relay@CB</w:t>
       </w:r>
     </w:p>
     <w:p>
@@ -1687,13 +1767,6 @@
       <w:pPr>
         <w:pStyle w:val="Heading1"/>
         <w:spacing w:after="120" w:before="400"/>
-        <w:rPr>
-          <w:b/>
-          <w:bCs/>
-          <w:color w:val="1F4E79"/>
-          <w:sz w:val="28"/>
-          <w:szCs w:val="28"/>
-        </w:rPr>
       </w:pPr>
       <w:r>
         <w:t xml:space="preserve">4. Configuración (/etc/eqso-relay/CB.json)</w:t>
@@ -2142,13 +2215,6 @@
       <w:pPr>
         <w:pStyle w:val="Heading3"/>
         <w:spacing w:after="60" w:before="200"/>
-        <w:rPr>
-          <w:b/>
-          <w:bCs/>
-          <w:color w:val="404040"/>
-          <w:sz w:val="22"/>
-          <w:szCs w:val="22"/>
-        </w:rPr>
       </w:pPr>
       <w:r>
         <w:t xml:space="preserve">Referencia de parámetros de audio</w:t>
@@ -2183,7 +2249,6 @@
           <w:p>
             <w:pPr>
               <w:spacing w:after="40" w:before="40"/>
-              <w:jc w:val="left"/>
             </w:pPr>
             <w:r>
               <w:rPr>
@@ -2204,7 +2269,6 @@
           <w:p>
             <w:pPr>
               <w:spacing w:after="40" w:before="40"/>
-              <w:jc w:val="left"/>
             </w:pPr>
             <w:r>
               <w:rPr>
@@ -2225,7 +2289,6 @@
           <w:p>
             <w:pPr>
               <w:spacing w:after="40" w:before="40"/>
-              <w:jc w:val="left"/>
             </w:pPr>
             <w:r>
               <w:rPr>
@@ -2532,13 +2595,6 @@
       <w:pPr>
         <w:pStyle w:val="Heading3"/>
         <w:spacing w:after="60" w:before="200"/>
-        <w:rPr>
-          <w:b/>
-          <w:bCs/>
-          <w:color w:val="404040"/>
-          <w:sz w:val="22"/>
-          <w:szCs w:val="22"/>
-        </w:rPr>
       </w:pPr>
       <w:r>
         <w:t xml:space="preserve">Escenarios de conexión al servidor</w:t>
@@ -2573,7 +2629,6 @@
           <w:p>
             <w:pPr>
               <w:spacing w:after="40" w:before="40"/>
-              <w:jc w:val="left"/>
             </w:pPr>
             <w:r>
               <w:rPr>
@@ -2594,7 +2649,6 @@
           <w:p>
             <w:pPr>
               <w:spacing w:after="40" w:before="40"/>
-              <w:jc w:val="left"/>
             </w:pPr>
             <w:r>
               <w:rPr>
@@ -2615,7 +2669,6 @@
           <w:p>
             <w:pPr>
               <w:spacing w:after="40" w:before="40"/>
-              <w:jc w:val="left"/>
             </w:pPr>
             <w:r>
               <w:rPr>
@@ -2781,13 +2834,6 @@
       <w:pPr>
         <w:pStyle w:val="Heading1"/>
         <w:spacing w:after="120" w:before="400"/>
-        <w:rPr>
-          <w:b/>
-          <w:bCs/>
-          <w:color w:val="1F4E79"/>
-          <w:sz w:val="28"/>
-          <w:szCs w:val="28"/>
-        </w:rPr>
       </w:pPr>
       <w:r>
         <w:t xml:space="preserve">5. PTT serial — path estable</w:t>
@@ -2938,13 +2984,6 @@
       <w:pPr>
         <w:pStyle w:val="Heading1"/>
         <w:spacing w:after="120" w:before="400"/>
-        <w:rPr>
-          <w:b/>
-          <w:bCs/>
-          <w:color w:val="1F4E79"/>
-          <w:sz w:val="28"/>
-          <w:szCs w:val="28"/>
-        </w:rPr>
       </w:pPr>
       <w:r>
         <w:t xml:space="preserve">6. Instalación en Windows</w:t>
@@ -2954,13 +2993,6 @@
       <w:pPr>
         <w:pStyle w:val="Heading2"/>
         <w:spacing w:after="80" w:before="320"/>
-        <w:rPr>
-          <w:b/>
-          <w:bCs/>
-          <w:color w:val="1F4E79"/>
-          <w:sz w:val="24"/>
-          <w:szCs w:val="24"/>
-        </w:rPr>
       </w:pPr>
       <w:r>
         <w:t xml:space="preserve">6.1  Instalación automática</w:t>
@@ -3034,13 +3066,6 @@
       <w:pPr>
         <w:pStyle w:val="Heading2"/>
         <w:spacing w:after="80" w:before="320"/>
-        <w:rPr>
-          <w:b/>
-          <w:bCs/>
-          <w:color w:val="1F4E79"/>
-          <w:sz w:val="24"/>
-          <w:szCs w:val="24"/>
-        </w:rPr>
       </w:pPr>
       <w:r>
         <w:t xml:space="preserve">6.2  Configuración para Windows</w:t>
@@ -3428,13 +3453,6 @@
       <w:pPr>
         <w:pStyle w:val="Heading2"/>
         <w:spacing w:after="80" w:before="320"/>
-        <w:rPr>
-          <w:b/>
-          <w:bCs/>
-          <w:color w:val="1F4E79"/>
-          <w:sz w:val="24"/>
-          <w:szCs w:val="24"/>
-        </w:rPr>
       </w:pPr>
       <w:r>
         <w:t xml:space="preserve">6.3  Gestión del servicio en Windows</w:t>
@@ -3606,213 +3624,18 @@
       <w:pPr>
         <w:pStyle w:val="Heading1"/>
         <w:spacing w:after="120" w:before="400"/>
-        <w:rPr>
-          <w:b/>
-          <w:bCs/>
-          <w:color w:val="1F4E79"/>
-          <w:sz w:val="28"/>
-          <w:szCs w:val="28"/>
-        </w:rPr>
-      </w:pPr>
-      <w:r>
-        <w:t xml:space="preserve">7. Gestión del servicio (Linux)</w:t>
-      </w:r>
-    </w:p>
-    <w:p>
-      <w:pPr>
-        <w:shd w:fill="F2F2F2" w:color="F2F2F2" w:val="solid"/>
-        <w:spacing w:after="0" w:before="0"/>
-        <w:ind w:left="360" w:right="360"/>
-      </w:pPr>
-      <w:r>
-        <w:rPr>
-          <w:rFonts w:ascii="Courier New" w:cs="Courier New" w:eastAsia="Courier New" w:hAnsi="Courier New"/>
-          <w:color w:val="1C1C1C"/>
-          <w:sz w:val="18"/>
-          <w:szCs w:val="18"/>
-        </w:rPr>
-        <w:t xml:space="preserve"># Estado del servicio:</w:t>
-      </w:r>
-    </w:p>
-    <w:p>
-      <w:pPr>
-        <w:shd w:fill="F2F2F2" w:color="F2F2F2" w:val="solid"/>
-        <w:spacing w:after="0" w:before="0"/>
-        <w:ind w:left="360" w:right="360"/>
-      </w:pPr>
-      <w:r>
-        <w:rPr>
-          <w:rFonts w:ascii="Courier New" w:cs="Courier New" w:eastAsia="Courier New" w:hAnsi="Courier New"/>
-          <w:color w:val="1C1C1C"/>
-          <w:sz w:val="18"/>
-          <w:szCs w:val="18"/>
-        </w:rPr>
-        <w:t xml:space="preserve">sudo systemctl status eqso-relay@CB</w:t>
-      </w:r>
-    </w:p>
-    <w:p>
-      <w:pPr>
-        <w:shd w:fill="F2F2F2" w:color="F2F2F2" w:val="solid"/>
-        <w:spacing w:after="0" w:before="0"/>
-        <w:ind w:left="360" w:right="360"/>
-      </w:pPr>
-      <w:r>
-        <w:rPr>
-          <w:rFonts w:ascii="Courier New" w:cs="Courier New" w:eastAsia="Courier New" w:hAnsi="Courier New"/>
-          <w:color w:val="1C1C1C"/>
-          <w:sz w:val="18"/>
-          <w:szCs w:val="18"/>
-        </w:rPr>
-        <w:t xml:space="preserve"/>
-      </w:r>
-    </w:p>
-    <w:p>
-      <w:pPr>
-        <w:shd w:fill="F2F2F2" w:color="F2F2F2" w:val="solid"/>
-        <w:spacing w:after="0" w:before="0"/>
-        <w:ind w:left="360" w:right="360"/>
-      </w:pPr>
-      <w:r>
-        <w:rPr>
-          <w:rFonts w:ascii="Courier New" w:cs="Courier New" w:eastAsia="Courier New" w:hAnsi="Courier New"/>
-          <w:color w:val="1C1C1C"/>
-          <w:sz w:val="18"/>
-          <w:szCs w:val="18"/>
-        </w:rPr>
-        <w:t xml:space="preserve"># Ver logs en tiempo real:</w:t>
-      </w:r>
-    </w:p>
-    <w:p>
-      <w:pPr>
-        <w:shd w:fill="F2F2F2" w:color="F2F2F2" w:val="solid"/>
-        <w:spacing w:after="0" w:before="0"/>
-        <w:ind w:left="360" w:right="360"/>
-      </w:pPr>
-      <w:r>
-        <w:rPr>
-          <w:rFonts w:ascii="Courier New" w:cs="Courier New" w:eastAsia="Courier New" w:hAnsi="Courier New"/>
-          <w:color w:val="1C1C1C"/>
-          <w:sz w:val="18"/>
-          <w:szCs w:val="18"/>
-        </w:rPr>
-        <w:t xml:space="preserve">sudo journalctl -u eqso-relay@CB -f</w:t>
-      </w:r>
-    </w:p>
-    <w:p>
-      <w:pPr>
-        <w:shd w:fill="F2F2F2" w:color="F2F2F2" w:val="solid"/>
-        <w:spacing w:after="0" w:before="0"/>
-        <w:ind w:left="360" w:right="360"/>
-      </w:pPr>
-      <w:r>
-        <w:rPr>
-          <w:rFonts w:ascii="Courier New" w:cs="Courier New" w:eastAsia="Courier New" w:hAnsi="Courier New"/>
-          <w:color w:val="1C1C1C"/>
-          <w:sz w:val="18"/>
-          <w:szCs w:val="18"/>
-        </w:rPr>
-        <w:t xml:space="preserve"/>
-      </w:r>
-    </w:p>
-    <w:p>
-      <w:pPr>
-        <w:shd w:fill="F2F2F2" w:color="F2F2F2" w:val="solid"/>
-        <w:spacing w:after="0" w:before="0"/>
-        <w:ind w:left="360" w:right="360"/>
-      </w:pPr>
-      <w:r>
-        <w:rPr>
-          <w:rFonts w:ascii="Courier New" w:cs="Courier New" w:eastAsia="Courier New" w:hAnsi="Courier New"/>
-          <w:color w:val="1C1C1C"/>
-          <w:sz w:val="18"/>
-          <w:szCs w:val="18"/>
-        </w:rPr>
-        <w:t xml:space="preserve"># Parar / Arrancar / Reiniciar:</w:t>
-      </w:r>
-    </w:p>
-    <w:p>
-      <w:pPr>
-        <w:shd w:fill="F2F2F2" w:color="F2F2F2" w:val="solid"/>
-        <w:spacing w:after="0" w:before="0"/>
-        <w:ind w:left="360" w:right="360"/>
-      </w:pPr>
-      <w:r>
-        <w:rPr>
-          <w:rFonts w:ascii="Courier New" w:cs="Courier New" w:eastAsia="Courier New" w:hAnsi="Courier New"/>
-          <w:color w:val="1C1C1C"/>
-          <w:sz w:val="18"/>
-          <w:szCs w:val="18"/>
-        </w:rPr>
-        <w:t xml:space="preserve">sudo systemctl stop    eqso-relay@CB</w:t>
-      </w:r>
-    </w:p>
-    <w:p>
-      <w:pPr>
-        <w:shd w:fill="F2F2F2" w:color="F2F2F2" w:val="solid"/>
-        <w:spacing w:after="0" w:before="0"/>
-        <w:ind w:left="360" w:right="360"/>
-      </w:pPr>
-      <w:r>
-        <w:rPr>
-          <w:rFonts w:ascii="Courier New" w:cs="Courier New" w:eastAsia="Courier New" w:hAnsi="Courier New"/>
-          <w:color w:val="1C1C1C"/>
-          <w:sz w:val="18"/>
-          <w:szCs w:val="18"/>
-        </w:rPr>
-        <w:t xml:space="preserve">sudo systemctl start   eqso-relay@CB</w:t>
-      </w:r>
-    </w:p>
-    <w:p>
-      <w:pPr>
-        <w:shd w:fill="F2F2F2" w:color="F2F2F2" w:val="solid"/>
-        <w:spacing w:after="0" w:before="0"/>
-        <w:ind w:left="360" w:right="360"/>
-      </w:pPr>
-      <w:r>
-        <w:rPr>
-          <w:rFonts w:ascii="Courier New" w:cs="Courier New" w:eastAsia="Courier New" w:hAnsi="Courier New"/>
-          <w:color w:val="1C1C1C"/>
-          <w:sz w:val="18"/>
-          <w:szCs w:val="18"/>
-        </w:rPr>
-        <w:t xml:space="preserve">sudo systemctl restart eqso-relay@CB</w:t>
-      </w:r>
-    </w:p>
-    <w:p>
-      <w:pPr>
-        <w:spacing w:after="60" w:before="0"/>
-      </w:pPr>
-    </w:p>
-    <w:p>
-      <w:pPr>
-        <w:pStyle w:val="Heading1"/>
-        <w:spacing w:after="120" w:before="400"/>
-        <w:rPr>
-          <w:b/>
-          <w:bCs/>
-          <w:color w:val="1F4E79"/>
-          <w:sz w:val="28"/>
-          <w:szCs w:val="28"/>
-        </w:rPr>
-      </w:pPr>
-      <w:r>
-        <w:t xml:space="preserve">8. Diagnóstico y calibración VOX</w:t>
+      </w:pPr>
+      <w:r>
+        <w:t xml:space="preserve">7. Diagnóstico y calibración VOX</w:t>
       </w:r>
     </w:p>
     <w:p>
       <w:pPr>
         <w:pStyle w:val="Heading2"/>
         <w:spacing w:after="80" w:before="320"/>
-        <w:rPr>
-          <w:b/>
-          <w:bCs/>
-          <w:color w:val="1F4E79"/>
-          <w:sz w:val="24"/>
-          <w:szCs w:val="24"/>
-        </w:rPr>
-      </w:pPr>
-      <w:r>
-        <w:t xml:space="preserve">8.1  Verificar nivel RMS</w:t>
+      </w:pPr>
+      <w:r>
+        <w:t xml:space="preserve">7.1  Verificar nivel RMS</w:t>
       </w:r>
     </w:p>
     <w:p>
@@ -3894,7 +3717,6 @@
           <w:p>
             <w:pPr>
               <w:spacing w:after="40" w:before="40"/>
-              <w:jc w:val="left"/>
             </w:pPr>
             <w:r>
               <w:rPr>
@@ -3915,7 +3737,6 @@
           <w:p>
             <w:pPr>
               <w:spacing w:after="40" w:before="40"/>
-              <w:jc w:val="left"/>
             </w:pPr>
             <w:r>
               <w:rPr>
@@ -3936,7 +3757,6 @@
           <w:p>
             <w:pPr>
               <w:spacing w:after="40" w:before="40"/>
-              <w:jc w:val="left"/>
             </w:pPr>
             <w:r>
               <w:rPr>
@@ -4010,7 +3830,7 @@
                 <w:sz w:val="18"/>
                 <w:szCs w:val="18"/>
               </w:rPr>
-              <w:t xml:space="preserve">100 - 500</w:t>
+              <w:t xml:space="preserve">100 – 500</w:t>
             </w:r>
           </w:p>
         </w:tc>
@@ -4057,7 +3877,7 @@
                 <w:sz w:val="18"/>
                 <w:szCs w:val="18"/>
               </w:rPr>
-              <w:t xml:space="preserve">500 - 5000</w:t>
+              <w:t xml:space="preserve">500 – 5000</w:t>
             </w:r>
           </w:p>
         </w:tc>
@@ -4149,16 +3969,9 @@
       <w:pPr>
         <w:pStyle w:val="Heading2"/>
         <w:spacing w:after="80" w:before="320"/>
-        <w:rPr>
-          <w:b/>
-          <w:bCs/>
-          <w:color w:val="1F4E79"/>
-          <w:sz w:val="24"/>
-          <w:szCs w:val="24"/>
-        </w:rPr>
-      </w:pPr>
-      <w:r>
-        <w:t xml:space="preserve">8.2  Control HTTP local</w:t>
+      </w:pPr>
+      <w:r>
+        <w:t xml:space="preserve">7.2  Control HTTP local</w:t>
       </w:r>
     </w:p>
     <w:p>
@@ -4327,16 +4140,9 @@
       <w:pPr>
         <w:pStyle w:val="Heading2"/>
         <w:spacing w:after="80" w:before="320"/>
-        <w:rPr>
-          <w:b/>
-          <w:bCs/>
-          <w:color w:val="1F4E79"/>
-          <w:sz w:val="24"/>
-          <w:szCs w:val="24"/>
-        </w:rPr>
-      </w:pPr>
-      <w:r>
-        <w:t xml:space="preserve">8.3  Problemas frecuentes</w:t>
+      </w:pPr>
+      <w:r>
+        <w:t xml:space="preserve">7.3  Problemas frecuentes</w:t>
       </w:r>
     </w:p>
     <w:tbl>
@@ -4368,7 +4174,6 @@
           <w:p>
             <w:pPr>
               <w:spacing w:after="40" w:before="40"/>
-              <w:jc w:val="left"/>
             </w:pPr>
             <w:r>
               <w:rPr>
@@ -4389,7 +4194,6 @@
           <w:p>
             <w:pPr>
               <w:spacing w:after="40" w:before="40"/>
-              <w:jc w:val="left"/>
             </w:pPr>
             <w:r>
               <w:rPr>
@@ -4410,7 +4214,6 @@
           <w:p>
             <w:pPr>
               <w:spacing w:after="40" w:before="40"/>
-              <w:jc w:val="left"/>
             </w:pPr>
             <w:r>
               <w:rPr>
@@ -4717,16 +4520,9 @@
       <w:pPr>
         <w:pStyle w:val="Heading1"/>
         <w:spacing w:after="120" w:before="400"/>
-        <w:rPr>
-          <w:b/>
-          <w:bCs/>
-          <w:color w:val="1F4E79"/>
-          <w:sz w:val="28"/>
-          <w:szCs w:val="28"/>
-        </w:rPr>
-      </w:pPr>
-      <w:r>
-        <w:t xml:space="preserve">9. Actualizar el relay daemon</w:t>
+      </w:pPr>
+      <w:r>
+        <w:t xml:space="preserve">8. Actualizar el relay daemon</w:t>
       </w:r>
     </w:p>
     <w:p>

</xml_diff>

<commit_message>
Update installation guide with new admin panel and VM build order information
Update the .docx installation guide to include new sections on the web admin panel for relay operators and the correct VM build order.

Replit-Commit-Author: Agent
Replit-Commit-Session-Id: a534d6f4-cb6c-4ba3-9913-1c0eaa8c71b7
Replit-Commit-Checkpoint-Type: full_checkpoint
Replit-Commit-Event-Id: c42aed26-ca6f-4363-8521-6d7cbb796e5c
Replit-Commit-Screenshot-Url: https://storage.googleapis.com/screenshot-production-us-central1/20f5b981-52d4-47e2-8164-579b03149638/a534d6f4-cb6c-4ba3-9913-1c0eaa8c71b7/K5e7ISW
Replit-Helium-Checkpoint-Created: true
</commit_message>
<xml_diff>
--- a/guia_relay_instalacion.docx
+++ b/guia_relay_instalacion.docx
@@ -4652,6 +4652,409 @@
           <w:sz w:val="16"/>
           <w:szCs w:val="16"/>
         </w:rPr>
+        <w:t xml:space="preserve">eQSO ASORAPA · daycart/eqso-linux · Junio 2026</w:t>
+      </w:r>
+    </w:p>
+    <w:p>
+      <w:pPr>
+        <w:pStyle w:val="Normal"/>
+      </w:pPr>
+      <w:r>
+        <w:t xml:space="preserve">────────────────────────────────────────────────────────────</w:t>
+      </w:r>
+    </w:p>
+    <w:p>
+      <w:pPr>
+        <w:pStyle w:val="Heading1"/>
+      </w:pPr>
+      <w:r>
+        <w:t xml:space="preserve">9. Panel Web — Acceso dual admin + relay</w:t>
+      </w:r>
+    </w:p>
+    <w:p>
+      <w:pPr>
+        <w:pStyle w:val="Normal"/>
+      </w:pPr>
+      <w:r>
+        <w:t xml:space="preserve">A partir de junio 2026 un operador de relay puede tener simultáneamente acceso al panel de administración general del servidor y a su propio panel de relay, mediante el flag "Admin global" independiente del rol asignado.</w:t>
+      </w:r>
+    </w:p>
+    <w:p>
+      <w:pPr>
+        <w:pStyle w:val="Heading2"/>
+      </w:pPr>
+      <w:r>
+        <w:t xml:space="preserve">9.1  Roles y comportamiento al entrar</w:t>
+      </w:r>
+    </w:p>
+    <w:p>
+      <w:pPr>
+        <w:pStyle w:val="Normal"/>
+      </w:pPr>
+      <w:r>
+        <w:t xml:space="preserve">La siguiente tabla resume lo que ve cada tipo de usuario al iniciar sesión:</w:t>
+      </w:r>
+    </w:p>
+    <w:tbl>
+      <w:tblPr>
+        <w:tblStyle w:val="TableGrid"/>
+        <w:tblW w:w="9000" w:type="dxa"/>
+      </w:tblPr>
+      <w:tr>
+        <w:tc>
+          <w:p>
+            <w:r>
+              <w:rPr>
+                <w:b/>
+              </w:rPr>
+              <w:t>Rol</w:t>
+            </w:r>
+          </w:p>
+        </w:tc>
+        <w:tc>
+          <w:p>
+            <w:r>
+              <w:rPr>
+                <w:b/>
+              </w:rPr>
+              <w:t>Admin global</w:t>
+            </w:r>
+          </w:p>
+        </w:tc>
+        <w:tc>
+          <w:p>
+            <w:r>
+              <w:rPr>
+                <w:b/>
+              </w:rPr>
+              <w:t>Comportamiento al entrar</w:t>
+            </w:r>
+          </w:p>
+        </w:tc>
+      </w:tr>
+      <w:tr>
+        <w:tc>
+          <w:p>
+            <w:r>
+              <w:t>relay_operator</w:t>
+            </w:r>
+          </w:p>
+        </w:tc>
+        <w:tc>
+          <w:p>
+            <w:r>
+              <w:t>No</w:t>
+            </w:r>
+          </w:p>
+        </w:tc>
+        <w:tc>
+          <w:p>
+            <w:r>
+              <w:t>Directo al panel relay (confinado, sin posibilidad de salir)</w:t>
+            </w:r>
+          </w:p>
+        </w:tc>
+      </w:tr>
+      <w:tr>
+        <w:tc>
+          <w:p>
+            <w:r>
+              <w:t>relay_operator</w:t>
+            </w:r>
+          </w:p>
+        </w:tc>
+        <w:tc>
+          <w:p>
+            <w:r>
+              <w:t>Sí</w:t>
+            </w:r>
+          </w:p>
+        </w:tc>
+        <w:tc>
+          <w:p>
+            <w:r>
+              <w:t>Panel principal → header con botones Admin y Mi Relay</w:t>
+            </w:r>
+          </w:p>
+        </w:tc>
+      </w:tr>
+      <w:tr>
+        <w:tc>
+          <w:p>
+            <w:r>
+              <w:t>admin</w:t>
+            </w:r>
+          </w:p>
+        </w:tc>
+        <w:tc>
+          <w:p>
+            <w:r>
+              <w:t>Auto</w:t>
+            </w:r>
+          </w:p>
+        </w:tc>
+        <w:tc>
+          <w:p>
+            <w:r>
+              <w:t>Panel principal → header con botón Admin</w:t>
+            </w:r>
+          </w:p>
+        </w:tc>
+      </w:tr>
+      <w:tr>
+        <w:tc>
+          <w:p>
+            <w:r>
+              <w:t>user</w:t>
+            </w:r>
+          </w:p>
+        </w:tc>
+        <w:tc>
+          <w:p>
+            <w:r>
+              <w:t>No</w:t>
+            </w:r>
+          </w:p>
+        </w:tc>
+        <w:tc>
+          <w:p>
+            <w:r>
+              <w:t>Panel principal (sin botones de admin ni relay)</w:t>
+            </w:r>
+          </w:p>
+        </w:tc>
+      </w:tr>
+    </w:tbl>
+    <w:p>
+      <w:pPr>
+        <w:pStyle w:val="Normal"/>
+      </w:pPr>
+    </w:p>
+    <w:p>
+      <w:pPr>
+        <w:pStyle w:val="Heading2"/>
+      </w:pPr>
+      <w:r>
+        <w:t xml:space="preserve">9.2  Cómo dar acceso admin a un operador de relay</w:t>
+      </w:r>
+    </w:p>
+    <w:p>
+      <w:pPr>
+        <w:pStyle w:val="Normal"/>
+      </w:pPr>
+      <w:r>
+        <w:t xml:space="preserve">El administrador puede hacerlo de dos formas:</w:t>
+      </w:r>
+    </w:p>
+    <w:p>
+      <w:pPr>
+        <w:pStyle w:val="Normal"/>
+      </w:pPr>
+      <w:r>
+        <w:t xml:space="preserve">Opción A — desde el panel web (recomendado):</w:t>
+      </w:r>
+    </w:p>
+    <w:p>
+      <w:pPr>
+        <w:pStyle w:val="ListParagraph"/>
+      </w:pPr>
+      <w:r>
+        <w:t xml:space="preserve">Inicia sesión con una cuenta admin → Panel Admin → Usuarios → busca el indicativo → botón "Admin global".</w:t>
+      </w:r>
+    </w:p>
+    <w:p>
+      <w:pPr>
+        <w:pStyle w:val="ListParagraph"/>
+      </w:pPr>
+      <w:r>
+        <w:t xml:space="preserve">El operador debe cerrar sesión y volver a entrar para que el cambio sea efectivo.</w:t>
+      </w:r>
+    </w:p>
+    <w:p>
+      <w:pPr>
+        <w:pStyle w:val="Normal"/>
+      </w:pPr>
+      <w:r>
+        <w:t xml:space="preserve">Opción B — SQL directo en la VM:</w:t>
+      </w:r>
+    </w:p>
+    <w:p>
+      <w:r>
+        <w:rPr>
+          <w:rFonts w:ascii="Courier New" w:hAnsi="Courier New"/>
+          <w:sz w:val="18"/>
+        </w:rPr>
+        <w:t xml:space="preserve">sudo -u postgres psql eqso -c \</w:t>
+      </w:r>
+      <w:r>
+        <w:br/>
+      </w:r>
+      <w:r>
+        <w:rPr>
+          <w:rFonts w:ascii="Courier New" w:hAnsi="Courier New"/>
+          <w:sz w:val="18"/>
+        </w:rPr>
+        <w:t xml:space="preserve">  "UPDATE users SET is_admin = true WHERE callsign = 'INDICATIVO';"</w:t>
+      </w:r>
+    </w:p>
+    <w:p>
+      <w:pPr>
+        <w:pStyle w:val="Heading2"/>
+      </w:pPr>
+      <w:r>
+        <w:t xml:space="preserve">9.3  Interfaz del operador con acceso dual</w:t>
+      </w:r>
+    </w:p>
+    <w:p>
+      <w:pPr>
+        <w:pStyle w:val="Normal"/>
+      </w:pPr>
+      <w:r>
+        <w:t xml:space="preserve">Con acceso dual, al iniciar sesión el operador verá:</w:t>
+      </w:r>
+    </w:p>
+    <w:p>
+      <w:pPr>
+        <w:pStyle w:val="ListParagraph"/>
+      </w:pPr>
+      <w:r>
+        <w:t xml:space="preserve">Pantalla principal con selección de servidor y sala (igual que cualquier usuario).</w:t>
+      </w:r>
+    </w:p>
+    <w:p>
+      <w:pPr>
+        <w:pStyle w:val="ListParagraph"/>
+      </w:pPr>
+      <w:r>
+        <w:t xml:space="preserve">Header: badges "admin" y "operador" y botones Admin y Mi Relay.</w:t>
+      </w:r>
+    </w:p>
+    <w:p>
+      <w:pPr>
+        <w:pStyle w:val="ListParagraph"/>
+      </w:pPr>
+      <w:r>
+        <w:t xml:space="preserve">Botón Admin → panel de administración completo (usuarios, salas, inactividad…).</w:t>
+      </w:r>
+    </w:p>
+    <w:p>
+      <w:pPr>
+        <w:pStyle w:val="ListParagraph"/>
+      </w:pPr>
+      <w:r>
+        <w:t xml:space="preserve">Botón Mi Relay → panel de telemetría y control de su radioenlace.</w:t>
+      </w:r>
+    </w:p>
+    <w:p>
+      <w:pPr>
+        <w:pStyle w:val="ListParagraph"/>
+      </w:pPr>
+      <w:r>
+        <w:t xml:space="preserve">El botón "Volver" del panel relay regresa a la pantalla principal.</w:t>
+      </w:r>
+    </w:p>
+    <w:p>
+      <w:pPr>
+        <w:pStyle w:val="Normal"/>
+      </w:pPr>
+      <w:r>
+        <w:t xml:space="preserve">────────────────────────────────────────────────────────────</w:t>
+      </w:r>
+    </w:p>
+    <w:p>
+      <w:pPr>
+        <w:pStyle w:val="Heading1"/>
+      </w:pPr>
+      <w:r>
+        <w:t xml:space="preserve">10. Actualizar el servidor (VM) — orden correcto</w:t>
+      </w:r>
+    </w:p>
+    <w:p>
+      <w:pPr>
+        <w:pStyle w:val="Normal"/>
+      </w:pPr>
+      <w:r>
+        <w:t xml:space="preserve">Al actualizar el código en la VM es imprescindible compilar el cliente web ANTES que el servidor. El script de build del servidor únicamente copia el bundle ya generado — no lo recompila.</w:t>
+      </w:r>
+    </w:p>
+    <w:p>
+      <w:pPr>
+        <w:pStyle w:val="Normal"/>
+      </w:pPr>
+      <w:r>
+        <w:t xml:space="preserve">Secuencia de actualización completa en la VM:</w:t>
+      </w:r>
+    </w:p>
+    <w:p>
+      <w:r>
+        <w:rPr>
+          <w:rFonts w:ascii="Courier New" w:hAnsi="Courier New"/>
+          <w:sz w:val="18"/>
+        </w:rPr>
+        <w:t xml:space="preserve">cd /opt/eqso-asorapa</w:t>
+      </w:r>
+      <w:r>
+        <w:br/>
+      </w:r>
+      <w:r>
+        <w:rPr>
+          <w:rFonts w:ascii="Courier New" w:hAnsi="Courier New"/>
+          <w:sz w:val="18"/>
+        </w:rPr>
+        <w:t xml:space="preserve">git pull</w:t>
+      </w:r>
+      <w:r>
+        <w:br/>
+      </w:r>
+      <w:r>
+        <w:rPr>
+          <w:rFonts w:ascii="Courier New" w:hAnsi="Courier New"/>
+          <w:sz w:val="18"/>
+        </w:rPr>
+        <w:t xml:space="preserve">BASE_PATH=/ pnpm --filter @workspace/eqso-client run build</w:t>
+      </w:r>
+      <w:r>
+        <w:br/>
+      </w:r>
+      <w:r>
+        <w:rPr>
+          <w:rFonts w:ascii="Courier New" w:hAnsi="Courier New"/>
+          <w:sz w:val="18"/>
+        </w:rPr>
+        <w:t xml:space="preserve">pnpm --filter @workspace/api-server run build</w:t>
+      </w:r>
+      <w:r>
+        <w:br/>
+      </w:r>
+      <w:r>
+        <w:rPr>
+          <w:rFonts w:ascii="Courier New" w:hAnsi="Courier New"/>
+          <w:sz w:val="18"/>
+        </w:rPr>
+        <w:t xml:space="preserve">sudo systemctl restart eqso.service</w:t>
+      </w:r>
+    </w:p>
+    <w:p>
+      <w:pPr>
+        <w:pStyle w:val="Normal"/>
+      </w:pPr>
+      <w:r>
+        <w:t xml:space="preserve">⚠  Si solo ejecutas el build del servidor sin compilar el cliente antes, el navegador continuará ejecutando el JavaScript antiguo aunque el servidor tenga código nuevo. Usa siempre la secuencia completa.</w:t>
+      </w:r>
+    </w:p>
+    <w:p>
+      <w:pPr>
+        <w:pStyle w:val="Normal"/>
+      </w:pPr>
+      <w:r>
+        <w:t xml:space="preserve">━━━━━━━━━━━━━━━━━━━━━━━━━━━━━━━━━━━━━━━━━━━━━━━━━━━━━━━━━━━━</w:t>
+      </w:r>
+    </w:p>
+    <w:p>
+      <w:pPr>
+        <w:pStyle w:val="Normal"/>
+      </w:pPr>
+      <w:r>
         <w:t xml:space="preserve">eQSO ASORAPA · daycart/eqso-linux · Junio 2026</w:t>
       </w:r>
     </w:p>

</xml_diff>

<commit_message>
Update documentation title for relay installation guide
Update the title of the "Guia Instalacion Relay" Word document from "Guía de Instalación y Configuración — eQSO Relay Daemon v1.3" to "Guía Completa — eQSO Relay Daemon v1.3".

Replit-Commit-Author: Agent
Replit-Commit-Session-Id: a534d6f4-cb6c-4ba3-9913-1c0eaa8c71b7
Replit-Commit-Checkpoint-Type: full_checkpoint
Replit-Commit-Event-Id: 0a0a3869-1447-413a-8c4f-ed41ad914706
Replit-Commit-Screenshot-Url: https://storage.googleapis.com/screenshot-production-us-central1/20f5b981-52d4-47e2-8164-579b03149638/a534d6f4-cb6c-4ba3-9913-1c0eaa8c71b7/K5e7ISW
Replit-Helium-Checkpoint-Created: true
</commit_message>
<xml_diff>
--- a/guia_relay_instalacion.docx
+++ b/guia_relay_instalacion.docx
@@ -24,7 +24,7 @@
           <w:color w:val="2E74B5"/>
           <w:sz w:val="36"/>
         </w:rPr>
-        <w:t>Guía de Instalación y Configuración</w:t>
+        <w:t>Guía de Instalación, Configuración y Administración</w:t>
       </w:r>
     </w:p>
     <w:p/>
@@ -53,15 +53,140 @@
         <w:rPr>
           <w:color w:val="1F497D"/>
         </w:rPr>
+        <w:t>Contenido</w:t>
+      </w:r>
+    </w:p>
+    <w:p>
+      <w:pPr>
+        <w:ind w:left="283"/>
+      </w:pPr>
+      <w:r>
+        <w:rPr>
+          <w:sz w:val="22"/>
+        </w:rPr>
+        <w:t>1.  ¿Qué es el Relay Daemon?</w:t>
+      </w:r>
+    </w:p>
+    <w:p>
+      <w:pPr>
+        <w:ind w:left="283"/>
+      </w:pPr>
+      <w:r>
+        <w:rPr>
+          <w:sz w:val="22"/>
+        </w:rPr>
+        <w:t>2.  Instalación en Linux / Raspberry Pi</w:t>
+      </w:r>
+    </w:p>
+    <w:p>
+      <w:pPr>
+        <w:ind w:left="283"/>
+      </w:pPr>
+      <w:r>
+        <w:rPr>
+          <w:sz w:val="22"/>
+        </w:rPr>
+        <w:t>3.  Instalación en Windows 10/11</w:t>
+      </w:r>
+    </w:p>
+    <w:p>
+      <w:pPr>
+        <w:ind w:left="283"/>
+      </w:pPr>
+      <w:r>
+        <w:rPr>
+          <w:sz w:val="22"/>
+        </w:rPr>
+        <w:t>4.  Archivo de configuración</w:t>
+      </w:r>
+    </w:p>
+    <w:p>
+      <w:pPr>
+        <w:ind w:left="283"/>
+      </w:pPr>
+      <w:r>
+        <w:rPr>
+          <w:sz w:val="22"/>
+        </w:rPr>
+        <w:t>5.  Calibración del VOX</w:t>
+      </w:r>
+    </w:p>
+    <w:p>
+      <w:pPr>
+        <w:ind w:left="283"/>
+      </w:pPr>
+      <w:r>
+        <w:rPr>
+          <w:sz w:val="22"/>
+        </w:rPr>
+        <w:t>6.  Diagnóstico y resolución de problemas</w:t>
+      </w:r>
+    </w:p>
+    <w:p>
+      <w:pPr>
+        <w:ind w:left="283"/>
+      </w:pPr>
+      <w:r>
+        <w:rPr>
+          <w:sz w:val="22"/>
+        </w:rPr>
+        <w:t>7.  Puertos y red</w:t>
+      </w:r>
+    </w:p>
+    <w:p>
+      <w:pPr>
+        <w:ind w:left="283"/>
+      </w:pPr>
+      <w:r>
+        <w:rPr>
+          <w:sz w:val="22"/>
+        </w:rPr>
+        <w:t>8.  Roles de usuario</w:t>
+      </w:r>
+    </w:p>
+    <w:p>
+      <w:pPr>
+        <w:ind w:left="283"/>
+      </w:pPr>
+      <w:r>
+        <w:rPr>
+          <w:sz w:val="22"/>
+        </w:rPr>
+        <w:t>9.  Panel de Administración</w:t>
+      </w:r>
+    </w:p>
+    <w:p>
+      <w:pPr>
+        <w:ind w:left="283"/>
+      </w:pPr>
+      <w:r>
+        <w:rPr>
+          <w:sz w:val="22"/>
+        </w:rPr>
+        <w:t>10.  Panel de Operador de Radioenlace</w:t>
+      </w:r>
+    </w:p>
+    <w:p>
+      <w:r>
+        <w:br w:type="page"/>
+      </w:r>
+    </w:p>
+    <w:p>
+      <w:pPr>
+        <w:pStyle w:val="Heading1"/>
+      </w:pPr>
+      <w:r>
+        <w:rPr>
+          <w:color w:val="1F497D"/>
+        </w:rPr>
         <w:t>1. ¿Qué es el Relay Daemon?</w:t>
       </w:r>
     </w:p>
     <w:p>
       <w:r>
-        <w:t>El relay daemon conecta una radio CB física a una sala de voz eQSO a través de internet. Captura el audio de la radio, lo codifica en GSM 06.10 y lo envía al servidor eQSO. A la vez, recibe el audio de otros usuarios y lo reproduce por el altavoz de la radio.</w:t>
+        <w:t>El relay daemon conecta una radio CB física a una sala de voz eQSO a través de internet. Captura el audio de la radio, lo codifica en GSM 06.10 y lo envía al servidor eQSO. A la vez, recibe el audio de otros usuarios de la sala y lo reproduce por el altavoz de la radio.</w:t>
       </w:r>
     </w:p>
-    <w:p/>
     <w:p>
       <w:r>
         <w:t>El daemon opera de forma completamente automática mediante VOX:</w:t>
@@ -72,7 +197,7 @@
         <w:pStyle w:val="ListBullet"/>
       </w:pPr>
       <w:r>
-        <w:t>Detecta cuando alguien habla por la radio (nivel RMS supera el umbral).</w:t>
+        <w:t>Detecta cuando alguien habla por la radio (nivel RMS supera el umbral configurado).</w:t>
       </w:r>
     </w:p>
     <w:p>
@@ -145,7 +270,7 @@
           <w:color w:val="196019"/>
           <w:sz w:val="20"/>
         </w:rPr>
-        <w:t>💡 Sin cable PTT el relay solo escucha la sala y no transmite a la radio. El VOX solo controla el canal eQSO, no el PTT de RF.</w:t>
+        <w:t>💡 Sin cable PTT el relay solo escucha la sala y no transmite a la radio. El VOX controla el canal eQSO, no el PTT de RF.</w:t>
       </w:r>
     </w:p>
     <w:p>
@@ -198,27 +323,6 @@
     <w:p/>
     <w:p>
       <w:r>
-        <w:t>Si ya tienes el repositorio clonado:</w:t>
-      </w:r>
-    </w:p>
-    <w:p>
-      <w:pPr>
-        <w:pStyle w:val="NoSpacing"/>
-        <w:ind w:left="454"/>
-        <w:shd w:val="clear" w:color="auto" w:fill="F2F2F2"/>
-      </w:pPr>
-      <w:r>
-        <w:rPr>
-          <w:rFonts w:ascii="Courier New" w:hAnsi="Courier New"/>
-          <w:color w:val="C7254E"/>
-          <w:sz w:val="18"/>
-        </w:rPr>
-        <w:t>bash artifacts/relay-daemon/install/install-relay.sh</w:t>
-      </w:r>
-    </w:p>
-    <w:p/>
-    <w:p>
-      <w:r>
         <w:t>El script realiza automáticamente:</w:t>
       </w:r>
     </w:p>
@@ -296,11 +400,6 @@
           <w:color w:val="2E74B5"/>
         </w:rPr>
         <w:t>2.2 Instalación manual paso a paso</w:t>
-      </w:r>
-    </w:p>
-    <w:p>
-      <w:r>
-        <w:t>Si prefieres controlar cada paso:</w:t>
       </w:r>
     </w:p>
     <w:p>
@@ -570,7 +669,7 @@
           <w:color w:val="C7254E"/>
           <w:sz w:val="18"/>
         </w:rPr>
-        <w:t>aplay -l    # buscar "plughw:X,0" donde X es el número de la tarjeta USB</w:t>
+        <w:t>aplay -l    # buscar "plughw:X,0" donde X es el número de tarjeta</w:t>
       </w:r>
     </w:p>
     <w:p>
@@ -690,7 +789,7 @@
           <w:color w:val="C7254E"/>
           <w:sz w:val="18"/>
         </w:rPr>
-        <w:t>sudo nano /etc/eqso-relay/CB.json   # editar con tus valores</w:t>
+        <w:t>sudo nano /etc/eqso-relay/CB.json</w:t>
       </w:r>
     </w:p>
     <w:p>
@@ -1101,7 +1200,7 @@
           <w:color w:val="C7254E"/>
           <w:sz w:val="18"/>
         </w:rPr>
-        <w:t>Stop-ScheduledTask -TaskName "eQSO Relay CB"</w:t>
+        <w:t>Stop-ScheduledTask  -TaskName "eQSO Relay CB"</w:t>
       </w:r>
     </w:p>
     <w:p>
@@ -1263,7 +1362,7 @@
           <w:color w:val="C7254E"/>
           <w:sz w:val="18"/>
         </w:rPr>
-        <w:t>cd %USERPROFILE%\eqso-linux</w:t>
+        <w:t>cd $env:USERPROFILE\eqso-linux</w:t>
       </w:r>
     </w:p>
     <w:p>
@@ -3225,7 +3324,6 @@
         </w:tc>
       </w:tr>
     </w:tbl>
-    <w:p/>
     <w:p>
       <w:pPr>
         <w:ind w:left="340"/>
@@ -3236,7 +3334,99 @@
           <w:color w:val="7F6000"/>
           <w:sz w:val="20"/>
         </w:rPr>
-        <w:t>⚠ captureFormat y playbackFormat solo aplican cuando backend = "ffmpeg". En backend "alsa" se ignoran.</w:t>
+        <w:t>⚠  captureFormat y playbackFormat solo aplican cuando backend = "ffmpeg". En backend "alsa" se ignoran.</w:t>
+      </w:r>
+    </w:p>
+    <w:p/>
+    <w:p>
+      <w:pPr>
+        <w:pStyle w:val="Heading2"/>
+      </w:pPr>
+      <w:r>
+        <w:rPr>
+          <w:color w:val="2E74B5"/>
+        </w:rPr>
+        <w:t>4.5 Actualizar config desde versiones anteriores a v1.3</w:t>
+      </w:r>
+    </w:p>
+    <w:p>
+      <w:r>
+        <w:t>Si tienes un CB.json de antes de Julio 2026, añade estos campos en audio:</w:t>
+      </w:r>
+    </w:p>
+    <w:p>
+      <w:pPr>
+        <w:pStyle w:val="NoSpacing"/>
+        <w:ind w:left="454"/>
+        <w:shd w:val="clear" w:color="auto" w:fill="F2F2F2"/>
+      </w:pPr>
+      <w:r>
+        <w:rPr>
+          <w:rFonts w:ascii="Courier New" w:hAnsi="Courier New"/>
+          <w:color w:val="C7254E"/>
+          <w:sz w:val="18"/>
+        </w:rPr>
+        <w:t>"audio": {</w:t>
+      </w:r>
+    </w:p>
+    <w:p>
+      <w:pPr>
+        <w:pStyle w:val="NoSpacing"/>
+        <w:ind w:left="454"/>
+        <w:shd w:val="clear" w:color="auto" w:fill="F2F2F2"/>
+      </w:pPr>
+      <w:r>
+        <w:rPr>
+          <w:rFonts w:ascii="Courier New" w:hAnsi="Courier New"/>
+          <w:color w:val="C7254E"/>
+          <w:sz w:val="18"/>
+        </w:rPr>
+        <w:t xml:space="preserve">  "voxHangMs": 800,</w:t>
+      </w:r>
+    </w:p>
+    <w:p>
+      <w:pPr>
+        <w:pStyle w:val="NoSpacing"/>
+        <w:ind w:left="454"/>
+        <w:shd w:val="clear" w:color="auto" w:fill="F2F2F2"/>
+      </w:pPr>
+      <w:r>
+        <w:rPr>
+          <w:rFonts w:ascii="Courier New" w:hAnsi="Courier New"/>
+          <w:color w:val="C7254E"/>
+          <w:sz w:val="18"/>
+        </w:rPr>
+        <w:t xml:space="preserve">  "postRxSuppressMs": 2500,</w:t>
+      </w:r>
+    </w:p>
+    <w:p>
+      <w:pPr>
+        <w:pStyle w:val="NoSpacing"/>
+        <w:ind w:left="454"/>
+        <w:shd w:val="clear" w:color="auto" w:fill="F2F2F2"/>
+      </w:pPr>
+      <w:r>
+        <w:rPr>
+          <w:rFonts w:ascii="Courier New" w:hAnsi="Courier New"/>
+          <w:color w:val="C7254E"/>
+          <w:sz w:val="18"/>
+        </w:rPr>
+        <w:t xml:space="preserve">  "postTxSuppressMs": 1000</w:t>
+      </w:r>
+    </w:p>
+    <w:p>
+      <w:pPr>
+        <w:pStyle w:val="NoSpacing"/>
+        <w:ind w:left="454"/>
+        <w:shd w:val="clear" w:color="auto" w:fill="F2F2F2"/>
+      </w:pPr>
+      <w:r>
+        <w:rPr>
+          <w:rFonts w:ascii="Courier New" w:hAnsi="Courier New"/>
+          <w:color w:val="C7254E"/>
+          <w:sz w:val="18"/>
+        </w:rPr>
+        <w:t>}</w:t>
       </w:r>
     </w:p>
     <w:p>
@@ -3257,10 +3447,9 @@
     </w:p>
     <w:p>
       <w:r>
-        <w:t>El VOX detecta cuándo la radio está transmitiendo comparando el nivel RMS del audio con el umbral voxThresholdRms. Una calibración correcta evita dos problemas: que el relay abra el canal con ruido de fondo (umbral muy bajo) o que no detecte la voz de la radio (umbral muy alto).</w:t>
+        <w:t>El VOX detecta cuándo la radio está transmitiendo comparando el nivel RMS del audio con el umbral voxThresholdRms. Una calibración incorrecta causa dos problemas: canal abierto con ruido de fondo (umbral muy bajo) o no detecta la voz (umbral muy alto).</w:t>
       </w:r>
     </w:p>
-    <w:p/>
     <w:p>
       <w:pPr>
         <w:pStyle w:val="Heading2"/>
@@ -3274,7 +3463,7 @@
     </w:p>
     <w:p>
       <w:r>
-        <w:t>Los logs del daemon muestran el nivel cada 5 segundos:</w:t>
+        <w:t>Los logs muestran el nivel cada 5 segundos:</w:t>
       </w:r>
     </w:p>
     <w:p>
@@ -3289,13 +3478,16 @@
           <w:color w:val="C7254E"/>
           <w:sz w:val="18"/>
         </w:rPr>
-        <w:t>[audio] 2026-07-15T14:58:20.338Z [nivel] pico RMS=22017 (-3.5 dBFS)  VOXumbral=800  gain=0.5</w:t>
+        <w:t>[audio] 2026-07-15T14:58:20Z [nivel] pico RMS=22017 (-3.5 dBFS)  VOXumbral=800  gain=0.5</w:t>
       </w:r>
     </w:p>
     <w:p/>
     <w:p>
+      <w:pPr>
+        <w:pStyle w:val="ListBullet"/>
+      </w:pPr>
       <w:r>
-        <w:t>Procedimiento:</w:t>
+        <w:t>Observar RMS durante silencio (nadie transmite). Valor típico: 50–300.</w:t>
       </w:r>
     </w:p>
     <w:p>
@@ -3303,7 +3495,7 @@
         <w:pStyle w:val="ListBullet"/>
       </w:pPr>
       <w:r>
-        <w:t>Observar el RMS durante silencio de la radio (nadie transmite). Valor típico: 50–300.</w:t>
+        <w:t>Observar RMS mientras alguien transmite por la radio. Valor típico CB: 5.000–25.000.</w:t>
       </w:r>
     </w:p>
     <w:p>
@@ -3311,15 +3503,20 @@
         <w:pStyle w:val="ListBullet"/>
       </w:pPr>
       <w:r>
-        <w:t>Observar el RMS mientras alguien transmite por la radio. Valor típico con CB: 5.000–25.000.</w:t>
+        <w:t>Ajustar voxThresholdRms entre ambos valores, más cerca del ruido de fondo.</w:t>
       </w:r>
     </w:p>
     <w:p>
       <w:pPr>
-        <w:pStyle w:val="ListBullet"/>
+        <w:ind w:left="340"/>
       </w:pPr>
       <w:r>
-        <w:t>Ajustar voxThresholdRms a un valor intermedio, más cerca del ruido de fondo. Ejemplo: ruido=200, voz=15.000 → umbral recomendado 800–2.000.</w:t>
+        <w:rPr>
+          <w:i/>
+          <w:color w:val="196019"/>
+          <w:sz w:val="20"/>
+        </w:rPr>
+        <w:t>💡 Ejemplo: ruido=200, voz=15.000 → umbral recomendado 800–2.000.</w:t>
       </w:r>
     </w:p>
     <w:p/>
@@ -3331,7 +3528,7 @@
         <w:rPr>
           <w:color w:val="2E74B5"/>
         </w:rPr>
-        <w:t>5.2 Parámetros de tiempo VOX</w:t>
+        <w:t>5.2 Tabla de parámetros de tiempo VOX</w:t>
       </w:r>
     </w:p>
     <w:tbl>
@@ -3443,7 +3640,7 @@
               <w:rPr>
                 <w:sz w:val="20"/>
               </w:rPr>
-              <w:t>Subir (1000–1500) si el PTT se corta en pausas cortas de la voz. Bajar (300–500) si la cola es demasiado larga.</w:t>
+              <w:t>Subir (1000–1500) si el PTT se corta en pausas cortas de voz. Bajar (300–500) si la cola es demasiado larga.</w:t>
             </w:r>
           </w:p>
         </w:tc>
@@ -3493,7 +3690,7 @@
               <w:rPr>
                 <w:sz w:val="20"/>
               </w:rPr>
-              <w:t>Subir (2000–3000) si el relay se "eco-loopea" (se oye a sí mismo y retransmite). Bajar (500) si el altavoz está bien aislado de la antena.</w:t>
+              <w:t>Subir (2000–3000) si el relay se eco-loopea al soltar el PTT. Bajar (500) si el altavoz está bien aislado de la antena.</w:t>
             </w:r>
           </w:p>
         </w:tc>
@@ -3543,26 +3740,12 @@
               <w:rPr>
                 <w:sz w:val="20"/>
               </w:rPr>
-              <w:t>Subir si hay feedback de altavoz cuando otros transmiten. Bajar si el delay entre RX y TX siguiente es demasiado largo.</w:t>
+              <w:t>Subir si hay feedback cuando otros transmiten. Bajar si el delay entre RX y siguiente TX es demasiado largo.</w:t>
             </w:r>
           </w:p>
         </w:tc>
       </w:tr>
     </w:tbl>
-    <w:p/>
-    <w:p>
-      <w:pPr>
-        <w:ind w:left="340"/>
-      </w:pPr>
-      <w:r>
-        <w:rPr>
-          <w:i/>
-          <w:color w:val="196019"/>
-          <w:sz w:val="20"/>
-        </w:rPr>
-        <w:t>💡 Con antena y altavoz de radio bien separados (&gt;2m o directividad), postTxSuppressMs de 500–1000 ms es suficiente y el canal queda casi inmediatamente disponible tras soltar el PTT.</w:t>
-      </w:r>
-    </w:p>
     <w:p>
       <w:r>
         <w:br w:type="page"/>
@@ -3602,7 +3785,7 @@
           <w:color w:val="C7254E"/>
           <w:sz w:val="18"/>
         </w:rPr>
-        <w:t># Estado completo del relay (conexión, TX/RX, sala, usuarios)</w:t>
+        <w:t># Estado completo (conexión, TX/RX, sala, usuarios)</w:t>
       </w:r>
     </w:p>
     <w:p>
@@ -3647,7 +3830,7 @@
           <w:color w:val="C7254E"/>
           <w:sz w:val="18"/>
         </w:rPr>
-        <w:t># Monitorizar txPackets y rxPackets en tiempo real</w:t>
+        <w:t># Monitorizar TX/RX en tiempo real</w:t>
       </w:r>
     </w:p>
     <w:p>
@@ -3692,7 +3875,7 @@
           <w:color w:val="C7254E"/>
           <w:sz w:val="18"/>
         </w:rPr>
-        <w:t># Ver logs en tiempo real</w:t>
+        <w:t># Logs en tiempo real</w:t>
       </w:r>
     </w:p>
     <w:p>
@@ -3737,7 +3920,7 @@
           <w:color w:val="C7254E"/>
           <w:sz w:val="18"/>
         </w:rPr>
-        <w:t># Ver solo eventos VOX y errores</w:t>
+        <w:t># Solo eventos VOX y errores</w:t>
       </w:r>
     </w:p>
     <w:p>
@@ -3752,7 +3935,7 @@
           <w:color w:val="C7254E"/>
           <w:sz w:val="18"/>
         </w:rPr>
-        <w:t>sudo journalctl -u eqso-relay@CB -f | grep -E "VOX|PTT|gsm-enc|error|Error"</w:t>
+        <w:t>sudo journalctl -u eqso-relay@CB -f | grep -E "VOX|PTT|gsm-enc|error"</w:t>
       </w:r>
     </w:p>
     <w:p>
@@ -3782,7 +3965,7 @@
           <w:color w:val="C7254E"/>
           <w:sz w:val="18"/>
         </w:rPr>
-        <w:t># PTT manual (prueba el encoder GSM sin radio)</w:t>
+        <w:t># PTT manual (prueba sin radio)</w:t>
       </w:r>
     </w:p>
     <w:p>
@@ -3798,21 +3981,6 @@
           <w:sz w:val="18"/>
         </w:rPr>
         <w:t>curl -X POST http://127.0.0.1:8009/ptt/start</w:t>
-      </w:r>
-    </w:p>
-    <w:p>
-      <w:pPr>
-        <w:pStyle w:val="NoSpacing"/>
-        <w:ind w:left="454"/>
-        <w:shd w:val="clear" w:color="auto" w:fill="F2F2F2"/>
-      </w:pPr>
-      <w:r>
-        <w:rPr>
-          <w:rFonts w:ascii="Courier New" w:hAnsi="Courier New"/>
-          <w:color w:val="C7254E"/>
-          <w:sz w:val="18"/>
-        </w:rPr>
-        <w:t># hablar en el micrófono o generar audio...</w:t>
       </w:r>
     </w:p>
     <w:p>
@@ -3980,7 +4148,7 @@
               <w:rPr>
                 <w:sz w:val="20"/>
               </w:rPr>
-              <w:t>GsmEncoder no arranca (encoder GSM no disponible)</w:t>
+              <w:t>GsmEncoder no arranca — encoder GSM no disponible en el ffmpeg usado</w:t>
             </w:r>
           </w:p>
         </w:tc>
@@ -3996,7 +4164,7 @@
               <w:rPr>
                 <w:sz w:val="20"/>
               </w:rPr>
-              <w:t>Verificar que ffmpeg del sistema tiene libgsm: ffmpeg -encoders | grep gsm. En Ubuntu: sudo apt install ffmpeg</w:t>
+              <w:t>Verificar: ffmpeg -encoders | grep gsm. En Ubuntu: sudo apt install ffmpeg</w:t>
             </w:r>
           </w:p>
         </w:tc>
@@ -4014,7 +4182,7 @@
               <w:rPr>
                 <w:sz w:val="20"/>
               </w:rPr>
-              <w:t>VOX se activa con ruido de fondo sin nadie transmitir</w:t>
+              <w:t>VOX se activa con ruido sin nadie transmitir</w:t>
             </w:r>
           </w:p>
         </w:tc>
@@ -4046,7 +4214,7 @@
               <w:rPr>
                 <w:sz w:val="20"/>
               </w:rPr>
-              <w:t>Subir voxThresholdRms hasta que no se active en silencio (ver sección 5.1)</w:t>
+              <w:t>Subir voxThresholdRms observando los logs [nivel]</w:t>
             </w:r>
           </w:p>
         </w:tc>
@@ -4064,7 +4232,7 @@
               <w:rPr>
                 <w:sz w:val="20"/>
               </w:rPr>
-              <w:t>VOX no se activa aunque la radio está transmitiendo</w:t>
+              <w:t>VOX no detecta la transmisión</w:t>
             </w:r>
           </w:p>
         </w:tc>
@@ -4096,7 +4264,7 @@
               <w:rPr>
                 <w:sz w:val="20"/>
               </w:rPr>
-              <w:t>Bajar voxThresholdRms o subir inputGain. Ver los logs [nivel] para calibrar</w:t>
+              <w:t>Bajar voxThresholdRms o subir inputGain</w:t>
             </w:r>
           </w:p>
         </w:tc>
@@ -4114,7 +4282,7 @@
               <w:rPr>
                 <w:sz w:val="20"/>
               </w:rPr>
-              <w:t>Delay de 5–6s entre soltar PTT y poder volver a transmitir</w:t>
+              <w:t>Delay de 5–6s entre transmisiones</w:t>
             </w:r>
           </w:p>
         </w:tc>
@@ -4130,7 +4298,7 @@
               <w:rPr>
                 <w:sz w:val="20"/>
               </w:rPr>
-              <w:t>postTxSuppressMs demasiado alto (era 5000ms en versiones anteriores a v1.3)</w:t>
+              <w:t>postTxSuppressMs era 5000ms en versiones anteriores a v1.3</w:t>
             </w:r>
           </w:p>
         </w:tc>
@@ -4164,7 +4332,7 @@
               <w:rPr>
                 <w:sz w:val="20"/>
               </w:rPr>
-              <w:t>El relay retransmite solo justo al soltar el PTT</w:t>
+              <w:t>El relay retransmite solo al soltar el PTT</w:t>
             </w:r>
           </w:p>
         </w:tc>
@@ -4214,7 +4382,7 @@
               <w:rPr>
                 <w:sz w:val="20"/>
               </w:rPr>
-              <w:t>Audio entrecortado en RX (reproducción)</w:t>
+              <w:t>Audio entrecortado en RX</w:t>
             </w:r>
           </w:p>
         </w:tc>
@@ -4230,7 +4398,7 @@
               <w:rPr>
                 <w:sz w:val="20"/>
               </w:rPr>
-              <w:t>Semi-duplex ALSA: la tarjeta no soporta captura y reproducción simultánea</w:t>
+              <w:t>Semi-duplex ALSA con CM108 bajo VirtualBox</w:t>
             </w:r>
           </w:p>
         </w:tc>
@@ -4246,7 +4414,7 @@
               <w:rPr>
                 <w:sz w:val="20"/>
               </w:rPr>
-              <w:t>Normal con CM108 bajo VirtualBox. En hardware real plughw hace la conversión automáticamente</w:t>
+              <w:t>Normal. En hardware real plughw hace la conversión automáticamente</w:t>
             </w:r>
           </w:p>
         </w:tc>
@@ -4264,7 +4432,7 @@
               <w:rPr>
                 <w:sz w:val="20"/>
               </w:rPr>
-              <w:t>Servicio no arranca / no encuentra la config</w:t>
+              <w:t>Servicio no arranca</w:t>
             </w:r>
           </w:p>
         </w:tc>
@@ -4280,7 +4448,7 @@
               <w:rPr>
                 <w:sz w:val="20"/>
               </w:rPr>
-              <w:t>Ruta de config incorrecta</w:t>
+              <w:t>Ruta de config incorrecta o JSON inválido</w:t>
             </w:r>
           </w:p>
         </w:tc>
@@ -4296,7 +4464,7 @@
               <w:rPr>
                 <w:sz w:val="20"/>
               </w:rPr>
-              <w:t>Verificar /etc/eqso-relay/CB.json existe y tiene JSON válido (python3 -m json.tool &lt; /etc/eqso-relay/CB.json)</w:t>
+              <w:t>python3 -m json.tool &lt; /etc/eqso-relay/CB.json para validar</w:t>
             </w:r>
           </w:p>
         </w:tc>
@@ -4330,7 +4498,7 @@
               <w:rPr>
                 <w:sz w:val="20"/>
               </w:rPr>
-              <w:t>ffmpeg-static (pnpm) sin libgsm tomaba prioridad sobre el sistema</w:t>
+              <w:t>ffmpeg-static sin libgsm tomaba prioridad sobre el sistema</w:t>
             </w:r>
           </w:p>
         </w:tc>
@@ -4346,109 +4514,12 @@
               <w:rPr>
                 <w:sz w:val="20"/>
               </w:rPr>
-              <w:t>Actualizar relay-daemon a v1.3. El fix condiciona la inyección de PATH a backend=ffmpeg</w:t>
+              <w:t>Actualizar relay-daemon a v1.3 — el fix está incluido</w:t>
             </w:r>
           </w:p>
         </w:tc>
       </w:tr>
     </w:tbl>
-    <w:p/>
-    <w:p>
-      <w:pPr>
-        <w:pStyle w:val="Heading2"/>
-      </w:pPr>
-      <w:r>
-        <w:rPr>
-          <w:color w:val="2E74B5"/>
-        </w:rPr>
-        <w:t>6.3 Actualizar configuración desde versiones anteriores a v1.3</w:t>
-      </w:r>
-    </w:p>
-    <w:p>
-      <w:r>
-        <w:t>Si tienes un CB.json de antes de Julio 2026, añade estos campos en la sección audio:</w:t>
-      </w:r>
-    </w:p>
-    <w:p>
-      <w:pPr>
-        <w:pStyle w:val="NoSpacing"/>
-        <w:ind w:left="454"/>
-        <w:shd w:val="clear" w:color="auto" w:fill="F2F2F2"/>
-      </w:pPr>
-      <w:r>
-        <w:rPr>
-          <w:rFonts w:ascii="Courier New" w:hAnsi="Courier New"/>
-          <w:color w:val="C7254E"/>
-          <w:sz w:val="18"/>
-        </w:rPr>
-        <w:t>"audio": {</w:t>
-      </w:r>
-    </w:p>
-    <w:p>
-      <w:pPr>
-        <w:pStyle w:val="NoSpacing"/>
-        <w:ind w:left="454"/>
-        <w:shd w:val="clear" w:color="auto" w:fill="F2F2F2"/>
-      </w:pPr>
-      <w:r>
-        <w:rPr>
-          <w:rFonts w:ascii="Courier New" w:hAnsi="Courier New"/>
-          <w:color w:val="C7254E"/>
-          <w:sz w:val="18"/>
-        </w:rPr>
-        <w:t xml:space="preserve">  "voxHangMs": 800,</w:t>
-      </w:r>
-    </w:p>
-    <w:p>
-      <w:pPr>
-        <w:pStyle w:val="NoSpacing"/>
-        <w:ind w:left="454"/>
-        <w:shd w:val="clear" w:color="auto" w:fill="F2F2F2"/>
-      </w:pPr>
-      <w:r>
-        <w:rPr>
-          <w:rFonts w:ascii="Courier New" w:hAnsi="Courier New"/>
-          <w:color w:val="C7254E"/>
-          <w:sz w:val="18"/>
-        </w:rPr>
-        <w:t xml:space="preserve">  "postRxSuppressMs": 2500,</w:t>
-      </w:r>
-    </w:p>
-    <w:p>
-      <w:pPr>
-        <w:pStyle w:val="NoSpacing"/>
-        <w:ind w:left="454"/>
-        <w:shd w:val="clear" w:color="auto" w:fill="F2F2F2"/>
-      </w:pPr>
-      <w:r>
-        <w:rPr>
-          <w:rFonts w:ascii="Courier New" w:hAnsi="Courier New"/>
-          <w:color w:val="C7254E"/>
-          <w:sz w:val="18"/>
-        </w:rPr>
-        <w:t xml:space="preserve">  "postTxSuppressMs": 1000</w:t>
-      </w:r>
-    </w:p>
-    <w:p>
-      <w:pPr>
-        <w:pStyle w:val="NoSpacing"/>
-        <w:ind w:left="454"/>
-        <w:shd w:val="clear" w:color="auto" w:fill="F2F2F2"/>
-      </w:pPr>
-      <w:r>
-        <w:rPr>
-          <w:rFonts w:ascii="Courier New" w:hAnsi="Courier New"/>
-          <w:color w:val="C7254E"/>
-          <w:sz w:val="18"/>
-        </w:rPr>
-        <w:t>}</w:t>
-      </w:r>
-    </w:p>
-    <w:p>
-      <w:r>
-        <w:t>Los parámetros no incluidos toman el valor por defecto del código automáticamente.</w:t>
-      </w:r>
-    </w:p>
     <w:p>
       <w:r>
         <w:br w:type="page"/>
@@ -4822,7 +4893,28 @@
           <w:color w:val="7F6000"/>
           <w:sz w:val="20"/>
         </w:rPr>
-        <w:t>⚠ El puerto 2172 es externo (router NAT). El servidor eQSO escucha internamente en el 2171. Los relay externos deben usar 2172.</w:t>
+        <w:t>⚠  El puerto 2172 es externo (router NAT). El servidor eQSO escucha internamente en el 2171.</w:t>
+      </w:r>
+    </w:p>
+    <w:p>
+      <w:r>
+        <w:br w:type="page"/>
+      </w:r>
+    </w:p>
+    <w:p>
+      <w:pPr>
+        <w:pStyle w:val="Heading1"/>
+      </w:pPr>
+      <w:r>
+        <w:rPr>
+          <w:color w:val="1F497D"/>
+        </w:rPr>
+        <w:t>8. Roles de usuario</w:t>
+      </w:r>
+    </w:p>
+    <w:p>
+      <w:r>
+        <w:t>El sistema eQSO ASORAPA define cuatro roles diferenciados. Cada usuario registrado tiene un rol asignado por el administrador que determina a qué paneles y funciones tiene acceso.</w:t>
       </w:r>
     </w:p>
     <w:p/>
@@ -4834,12 +4926,506 @@
         <w:rPr>
           <w:color w:val="2E74B5"/>
         </w:rPr>
-        <w:t>7.1 Identificador de relay</w:t>
+        <w:t>8.1 Resumen de roles</w:t>
+      </w:r>
+    </w:p>
+    <w:tbl>
+      <w:tblPr>
+        <w:tblStyle w:val="TableGrid"/>
+        <w:tblW w:type="auto" w:w="0"/>
+        <w:tblLook w:firstColumn="1" w:firstRow="1" w:lastColumn="0" w:lastRow="0" w:noHBand="0" w:noVBand="1" w:val="04A0"/>
+      </w:tblPr>
+      <w:tblGrid>
+        <w:gridCol w:w="1728"/>
+        <w:gridCol w:w="1728"/>
+        <w:gridCol w:w="1728"/>
+        <w:gridCol w:w="1728"/>
+        <w:gridCol w:w="1728"/>
+      </w:tblGrid>
+      <w:tr>
+        <w:tc>
+          <w:tcPr>
+            <w:tcW w:type="dxa" w:w="1728"/>
+            <w:shd w:val="clear" w:color="auto" w:fill="2E74B5"/>
+            <w:tcW w:w="1701" w:type="dxa"/>
+          </w:tcPr>
+          <w:p>
+            <w:r>
+              <w:rPr>
+                <w:b/>
+                <w:color w:val="FFFFFF"/>
+                <w:sz w:val="20"/>
+              </w:rPr>
+              <w:t>Rol</w:t>
+            </w:r>
+          </w:p>
+        </w:tc>
+        <w:tc>
+          <w:tcPr>
+            <w:tcW w:type="dxa" w:w="1728"/>
+            <w:shd w:val="clear" w:color="auto" w:fill="2E74B5"/>
+            <w:tcW w:w="2551" w:type="dxa"/>
+          </w:tcPr>
+          <w:p>
+            <w:r>
+              <w:rPr>
+                <w:b/>
+                <w:color w:val="FFFFFF"/>
+                <w:sz w:val="20"/>
+              </w:rPr>
+              <w:t>Acceso al cliente web</w:t>
+            </w:r>
+          </w:p>
+        </w:tc>
+        <w:tc>
+          <w:tcPr>
+            <w:tcW w:type="dxa" w:w="1728"/>
+            <w:shd w:val="clear" w:color="auto" w:fill="2E74B5"/>
+            <w:tcW w:w="1701" w:type="dxa"/>
+          </w:tcPr>
+          <w:p>
+            <w:r>
+              <w:rPr>
+                <w:b/>
+                <w:color w:val="FFFFFF"/>
+                <w:sz w:val="20"/>
+              </w:rPr>
+              <w:t>Panel Admin</w:t>
+            </w:r>
+          </w:p>
+        </w:tc>
+        <w:tc>
+          <w:tcPr>
+            <w:tcW w:type="dxa" w:w="1728"/>
+            <w:shd w:val="clear" w:color="auto" w:fill="2E74B5"/>
+            <w:tcW w:w="1701" w:type="dxa"/>
+          </w:tcPr>
+          <w:p>
+            <w:r>
+              <w:rPr>
+                <w:b/>
+                <w:color w:val="FFFFFF"/>
+                <w:sz w:val="20"/>
+              </w:rPr>
+              <w:t>Panel Operador</w:t>
+            </w:r>
+          </w:p>
+        </w:tc>
+        <w:tc>
+          <w:tcPr>
+            <w:tcW w:type="dxa" w:w="1728"/>
+            <w:shd w:val="clear" w:color="auto" w:fill="2E74B5"/>
+            <w:tcW w:w="3118" w:type="dxa"/>
+          </w:tcPr>
+          <w:p>
+            <w:r>
+              <w:rPr>
+                <w:b/>
+                <w:color w:val="FFFFFF"/>
+                <w:sz w:val="20"/>
+              </w:rPr>
+              <w:t>Descripción</w:t>
+            </w:r>
+          </w:p>
+        </w:tc>
+      </w:tr>
+      <w:tr>
+        <w:tc>
+          <w:tcPr>
+            <w:tcW w:type="dxa" w:w="1728"/>
+            <w:shd w:val="clear" w:color="auto" w:fill="FFFFFF"/>
+            <w:tcW w:w="1701" w:type="dxa"/>
+          </w:tcPr>
+          <w:p>
+            <w:r/>
+            <w:r>
+              <w:rPr>
+                <w:sz w:val="20"/>
+              </w:rPr>
+              <w:t>usuario</w:t>
+            </w:r>
+          </w:p>
+        </w:tc>
+        <w:tc>
+          <w:tcPr>
+            <w:tcW w:type="dxa" w:w="1728"/>
+            <w:shd w:val="clear" w:color="auto" w:fill="FFFFFF"/>
+            <w:tcW w:w="2551" w:type="dxa"/>
+          </w:tcPr>
+          <w:p>
+            <w:r/>
+            <w:r>
+              <w:rPr>
+                <w:sz w:val="20"/>
+              </w:rPr>
+              <w:t>✅ Sala, PTT, lista de usuarios</w:t>
+            </w:r>
+          </w:p>
+        </w:tc>
+        <w:tc>
+          <w:tcPr>
+            <w:tcW w:type="dxa" w:w="1728"/>
+            <w:shd w:val="clear" w:color="auto" w:fill="FFFFFF"/>
+            <w:tcW w:w="1701" w:type="dxa"/>
+          </w:tcPr>
+          <w:p>
+            <w:r/>
+            <w:r>
+              <w:rPr>
+                <w:sz w:val="20"/>
+              </w:rPr>
+              <w:t>❌</w:t>
+            </w:r>
+          </w:p>
+        </w:tc>
+        <w:tc>
+          <w:tcPr>
+            <w:tcW w:type="dxa" w:w="1728"/>
+            <w:shd w:val="clear" w:color="auto" w:fill="FFFFFF"/>
+            <w:tcW w:w="1701" w:type="dxa"/>
+          </w:tcPr>
+          <w:p>
+            <w:r/>
+            <w:r>
+              <w:rPr>
+                <w:sz w:val="20"/>
+              </w:rPr>
+              <w:t>❌</w:t>
+            </w:r>
+          </w:p>
+        </w:tc>
+        <w:tc>
+          <w:tcPr>
+            <w:tcW w:type="dxa" w:w="1728"/>
+            <w:shd w:val="clear" w:color="auto" w:fill="FFFFFF"/>
+            <w:tcW w:w="3118" w:type="dxa"/>
+          </w:tcPr>
+          <w:p>
+            <w:r/>
+            <w:r>
+              <w:rPr>
+                <w:sz w:val="20"/>
+              </w:rPr>
+              <w:t>Usuario estándar. Solo puede escuchar y transmitir en la sala.</w:t>
+            </w:r>
+          </w:p>
+        </w:tc>
+      </w:tr>
+      <w:tr>
+        <w:tc>
+          <w:tcPr>
+            <w:tcW w:type="dxa" w:w="1728"/>
+            <w:shd w:val="clear" w:color="auto" w:fill="EEF4FB"/>
+            <w:tcW w:w="1701" w:type="dxa"/>
+          </w:tcPr>
+          <w:p>
+            <w:r/>
+            <w:r>
+              <w:rPr>
+                <w:sz w:val="20"/>
+              </w:rPr>
+              <w:t>relay_operator</w:t>
+            </w:r>
+          </w:p>
+        </w:tc>
+        <w:tc>
+          <w:tcPr>
+            <w:tcW w:type="dxa" w:w="1728"/>
+            <w:shd w:val="clear" w:color="auto" w:fill="EEF4FB"/>
+            <w:tcW w:w="2551" w:type="dxa"/>
+          </w:tcPr>
+          <w:p>
+            <w:r/>
+            <w:r>
+              <w:rPr>
+                <w:sz w:val="20"/>
+              </w:rPr>
+              <w:t>✅ Sala + PTT</w:t>
+            </w:r>
+          </w:p>
+        </w:tc>
+        <w:tc>
+          <w:tcPr>
+            <w:tcW w:type="dxa" w:w="1728"/>
+            <w:shd w:val="clear" w:color="auto" w:fill="EEF4FB"/>
+            <w:tcW w:w="1701" w:type="dxa"/>
+          </w:tcPr>
+          <w:p>
+            <w:r/>
+            <w:r>
+              <w:rPr>
+                <w:sz w:val="20"/>
+              </w:rPr>
+              <w:t>❌</w:t>
+            </w:r>
+          </w:p>
+        </w:tc>
+        <w:tc>
+          <w:tcPr>
+            <w:tcW w:type="dxa" w:w="1728"/>
+            <w:shd w:val="clear" w:color="auto" w:fill="EEF4FB"/>
+            <w:tcW w:w="1701" w:type="dxa"/>
+          </w:tcPr>
+          <w:p>
+            <w:r/>
+            <w:r>
+              <w:rPr>
+                <w:sz w:val="20"/>
+              </w:rPr>
+              <w:t>✅ (su relay)</w:t>
+            </w:r>
+          </w:p>
+        </w:tc>
+        <w:tc>
+          <w:tcPr>
+            <w:tcW w:type="dxa" w:w="1728"/>
+            <w:shd w:val="clear" w:color="auto" w:fill="EEF4FB"/>
+            <w:tcW w:w="3118" w:type="dxa"/>
+          </w:tcPr>
+          <w:p>
+            <w:r/>
+            <w:r>
+              <w:rPr>
+                <w:sz w:val="20"/>
+              </w:rPr>
+              <w:t>Operador de un radioenlace físico. Ve telemetría y controla su relay remoto.</w:t>
+            </w:r>
+          </w:p>
+        </w:tc>
+      </w:tr>
+      <w:tr>
+        <w:tc>
+          <w:tcPr>
+            <w:tcW w:type="dxa" w:w="1728"/>
+            <w:shd w:val="clear" w:color="auto" w:fill="FFFFFF"/>
+            <w:tcW w:w="1701" w:type="dxa"/>
+          </w:tcPr>
+          <w:p>
+            <w:r/>
+            <w:r>
+              <w:rPr>
+                <w:sz w:val="20"/>
+              </w:rPr>
+              <w:t>admin</w:t>
+            </w:r>
+          </w:p>
+        </w:tc>
+        <w:tc>
+          <w:tcPr>
+            <w:tcW w:type="dxa" w:w="1728"/>
+            <w:shd w:val="clear" w:color="auto" w:fill="FFFFFF"/>
+            <w:tcW w:w="2551" w:type="dxa"/>
+          </w:tcPr>
+          <w:p>
+            <w:r/>
+            <w:r>
+              <w:rPr>
+                <w:sz w:val="20"/>
+              </w:rPr>
+              <w:t>✅ Sala + PTT</w:t>
+            </w:r>
+          </w:p>
+        </w:tc>
+        <w:tc>
+          <w:tcPr>
+            <w:tcW w:type="dxa" w:w="1728"/>
+            <w:shd w:val="clear" w:color="auto" w:fill="FFFFFF"/>
+            <w:tcW w:w="1701" w:type="dxa"/>
+          </w:tcPr>
+          <w:p>
+            <w:r/>
+            <w:r>
+              <w:rPr>
+                <w:sz w:val="20"/>
+              </w:rPr>
+              <w:t>✅ Acceso total</w:t>
+            </w:r>
+          </w:p>
+        </w:tc>
+        <w:tc>
+          <w:tcPr>
+            <w:tcW w:type="dxa" w:w="1728"/>
+            <w:shd w:val="clear" w:color="auto" w:fill="FFFFFF"/>
+            <w:tcW w:w="1701" w:type="dxa"/>
+          </w:tcPr>
+          <w:p>
+            <w:r/>
+            <w:r>
+              <w:rPr>
+                <w:sz w:val="20"/>
+              </w:rPr>
+              <w:t>✅ Todos los relays</w:t>
+            </w:r>
+          </w:p>
+        </w:tc>
+        <w:tc>
+          <w:tcPr>
+            <w:tcW w:type="dxa" w:w="1728"/>
+            <w:shd w:val="clear" w:color="auto" w:fill="FFFFFF"/>
+            <w:tcW w:w="3118" w:type="dxa"/>
+          </w:tcPr>
+          <w:p>
+            <w:r/>
+            <w:r>
+              <w:rPr>
+                <w:sz w:val="20"/>
+              </w:rPr>
+              <w:t>Administrador del servidor. Gestiona usuarios, relays y configuración global.</w:t>
+            </w:r>
+          </w:p>
+        </w:tc>
+      </w:tr>
+      <w:tr>
+        <w:tc>
+          <w:tcPr>
+            <w:tcW w:type="dxa" w:w="1728"/>
+            <w:shd w:val="clear" w:color="auto" w:fill="EEF4FB"/>
+            <w:tcW w:w="1701" w:type="dxa"/>
+          </w:tcPr>
+          <w:p>
+            <w:r/>
+            <w:r>
+              <w:rPr>
+                <w:sz w:val="20"/>
+              </w:rPr>
+              <w:t>relay (flag isRelay)</w:t>
+            </w:r>
+          </w:p>
+        </w:tc>
+        <w:tc>
+          <w:tcPr>
+            <w:tcW w:type="dxa" w:w="1728"/>
+            <w:shd w:val="clear" w:color="auto" w:fill="EEF4FB"/>
+            <w:tcW w:w="2551" w:type="dxa"/>
+          </w:tcPr>
+          <w:p>
+            <w:r/>
+            <w:r>
+              <w:rPr>
+                <w:sz w:val="20"/>
+              </w:rPr>
+              <w:t>— (conexión técnica)</w:t>
+            </w:r>
+          </w:p>
+        </w:tc>
+        <w:tc>
+          <w:tcPr>
+            <w:tcW w:type="dxa" w:w="1728"/>
+            <w:shd w:val="clear" w:color="auto" w:fill="EEF4FB"/>
+            <w:tcW w:w="1701" w:type="dxa"/>
+          </w:tcPr>
+          <w:p>
+            <w:r/>
+            <w:r>
+              <w:rPr>
+                <w:sz w:val="20"/>
+              </w:rPr>
+              <w:t>❌</w:t>
+            </w:r>
+          </w:p>
+        </w:tc>
+        <w:tc>
+          <w:tcPr>
+            <w:tcW w:type="dxa" w:w="1728"/>
+            <w:shd w:val="clear" w:color="auto" w:fill="EEF4FB"/>
+            <w:tcW w:w="1701" w:type="dxa"/>
+          </w:tcPr>
+          <w:p>
+            <w:r/>
+            <w:r>
+              <w:rPr>
+                <w:sz w:val="20"/>
+              </w:rPr>
+              <w:t>❌</w:t>
+            </w:r>
+          </w:p>
+        </w:tc>
+        <w:tc>
+          <w:tcPr>
+            <w:tcW w:type="dxa" w:w="1728"/>
+            <w:shd w:val="clear" w:color="auto" w:fill="EEF4FB"/>
+            <w:tcW w:w="3118" w:type="dxa"/>
+          </w:tcPr>
+          <w:p>
+            <w:r/>
+            <w:r>
+              <w:rPr>
+                <w:sz w:val="20"/>
+              </w:rPr>
+              <w:t>Marca técnica: identifica que la conexión proviene de un relay daemon, no de un humano.</w:t>
+            </w:r>
+          </w:p>
+        </w:tc>
+      </w:tr>
+    </w:tbl>
+    <w:p/>
+    <w:p>
+      <w:pPr>
+        <w:pStyle w:val="Heading2"/>
+      </w:pPr>
+      <w:r>
+        <w:rPr>
+          <w:color w:val="2E74B5"/>
+        </w:rPr>
+        <w:t>8.2 Flujo de alta de un nuevo usuario</w:t>
       </w:r>
     </w:p>
     <w:p>
       <w:r>
-        <w:t>Los relay daemons se identifican con callsign 0R-CALLSIGN (prefijo 0R-). El servidor los autentica con un token de RELAY_TOKENS (configurado en el servidor). El servidor NO devuelve el audio del relay al propio relay (se excluye del broadcast) para evitar eco.</w:t>
+        <w:t>Todo nuevo usuario pasa por este proceso:</w:t>
+      </w:r>
+    </w:p>
+    <w:p>
+      <w:pPr>
+        <w:pStyle w:val="ListBullet"/>
+      </w:pPr>
+      <w:r>
+        <w:t>El usuario se registra en el cliente web con su callsign y contraseña.</w:t>
+      </w:r>
+    </w:p>
+    <w:p>
+      <w:pPr>
+        <w:pStyle w:val="ListBullet"/>
+      </w:pPr>
+      <w:r>
+        <w:t>Su cuenta queda en estado pendiente — no puede acceder a la sala.</w:t>
+      </w:r>
+    </w:p>
+    <w:p>
+      <w:pPr>
+        <w:pStyle w:val="ListBullet"/>
+      </w:pPr>
+      <w:r>
+        <w:t>El administrador recibe la solicitud en el panel Admin → Usuarios → pestaña "Pendientes".</w:t>
+      </w:r>
+    </w:p>
+    <w:p>
+      <w:pPr>
+        <w:pStyle w:val="ListBullet"/>
+      </w:pPr>
+      <w:r>
+        <w:t>El admin aprueba la cuenta y asigna el rol adecuado (usuario / relay_operator).</w:t>
+      </w:r>
+    </w:p>
+    <w:p>
+      <w:pPr>
+        <w:pStyle w:val="ListBullet"/>
+      </w:pPr>
+      <w:r>
+        <w:t>El usuario recibe acceso y puede iniciar sesión.</w:t>
+      </w:r>
+    </w:p>
+    <w:p>
+      <w:pPr>
+        <w:ind w:left="340"/>
+      </w:pPr>
+      <w:r>
+        <w:rPr>
+          <w:i/>
+          <w:color w:val="7F6000"/>
+          <w:sz w:val="20"/>
+        </w:rPr>
+        <w:t>⚠  Hasta que el administrador no apruebe la cuenta, el usuario ve un mensaje de "cuenta pendiente de aprobación" al intentar entrar.</w:t>
       </w:r>
     </w:p>
     <w:p/>
@@ -4851,12 +5437,1966 @@
         <w:rPr>
           <w:color w:val="2E74B5"/>
         </w:rPr>
-        <w:t>7.2 Localizador Maidenhead (opcional)</w:t>
+        <w:t>8.3 Ejemplos de asignación de rol</w:t>
+      </w:r>
+    </w:p>
+    <w:tbl>
+      <w:tblPr>
+        <w:tblStyle w:val="TableGrid"/>
+        <w:tblW w:type="auto" w:w="0"/>
+        <w:tblLook w:firstColumn="1" w:firstRow="1" w:lastColumn="0" w:lastRow="0" w:noHBand="0" w:noVBand="1" w:val="04A0"/>
+      </w:tblPr>
+      <w:tblGrid>
+        <w:gridCol w:w="2880"/>
+        <w:gridCol w:w="2880"/>
+        <w:gridCol w:w="2880"/>
+      </w:tblGrid>
+      <w:tr>
+        <w:tc>
+          <w:tcPr>
+            <w:tcW w:type="dxa" w:w="2880"/>
+            <w:shd w:val="clear" w:color="auto" w:fill="2E74B5"/>
+            <w:tcW w:w="3118" w:type="dxa"/>
+          </w:tcPr>
+          <w:p>
+            <w:r>
+              <w:rPr>
+                <w:b/>
+                <w:color w:val="FFFFFF"/>
+                <w:sz w:val="20"/>
+              </w:rPr>
+              <w:t>Caso real</w:t>
+            </w:r>
+          </w:p>
+        </w:tc>
+        <w:tc>
+          <w:tcPr>
+            <w:tcW w:type="dxa" w:w="2880"/>
+            <w:shd w:val="clear" w:color="auto" w:fill="2E74B5"/>
+            <w:tcW w:w="1984" w:type="dxa"/>
+          </w:tcPr>
+          <w:p>
+            <w:r>
+              <w:rPr>
+                <w:b/>
+                <w:color w:val="FFFFFF"/>
+                <w:sz w:val="20"/>
+              </w:rPr>
+              <w:t>Rol a asignar</w:t>
+            </w:r>
+          </w:p>
+        </w:tc>
+        <w:tc>
+          <w:tcPr>
+            <w:tcW w:type="dxa" w:w="2880"/>
+            <w:shd w:val="clear" w:color="auto" w:fill="2E74B5"/>
+            <w:tcW w:w="4536" w:type="dxa"/>
+          </w:tcPr>
+          <w:p>
+            <w:r>
+              <w:rPr>
+                <w:b/>
+                <w:color w:val="FFFFFF"/>
+                <w:sz w:val="20"/>
+              </w:rPr>
+              <w:t>Acciones del admin</w:t>
+            </w:r>
+          </w:p>
+        </w:tc>
+      </w:tr>
+      <w:tr>
+        <w:tc>
+          <w:tcPr>
+            <w:tcW w:type="dxa" w:w="2880"/>
+            <w:shd w:val="clear" w:color="auto" w:fill="FFFFFF"/>
+            <w:tcW w:w="3118" w:type="dxa"/>
+          </w:tcPr>
+          <w:p>
+            <w:r/>
+            <w:r>
+              <w:rPr>
+                <w:sz w:val="20"/>
+              </w:rPr>
+              <w:t>EA5XXX quiere usar la sala CB para hablar</w:t>
+            </w:r>
+          </w:p>
+        </w:tc>
+        <w:tc>
+          <w:tcPr>
+            <w:tcW w:type="dxa" w:w="2880"/>
+            <w:shd w:val="clear" w:color="auto" w:fill="FFFFFF"/>
+            <w:tcW w:w="1984" w:type="dxa"/>
+          </w:tcPr>
+          <w:p>
+            <w:r/>
+            <w:r>
+              <w:rPr>
+                <w:sz w:val="20"/>
+              </w:rPr>
+              <w:t>usuario</w:t>
+            </w:r>
+          </w:p>
+        </w:tc>
+        <w:tc>
+          <w:tcPr>
+            <w:tcW w:type="dxa" w:w="2880"/>
+            <w:shd w:val="clear" w:color="auto" w:fill="FFFFFF"/>
+            <w:tcW w:w="4536" w:type="dxa"/>
+          </w:tcPr>
+          <w:p>
+            <w:r/>
+            <w:r>
+              <w:rPr>
+                <w:sz w:val="20"/>
+              </w:rPr>
+              <w:t>Aprobar cuenta → rol: usuario</w:t>
+            </w:r>
+          </w:p>
+        </w:tc>
+      </w:tr>
+      <w:tr>
+        <w:tc>
+          <w:tcPr>
+            <w:tcW w:type="dxa" w:w="2880"/>
+            <w:shd w:val="clear" w:color="auto" w:fill="EEF4FB"/>
+            <w:tcW w:w="3118" w:type="dxa"/>
+          </w:tcPr>
+          <w:p>
+            <w:r/>
+            <w:r>
+              <w:rPr>
+                <w:sz w:val="20"/>
+              </w:rPr>
+              <w:t>EA5YYY tiene una Raspberry Pi con radio CB y quiere operar su enlace</w:t>
+            </w:r>
+          </w:p>
+        </w:tc>
+        <w:tc>
+          <w:tcPr>
+            <w:tcW w:type="dxa" w:w="2880"/>
+            <w:shd w:val="clear" w:color="auto" w:fill="EEF4FB"/>
+            <w:tcW w:w="1984" w:type="dxa"/>
+          </w:tcPr>
+          <w:p>
+            <w:r/>
+            <w:r>
+              <w:rPr>
+                <w:sz w:val="20"/>
+              </w:rPr>
+              <w:t>relay_operator</w:t>
+            </w:r>
+          </w:p>
+        </w:tc>
+        <w:tc>
+          <w:tcPr>
+            <w:tcW w:type="dxa" w:w="2880"/>
+            <w:shd w:val="clear" w:color="auto" w:fill="EEF4FB"/>
+            <w:tcW w:w="4536" w:type="dxa"/>
+          </w:tcPr>
+          <w:p>
+            <w:r/>
+            <w:r>
+              <w:rPr>
+                <w:sz w:val="20"/>
+              </w:rPr>
+              <w:t>Aprobar cuenta → rol: relay_operator → asignar callsign: 0R-IN70WN</w:t>
+            </w:r>
+          </w:p>
+        </w:tc>
+      </w:tr>
+      <w:tr>
+        <w:tc>
+          <w:tcPr>
+            <w:tcW w:type="dxa" w:w="2880"/>
+            <w:shd w:val="clear" w:color="auto" w:fill="FFFFFF"/>
+            <w:tcW w:w="3118" w:type="dxa"/>
+          </w:tcPr>
+          <w:p>
+            <w:r/>
+            <w:r>
+              <w:rPr>
+                <w:sz w:val="20"/>
+              </w:rPr>
+              <w:t>EA5ZZZ es el técnico que administra el servidor</w:t>
+            </w:r>
+          </w:p>
+        </w:tc>
+        <w:tc>
+          <w:tcPr>
+            <w:tcW w:type="dxa" w:w="2880"/>
+            <w:shd w:val="clear" w:color="auto" w:fill="FFFFFF"/>
+            <w:tcW w:w="1984" w:type="dxa"/>
+          </w:tcPr>
+          <w:p>
+            <w:r/>
+            <w:r>
+              <w:rPr>
+                <w:sz w:val="20"/>
+              </w:rPr>
+              <w:t>admin</w:t>
+            </w:r>
+          </w:p>
+        </w:tc>
+        <w:tc>
+          <w:tcPr>
+            <w:tcW w:type="dxa" w:w="2880"/>
+            <w:shd w:val="clear" w:color="auto" w:fill="FFFFFF"/>
+            <w:tcW w:w="4536" w:type="dxa"/>
+          </w:tcPr>
+          <w:p>
+            <w:r/>
+            <w:r>
+              <w:rPr>
+                <w:sz w:val="20"/>
+              </w:rPr>
+              <w:t>Aprobar cuenta → activar isAdmin = true</w:t>
+            </w:r>
+          </w:p>
+        </w:tc>
+      </w:tr>
+      <w:tr>
+        <w:tc>
+          <w:tcPr>
+            <w:tcW w:type="dxa" w:w="2880"/>
+            <w:shd w:val="clear" w:color="auto" w:fill="EEF4FB"/>
+            <w:tcW w:w="3118" w:type="dxa"/>
+          </w:tcPr>
+          <w:p>
+            <w:r/>
+            <w:r>
+              <w:rPr>
+                <w:sz w:val="20"/>
+              </w:rPr>
+              <w:t>El daemon 0R-IN70WN se conecta automáticamente al servidor</w:t>
+            </w:r>
+          </w:p>
+        </w:tc>
+        <w:tc>
+          <w:tcPr>
+            <w:tcW w:type="dxa" w:w="2880"/>
+            <w:shd w:val="clear" w:color="auto" w:fill="EEF4FB"/>
+            <w:tcW w:w="1984" w:type="dxa"/>
+          </w:tcPr>
+          <w:p>
+            <w:r/>
+            <w:r>
+              <w:rPr>
+                <w:sz w:val="20"/>
+              </w:rPr>
+              <w:t>relay (automático)</w:t>
+            </w:r>
+          </w:p>
+        </w:tc>
+        <w:tc>
+          <w:tcPr>
+            <w:tcW w:type="dxa" w:w="2880"/>
+            <w:shd w:val="clear" w:color="auto" w:fill="EEF4FB"/>
+            <w:tcW w:w="4536" w:type="dxa"/>
+          </w:tcPr>
+          <w:p>
+            <w:r/>
+            <w:r>
+              <w:rPr>
+                <w:sz w:val="20"/>
+              </w:rPr>
+              <w:t>El daemon usa el token de RELAY_TOKENS — el sistema lo marca como relay automáticamente</w:t>
+            </w:r>
+          </w:p>
+        </w:tc>
+      </w:tr>
+    </w:tbl>
+    <w:p>
+      <w:r>
+        <w:br w:type="page"/>
+      </w:r>
+    </w:p>
+    <w:p>
+      <w:pPr>
+        <w:pStyle w:val="Heading1"/>
+      </w:pPr>
+      <w:r>
+        <w:rPr>
+          <w:color w:val="1F497D"/>
+        </w:rPr>
+        <w:t>9. Panel de Administración</w:t>
       </w:r>
     </w:p>
     <w:p>
       <w:r>
-        <w:t>El callsign puede incluir el localizador Maidenhead de 6 caracteres, por ejemplo 0R-IN70WN. IN70WN es el localizador de la ubicación geográfica del nodo.</w:t>
+        <w:t>El panel de administración es accesible solo para usuarios con rol admin o flag isAdmin activado. Se accede desde el cliente web haciendo clic en el botón "Admin" de la barra superior.</w:t>
+      </w:r>
+    </w:p>
+    <w:p/>
+    <w:p>
+      <w:pPr>
+        <w:pStyle w:val="Heading2"/>
+      </w:pPr>
+      <w:r>
+        <w:rPr>
+          <w:color w:val="2E74B5"/>
+        </w:rPr>
+        <w:t>9.1 Pestaña — Usuarios</w:t>
+      </w:r>
+    </w:p>
+    <w:p>
+      <w:r>
+        <w:t>Gestión completa de todas las cuentas registradas en el servidor.</w:t>
+      </w:r>
+    </w:p>
+    <w:p/>
+    <w:p>
+      <w:r>
+        <w:t>Filtros disponibles:</w:t>
+      </w:r>
+    </w:p>
+    <w:p>
+      <w:pPr>
+        <w:pStyle w:val="ListBullet"/>
+      </w:pPr>
+      <w:r>
+        <w:t>Todos — muestra todos los usuarios del sistema.</w:t>
+      </w:r>
+    </w:p>
+    <w:p>
+      <w:pPr>
+        <w:pStyle w:val="ListBullet"/>
+      </w:pPr>
+      <w:r>
+        <w:t>Pendientes — solicitudes de registro a la espera de aprobación.</w:t>
+      </w:r>
+    </w:p>
+    <w:p>
+      <w:pPr>
+        <w:pStyle w:val="ListBullet"/>
+      </w:pPr>
+      <w:r>
+        <w:t>Activos — usuarios con acceso activo.</w:t>
+      </w:r>
+    </w:p>
+    <w:p>
+      <w:pPr>
+        <w:pStyle w:val="ListBullet"/>
+      </w:pPr>
+      <w:r>
+        <w:t>Inactivos — usuarios deshabilitados.</w:t>
+      </w:r>
+    </w:p>
+    <w:p/>
+    <w:p>
+      <w:r>
+        <w:t>Acciones por usuario:</w:t>
+      </w:r>
+    </w:p>
+    <w:p>
+      <w:pPr>
+        <w:pStyle w:val="ListBullet"/>
+      </w:pPr>
+      <w:r>
+        <w:t>Aprobar/rechazar solicitudes pendientes.</w:t>
+      </w:r>
+    </w:p>
+    <w:p>
+      <w:pPr>
+        <w:pStyle w:val="ListBullet"/>
+      </w:pPr>
+      <w:r>
+        <w:t>Cambiar rol: usuario, relay_operator o admin.</w:t>
+      </w:r>
+    </w:p>
+    <w:p>
+      <w:pPr>
+        <w:pStyle w:val="ListBullet"/>
+      </w:pPr>
+      <w:r>
+        <w:t>Activar/desactivar isAdmin (permisos de administración global).</w:t>
+      </w:r>
+    </w:p>
+    <w:p>
+      <w:pPr>
+        <w:pStyle w:val="ListBullet"/>
+      </w:pPr>
+      <w:r>
+        <w:t>Asignar callsign de relay: indica qué relay daemon controla este operador (solo para relay_operator).</w:t>
+      </w:r>
+    </w:p>
+    <w:p>
+      <w:pPr>
+        <w:pStyle w:val="ListBullet"/>
+      </w:pPr>
+      <w:r>
+        <w:t>Activar/desactivar flag isRelay: marca la cuenta como conexión de radioenlace.</w:t>
+      </w:r>
+    </w:p>
+    <w:p>
+      <w:pPr>
+        <w:pStyle w:val="ListBullet"/>
+      </w:pPr>
+      <w:r>
+        <w:t>Resetear contraseña.</w:t>
+      </w:r>
+    </w:p>
+    <w:p>
+      <w:pPr>
+        <w:pStyle w:val="ListBullet"/>
+      </w:pPr>
+      <w:r>
+        <w:t>Eliminar usuario.</w:t>
+      </w:r>
+    </w:p>
+    <w:p>
+      <w:pPr>
+        <w:ind w:left="340"/>
+      </w:pPr>
+      <w:r>
+        <w:rPr>
+          <w:i/>
+          <w:color w:val="196019"/>
+          <w:sz w:val="20"/>
+        </w:rPr>
+        <w:t>💡 Un usuario puede tener rol "relay_operator" con isAdmin=false y aun así ver solo su panel de operador. Si se activa isAdmin, pasa a ver el panel completo de administración.</w:t>
+      </w:r>
+    </w:p>
+    <w:p/>
+    <w:p>
+      <w:pPr>
+        <w:pStyle w:val="Heading2"/>
+      </w:pPr>
+      <w:r>
+        <w:rPr>
+          <w:color w:val="2E74B5"/>
+        </w:rPr>
+        <w:t>9.2 Pestaña — Radioenlaces</w:t>
+      </w:r>
+    </w:p>
+    <w:p>
+      <w:r>
+        <w:t>Muestra todos los radioenlaces (relay daemons) actualmente conectados o registrados en el servidor.</w:t>
+      </w:r>
+    </w:p>
+    <w:p>
+      <w:pPr>
+        <w:pStyle w:val="ListBullet"/>
+      </w:pPr>
+      <w:r>
+        <w:t>Lista de relays con su callsign, sala, estado de conexión y tiempo de actividad.</w:t>
+      </w:r>
+    </w:p>
+    <w:p>
+      <w:pPr>
+        <w:pStyle w:val="ListBullet"/>
+      </w:pPr>
+      <w:r>
+        <w:t>Indicador de quién está transmitiendo en cada momento.</w:t>
+      </w:r>
+    </w:p>
+    <w:p>
+      <w:pPr>
+        <w:pStyle w:val="ListBullet"/>
+      </w:pPr>
+      <w:r>
+        <w:t>Acciones: silenciar RX de un relay, forzar desconexión.</w:t>
+      </w:r>
+    </w:p>
+    <w:p>
+      <w:pPr>
+        <w:ind w:left="340"/>
+      </w:pPr>
+      <w:r>
+        <w:rPr>
+          <w:i/>
+          <w:color w:val="7F6000"/>
+          <w:sz w:val="20"/>
+        </w:rPr>
+        <w:t>⚠  Los relays se identifican con el prefijo 0R- en su callsign y el flag isRelay en la base de datos.</w:t>
+      </w:r>
+    </w:p>
+    <w:p/>
+    <w:p>
+      <w:pPr>
+        <w:pStyle w:val="Heading2"/>
+      </w:pPr>
+      <w:r>
+        <w:rPr>
+          <w:color w:val="2E74B5"/>
+        </w:rPr>
+        <w:t>9.3 Pestaña — Servidores</w:t>
+      </w:r>
+    </w:p>
+    <w:p>
+      <w:r>
+        <w:t>Gestión de conexiones salientes a otros servidores eQSO (EqsoProxy). Permite enlazar la sala ASORAPA con salas de servidores eQSO externos.</w:t>
+      </w:r>
+    </w:p>
+    <w:p>
+      <w:pPr>
+        <w:pStyle w:val="ListBullet"/>
+      </w:pPr>
+      <w:r>
+        <w:t>Añadir/eliminar servidores externos.</w:t>
+      </w:r>
+    </w:p>
+    <w:p>
+      <w:pPr>
+        <w:pStyle w:val="ListBullet"/>
+      </w:pPr>
+      <w:r>
+        <w:t>Configurar sala de destino, contraseña y callsign con el que conectar.</w:t>
+      </w:r>
+    </w:p>
+    <w:p>
+      <w:pPr>
+        <w:pStyle w:val="ListBullet"/>
+      </w:pPr>
+      <w:r>
+        <w:t>Estado de conexión en tiempo real (conectado / reconectando / desconectado).</w:t>
+      </w:r>
+    </w:p>
+    <w:p/>
+    <w:p>
+      <w:pPr>
+        <w:pStyle w:val="Heading2"/>
+      </w:pPr>
+      <w:r>
+        <w:rPr>
+          <w:color w:val="2E74B5"/>
+        </w:rPr>
+        <w:t>9.4 Pestaña — Monitor</w:t>
+      </w:r>
+    </w:p>
+    <w:p>
+      <w:r>
+        <w:t>Vista en tiempo real del estado del servidor:</w:t>
+      </w:r>
+    </w:p>
+    <w:p>
+      <w:pPr>
+        <w:pStyle w:val="ListBullet"/>
+      </w:pPr>
+      <w:r>
+        <w:t>Número de usuarios conectados por sala.</w:t>
+      </w:r>
+    </w:p>
+    <w:p>
+      <w:pPr>
+        <w:pStyle w:val="ListBullet"/>
+      </w:pPr>
+      <w:r>
+        <w:t>Quién está transmitiendo en cada sala en este momento.</w:t>
+      </w:r>
+    </w:p>
+    <w:p>
+      <w:pPr>
+        <w:pStyle w:val="ListBullet"/>
+      </w:pPr>
+      <w:r>
+        <w:t>Paquetes GSM enviados/recibidos (estadísticas globales).</w:t>
+      </w:r>
+    </w:p>
+    <w:p>
+      <w:pPr>
+        <w:pStyle w:val="ListBullet"/>
+      </w:pPr>
+      <w:r>
+        <w:t>Tiempo de actividad del servidor (uptime).</w:t>
+      </w:r>
+    </w:p>
+    <w:p/>
+    <w:p>
+      <w:pPr>
+        <w:pStyle w:val="Heading2"/>
+      </w:pPr>
+      <w:r>
+        <w:rPr>
+          <w:color w:val="2E74B5"/>
+        </w:rPr>
+        <w:t>9.5 Pestaña — Inactividad</w:t>
+      </w:r>
+    </w:p>
+    <w:p>
+      <w:r>
+        <w:t>El sistema puede detectar cuando una sala lleva un tiempo sin actividad y reproducir automáticamente un aviso de audio (como "Canal CB en servicio, ASORAPA").</w:t>
+      </w:r>
+    </w:p>
+    <w:p>
+      <w:pPr>
+        <w:pStyle w:val="ListBullet"/>
+      </w:pPr>
+      <w:r>
+        <w:t>Activar/desactivar el sistema de inactividad por sala.</w:t>
+      </w:r>
+    </w:p>
+    <w:p>
+      <w:pPr>
+        <w:pStyle w:val="ListBullet"/>
+      </w:pPr>
+      <w:r>
+        <w:t>Configurar el tiempo de silencio antes del aviso (1 a 120 minutos).</w:t>
+      </w:r>
+    </w:p>
+    <w:p>
+      <w:pPr>
+        <w:pStyle w:val="ListBullet"/>
+      </w:pPr>
+      <w:r>
+        <w:t>Subir un archivo WAV personalizado como aviso de inactividad.</w:t>
+      </w:r>
+    </w:p>
+    <w:p>
+      <w:pPr>
+        <w:pStyle w:val="ListBullet"/>
+      </w:pPr>
+      <w:r>
+        <w:t>Probar el aviso manualmente en una sala específica sin esperar el timer.</w:t>
+      </w:r>
+    </w:p>
+    <w:p>
+      <w:pPr>
+        <w:ind w:left="340"/>
+      </w:pPr>
+      <w:r>
+        <w:rPr>
+          <w:i/>
+          <w:color w:val="7F6000"/>
+          <w:sz w:val="20"/>
+        </w:rPr>
+        <w:t>⚠  El aviso se emite como transmisor "SERVIDOR" y todos los clientes de la sala lo escuchan, incluidos los relays físicos.</w:t>
+      </w:r>
+    </w:p>
+    <w:p/>
+    <w:p>
+      <w:pPr>
+        <w:pStyle w:val="Heading2"/>
+      </w:pPr>
+      <w:r>
+        <w:rPr>
+          <w:color w:val="2E74B5"/>
+        </w:rPr>
+        <w:t>9.6 Ejemplo de flujo de administración</w:t>
+      </w:r>
+    </w:p>
+    <w:p>
+      <w:r>
+        <w:t>Escenario: EA5YYY ha instalado un relay en su Raspi y quiere operar la sala CB.</w:t>
+      </w:r>
+    </w:p>
+    <w:p>
+      <w:pPr>
+        <w:pStyle w:val="ListBullet"/>
+      </w:pPr>
+      <w:r>
+        <w:t>EA5YYY se registra en el cliente web con callsign "EA5YYY" y contraseña.</w:t>
+      </w:r>
+    </w:p>
+    <w:p>
+      <w:pPr>
+        <w:pStyle w:val="ListBullet"/>
+      </w:pPr>
+      <w:r>
+        <w:t>Admin abre Panel Admin → Usuarios → Pendientes.</w:t>
+      </w:r>
+    </w:p>
+    <w:p>
+      <w:pPr>
+        <w:pStyle w:val="ListBullet"/>
+      </w:pPr>
+      <w:r>
+        <w:t>Admin aprueba la cuenta de EA5YYY.</w:t>
+      </w:r>
+    </w:p>
+    <w:p>
+      <w:pPr>
+        <w:pStyle w:val="ListBullet"/>
+      </w:pPr>
+      <w:r>
+        <w:t>Admin cambia su rol a relay_operator.</w:t>
+      </w:r>
+    </w:p>
+    <w:p>
+      <w:pPr>
+        <w:pStyle w:val="ListBullet"/>
+      </w:pPr>
+      <w:r>
+        <w:t>Admin asigna el callsign de relay: 0R-IN70WN (el daemon de EA5YYY).</w:t>
+      </w:r>
+    </w:p>
+    <w:p>
+      <w:pPr>
+        <w:pStyle w:val="ListBullet"/>
+      </w:pPr>
+      <w:r>
+        <w:t>EA5YYY inicia sesión y ve el Panel de Operador con telemetría de su relay 0R-IN70WN.</w:t>
+      </w:r>
+    </w:p>
+    <w:p>
+      <w:pPr>
+        <w:pStyle w:val="ListBullet"/>
+      </w:pPr>
+      <w:r>
+        <w:t>Desde ese panel puede ver el nivel de audio, el estado del PTT y enviar comandos remotos a su Raspi.</w:t>
+      </w:r>
+    </w:p>
+    <w:p>
+      <w:r>
+        <w:br w:type="page"/>
+      </w:r>
+    </w:p>
+    <w:p>
+      <w:pPr>
+        <w:pStyle w:val="Heading1"/>
+      </w:pPr>
+      <w:r>
+        <w:rPr>
+          <w:color w:val="1F497D"/>
+        </w:rPr>
+        <w:t>10. Panel de Operador de Radioenlace</w:t>
+      </w:r>
+    </w:p>
+    <w:p>
+      <w:r>
+        <w:t>El panel de operador es la interfaz para el operador humano responsable de un relay daemon físico. Permite monitorizar el estado del enlace y enviar comandos remotos a la Raspberry Pi o PC donde corre el relay daemon, desde cualquier navegador.</w:t>
+      </w:r>
+    </w:p>
+    <w:p>
+      <w:pPr>
+        <w:ind w:left="340"/>
+      </w:pPr>
+      <w:r>
+        <w:rPr>
+          <w:i/>
+          <w:color w:val="7F6000"/>
+          <w:sz w:val="20"/>
+        </w:rPr>
+        <w:t>⚠  Para acceder, el usuario debe tener rol relay_operator y un callsign de relay asignado por el admin, o bien ser admin.</w:t>
+      </w:r>
+    </w:p>
+    <w:p/>
+    <w:p>
+      <w:pPr>
+        <w:pStyle w:val="Heading2"/>
+      </w:pPr>
+      <w:r>
+        <w:rPr>
+          <w:color w:val="2E74B5"/>
+        </w:rPr>
+        <w:t>10.1 Telemetría en tiempo real</w:t>
+      </w:r>
+    </w:p>
+    <w:p>
+      <w:r>
+        <w:t>El panel muestra de forma continua:</w:t>
+      </w:r>
+    </w:p>
+    <w:tbl>
+      <w:tblPr>
+        <w:tblStyle w:val="TableGrid"/>
+        <w:tblW w:type="auto" w:w="0"/>
+        <w:tblLook w:firstColumn="1" w:firstRow="1" w:lastColumn="0" w:lastRow="0" w:noHBand="0" w:noVBand="1" w:val="04A0"/>
+      </w:tblPr>
+      <w:tblGrid>
+        <w:gridCol w:w="4320"/>
+        <w:gridCol w:w="4320"/>
+      </w:tblGrid>
+      <w:tr>
+        <w:tc>
+          <w:tcPr>
+            <w:tcW w:type="dxa" w:w="4320"/>
+            <w:shd w:val="clear" w:color="auto" w:fill="2E74B5"/>
+            <w:tcW w:w="2551" w:type="dxa"/>
+          </w:tcPr>
+          <w:p>
+            <w:r>
+              <w:rPr>
+                <w:b/>
+                <w:color w:val="FFFFFF"/>
+                <w:sz w:val="20"/>
+              </w:rPr>
+              <w:t>Indicador</w:t>
+            </w:r>
+          </w:p>
+        </w:tc>
+        <w:tc>
+          <w:tcPr>
+            <w:tcW w:type="dxa" w:w="4320"/>
+            <w:shd w:val="clear" w:color="auto" w:fill="2E74B5"/>
+            <w:tcW w:w="7087" w:type="dxa"/>
+          </w:tcPr>
+          <w:p>
+            <w:r>
+              <w:rPr>
+                <w:b/>
+                <w:color w:val="FFFFFF"/>
+                <w:sz w:val="20"/>
+              </w:rPr>
+              <w:t>Descripción</w:t>
+            </w:r>
+          </w:p>
+        </w:tc>
+      </w:tr>
+      <w:tr>
+        <w:tc>
+          <w:tcPr>
+            <w:tcW w:type="dxa" w:w="4320"/>
+            <w:shd w:val="clear" w:color="auto" w:fill="FFFFFF"/>
+            <w:tcW w:w="2551" w:type="dxa"/>
+          </w:tcPr>
+          <w:p>
+            <w:r/>
+            <w:r>
+              <w:rPr>
+                <w:sz w:val="20"/>
+              </w:rPr>
+              <w:t>Estado de conexión</w:t>
+            </w:r>
+          </w:p>
+        </w:tc>
+        <w:tc>
+          <w:tcPr>
+            <w:tcW w:type="dxa" w:w="4320"/>
+            <w:shd w:val="clear" w:color="auto" w:fill="FFFFFF"/>
+            <w:tcW w:w="7087" w:type="dxa"/>
+          </w:tcPr>
+          <w:p>
+            <w:r/>
+            <w:r>
+              <w:rPr>
+                <w:sz w:val="20"/>
+              </w:rPr>
+              <w:t>Online / Offline — si el daemon está conectado al servidor eQSO en este momento.</w:t>
+            </w:r>
+          </w:p>
+        </w:tc>
+      </w:tr>
+      <w:tr>
+        <w:tc>
+          <w:tcPr>
+            <w:tcW w:type="dxa" w:w="4320"/>
+            <w:shd w:val="clear" w:color="auto" w:fill="EEF4FB"/>
+            <w:tcW w:w="2551" w:type="dxa"/>
+          </w:tcPr>
+          <w:p>
+            <w:r/>
+            <w:r>
+              <w:rPr>
+                <w:sz w:val="20"/>
+              </w:rPr>
+              <w:t>Sala actual</w:t>
+            </w:r>
+          </w:p>
+        </w:tc>
+        <w:tc>
+          <w:tcPr>
+            <w:tcW w:type="dxa" w:w="4320"/>
+            <w:shd w:val="clear" w:color="auto" w:fill="EEF4FB"/>
+            <w:tcW w:w="7087" w:type="dxa"/>
+          </w:tcPr>
+          <w:p>
+            <w:r/>
+            <w:r>
+              <w:rPr>
+                <w:sz w:val="20"/>
+              </w:rPr>
+              <w:t>Sala a la que está conectado el relay daemon (ej: CB).</w:t>
+            </w:r>
+          </w:p>
+        </w:tc>
+      </w:tr>
+      <w:tr>
+        <w:tc>
+          <w:tcPr>
+            <w:tcW w:type="dxa" w:w="4320"/>
+            <w:shd w:val="clear" w:color="auto" w:fill="FFFFFF"/>
+            <w:tcW w:w="2551" w:type="dxa"/>
+          </w:tcPr>
+          <w:p>
+            <w:r/>
+            <w:r>
+              <w:rPr>
+                <w:sz w:val="20"/>
+              </w:rPr>
+              <w:t>Estado PTT</w:t>
+            </w:r>
+          </w:p>
+        </w:tc>
+        <w:tc>
+          <w:tcPr>
+            <w:tcW w:type="dxa" w:w="4320"/>
+            <w:shd w:val="clear" w:color="auto" w:fill="FFFFFF"/>
+            <w:tcW w:w="7087" w:type="dxa"/>
+          </w:tcPr>
+          <w:p>
+            <w:r/>
+            <w:r>
+              <w:rPr>
+                <w:sz w:val="20"/>
+              </w:rPr>
+              <w:t>TX (transmitiendo a la radio RF), RX (recibiendo de la sala), Idle (en espera).</w:t>
+            </w:r>
+          </w:p>
+        </w:tc>
+      </w:tr>
+      <w:tr>
+        <w:tc>
+          <w:tcPr>
+            <w:tcW w:type="dxa" w:w="4320"/>
+            <w:shd w:val="clear" w:color="auto" w:fill="EEF4FB"/>
+            <w:tcW w:w="2551" w:type="dxa"/>
+          </w:tcPr>
+          <w:p>
+            <w:r/>
+            <w:r>
+              <w:rPr>
+                <w:sz w:val="20"/>
+              </w:rPr>
+              <w:t>Nivel de audio (RMS)</w:t>
+            </w:r>
+          </w:p>
+        </w:tc>
+        <w:tc>
+          <w:tcPr>
+            <w:tcW w:type="dxa" w:w="4320"/>
+            <w:shd w:val="clear" w:color="auto" w:fill="EEF4FB"/>
+            <w:tcW w:w="7087" w:type="dxa"/>
+          </w:tcPr>
+          <w:p>
+            <w:r/>
+            <w:r>
+              <w:rPr>
+                <w:sz w:val="20"/>
+              </w:rPr>
+              <w:t>Barra visual con el nivel de audio capturado de la radio en tiempo real.</w:t>
+            </w:r>
+          </w:p>
+        </w:tc>
+      </w:tr>
+      <w:tr>
+        <w:tc>
+          <w:tcPr>
+            <w:tcW w:type="dxa" w:w="4320"/>
+            <w:shd w:val="clear" w:color="auto" w:fill="FFFFFF"/>
+            <w:tcW w:w="2551" w:type="dxa"/>
+          </w:tcPr>
+          <w:p>
+            <w:r/>
+            <w:r>
+              <w:rPr>
+                <w:sz w:val="20"/>
+              </w:rPr>
+              <w:t>Estado VOX</w:t>
+            </w:r>
+          </w:p>
+        </w:tc>
+        <w:tc>
+          <w:tcPr>
+            <w:tcW w:type="dxa" w:w="4320"/>
+            <w:shd w:val="clear" w:color="auto" w:fill="FFFFFF"/>
+            <w:tcW w:w="7087" w:type="dxa"/>
+          </w:tcPr>
+          <w:p>
+            <w:r/>
+            <w:r>
+              <w:rPr>
+                <w:sz w:val="20"/>
+              </w:rPr>
+              <w:t>Indica si el VOX está activo (detectando voz) o inactivo.</w:t>
+            </w:r>
+          </w:p>
+        </w:tc>
+      </w:tr>
+      <w:tr>
+        <w:tc>
+          <w:tcPr>
+            <w:tcW w:type="dxa" w:w="4320"/>
+            <w:shd w:val="clear" w:color="auto" w:fill="EEF4FB"/>
+            <w:tcW w:w="2551" w:type="dxa"/>
+          </w:tcPr>
+          <w:p>
+            <w:r/>
+            <w:r>
+              <w:rPr>
+                <w:sz w:val="20"/>
+              </w:rPr>
+              <w:t>TX Packets</w:t>
+            </w:r>
+          </w:p>
+        </w:tc>
+        <w:tc>
+          <w:tcPr>
+            <w:tcW w:type="dxa" w:w="4320"/>
+            <w:shd w:val="clear" w:color="auto" w:fill="EEF4FB"/>
+            <w:tcW w:w="7087" w:type="dxa"/>
+          </w:tcPr>
+          <w:p>
+            <w:r/>
+            <w:r>
+              <w:rPr>
+                <w:sz w:val="20"/>
+              </w:rPr>
+              <w:t>Número de paquetes GSM enviados al servidor desde que arrancó el daemon.</w:t>
+            </w:r>
+          </w:p>
+        </w:tc>
+      </w:tr>
+      <w:tr>
+        <w:tc>
+          <w:tcPr>
+            <w:tcW w:type="dxa" w:w="4320"/>
+            <w:shd w:val="clear" w:color="auto" w:fill="FFFFFF"/>
+            <w:tcW w:w="2551" w:type="dxa"/>
+          </w:tcPr>
+          <w:p>
+            <w:r/>
+            <w:r>
+              <w:rPr>
+                <w:sz w:val="20"/>
+              </w:rPr>
+              <w:t>RX Packets</w:t>
+            </w:r>
+          </w:p>
+        </w:tc>
+        <w:tc>
+          <w:tcPr>
+            <w:tcW w:type="dxa" w:w="4320"/>
+            <w:shd w:val="clear" w:color="auto" w:fill="FFFFFF"/>
+            <w:tcW w:w="7087" w:type="dxa"/>
+          </w:tcPr>
+          <w:p>
+            <w:r/>
+            <w:r>
+              <w:rPr>
+                <w:sz w:val="20"/>
+              </w:rPr>
+              <w:t>Número de paquetes GSM recibidos del servidor.</w:t>
+            </w:r>
+          </w:p>
+        </w:tc>
+      </w:tr>
+      <w:tr>
+        <w:tc>
+          <w:tcPr>
+            <w:tcW w:type="dxa" w:w="4320"/>
+            <w:shd w:val="clear" w:color="auto" w:fill="EEF4FB"/>
+            <w:tcW w:w="2551" w:type="dxa"/>
+          </w:tcPr>
+          <w:p>
+            <w:r/>
+            <w:r>
+              <w:rPr>
+                <w:sz w:val="20"/>
+              </w:rPr>
+              <w:t>Usuarios en sala</w:t>
+            </w:r>
+          </w:p>
+        </w:tc>
+        <w:tc>
+          <w:tcPr>
+            <w:tcW w:type="dxa" w:w="4320"/>
+            <w:shd w:val="clear" w:color="auto" w:fill="EEF4FB"/>
+            <w:tcW w:w="7087" w:type="dxa"/>
+          </w:tcPr>
+          <w:p>
+            <w:r/>
+            <w:r>
+              <w:rPr>
+                <w:sz w:val="20"/>
+              </w:rPr>
+              <w:t>Número de usuarios conectados en la sala en ese momento.</w:t>
+            </w:r>
+          </w:p>
+        </w:tc>
+      </w:tr>
+      <w:tr>
+        <w:tc>
+          <w:tcPr>
+            <w:tcW w:type="dxa" w:w="4320"/>
+            <w:shd w:val="clear" w:color="auto" w:fill="FFFFFF"/>
+            <w:tcW w:w="2551" w:type="dxa"/>
+          </w:tcPr>
+          <w:p>
+            <w:r/>
+            <w:r>
+              <w:rPr>
+                <w:sz w:val="20"/>
+              </w:rPr>
+              <w:t>Canal activo</w:t>
+            </w:r>
+          </w:p>
+        </w:tc>
+        <w:tc>
+          <w:tcPr>
+            <w:tcW w:type="dxa" w:w="4320"/>
+            <w:shd w:val="clear" w:color="auto" w:fill="FFFFFF"/>
+            <w:tcW w:w="7087" w:type="dxa"/>
+          </w:tcPr>
+          <w:p>
+            <w:r/>
+            <w:r>
+              <w:rPr>
+                <w:sz w:val="20"/>
+              </w:rPr>
+              <w:t>Indica si alguien está transmitiendo en la sala en este momento.</w:t>
+            </w:r>
+          </w:p>
+        </w:tc>
+      </w:tr>
+      <w:tr>
+        <w:tc>
+          <w:tcPr>
+            <w:tcW w:type="dxa" w:w="4320"/>
+            <w:shd w:val="clear" w:color="auto" w:fill="EEF4FB"/>
+            <w:tcW w:w="2551" w:type="dxa"/>
+          </w:tcPr>
+          <w:p>
+            <w:r/>
+            <w:r>
+              <w:rPr>
+                <w:sz w:val="20"/>
+              </w:rPr>
+              <w:t>Uptime</w:t>
+            </w:r>
+          </w:p>
+        </w:tc>
+        <w:tc>
+          <w:tcPr>
+            <w:tcW w:type="dxa" w:w="4320"/>
+            <w:shd w:val="clear" w:color="auto" w:fill="EEF4FB"/>
+            <w:tcW w:w="7087" w:type="dxa"/>
+          </w:tcPr>
+          <w:p>
+            <w:r/>
+            <w:r>
+              <w:rPr>
+                <w:sz w:val="20"/>
+              </w:rPr>
+              <w:t>Tiempo que lleva activo el daemon sin reiniciarse.</w:t>
+            </w:r>
+          </w:p>
+        </w:tc>
+      </w:tr>
+    </w:tbl>
+    <w:p/>
+    <w:p>
+      <w:pPr>
+        <w:pStyle w:val="Heading2"/>
+      </w:pPr>
+      <w:r>
+        <w:rPr>
+          <w:color w:val="2E74B5"/>
+        </w:rPr>
+        <w:t>10.2 Comandos remotos</w:t>
+      </w:r>
+    </w:p>
+    <w:p>
+      <w:r>
+        <w:t>El operador puede enviar comandos al daemon desde el panel web:</w:t>
+      </w:r>
+    </w:p>
+    <w:tbl>
+      <w:tblPr>
+        <w:tblStyle w:val="TableGrid"/>
+        <w:tblW w:type="auto" w:w="0"/>
+        <w:tblLook w:firstColumn="1" w:firstRow="1" w:lastColumn="0" w:lastRow="0" w:noHBand="0" w:noVBand="1" w:val="04A0"/>
+      </w:tblPr>
+      <w:tblGrid>
+        <w:gridCol w:w="4320"/>
+        <w:gridCol w:w="4320"/>
+      </w:tblGrid>
+      <w:tr>
+        <w:tc>
+          <w:tcPr>
+            <w:tcW w:type="dxa" w:w="4320"/>
+            <w:shd w:val="clear" w:color="auto" w:fill="2E74B5"/>
+            <w:tcW w:w="2835" w:type="dxa"/>
+          </w:tcPr>
+          <w:p>
+            <w:r>
+              <w:rPr>
+                <w:b/>
+                <w:color w:val="FFFFFF"/>
+                <w:sz w:val="20"/>
+              </w:rPr>
+              <w:t>Botón / Acción</w:t>
+            </w:r>
+          </w:p>
+        </w:tc>
+        <w:tc>
+          <w:tcPr>
+            <w:tcW w:type="dxa" w:w="4320"/>
+            <w:shd w:val="clear" w:color="auto" w:fill="2E74B5"/>
+            <w:tcW w:w="6804" w:type="dxa"/>
+          </w:tcPr>
+          <w:p>
+            <w:r>
+              <w:rPr>
+                <w:b/>
+                <w:color w:val="FFFFFF"/>
+                <w:sz w:val="20"/>
+              </w:rPr>
+              <w:t>Efecto en el relay daemon</w:t>
+            </w:r>
+          </w:p>
+        </w:tc>
+      </w:tr>
+      <w:tr>
+        <w:tc>
+          <w:tcPr>
+            <w:tcW w:type="dxa" w:w="4320"/>
+            <w:shd w:val="clear" w:color="auto" w:fill="FFFFFF"/>
+            <w:tcW w:w="2835" w:type="dxa"/>
+          </w:tcPr>
+          <w:p>
+            <w:r/>
+            <w:r>
+              <w:rPr>
+                <w:sz w:val="20"/>
+              </w:rPr>
+              <w:t>Probar PTT</w:t>
+            </w:r>
+          </w:p>
+        </w:tc>
+        <w:tc>
+          <w:tcPr>
+            <w:tcW w:type="dxa" w:w="4320"/>
+            <w:shd w:val="clear" w:color="auto" w:fill="FFFFFF"/>
+            <w:tcW w:w="6804" w:type="dxa"/>
+          </w:tcPr>
+          <w:p>
+            <w:r/>
+            <w:r>
+              <w:rPr>
+                <w:sz w:val="20"/>
+              </w:rPr>
+              <w:t>Activa el PTT de la radio durante unos segundos para verificar que el hardware funciona.</w:t>
+            </w:r>
+          </w:p>
+        </w:tc>
+      </w:tr>
+      <w:tr>
+        <w:tc>
+          <w:tcPr>
+            <w:tcW w:type="dxa" w:w="4320"/>
+            <w:shd w:val="clear" w:color="auto" w:fill="EEF4FB"/>
+            <w:tcW w:w="2835" w:type="dxa"/>
+          </w:tcPr>
+          <w:p>
+            <w:r/>
+            <w:r>
+              <w:rPr>
+                <w:sz w:val="20"/>
+              </w:rPr>
+              <w:t>Silenciar RX</w:t>
+            </w:r>
+          </w:p>
+        </w:tc>
+        <w:tc>
+          <w:tcPr>
+            <w:tcW w:type="dxa" w:w="4320"/>
+            <w:shd w:val="clear" w:color="auto" w:fill="EEF4FB"/>
+            <w:tcW w:w="6804" w:type="dxa"/>
+          </w:tcPr>
+          <w:p>
+            <w:r/>
+            <w:r>
+              <w:rPr>
+                <w:sz w:val="20"/>
+              </w:rPr>
+              <w:t>El daemon deja de reproducir audio de la sala por el altavoz de la radio (sin desconectarse).</w:t>
+            </w:r>
+          </w:p>
+        </w:tc>
+      </w:tr>
+      <w:tr>
+        <w:tc>
+          <w:tcPr>
+            <w:tcW w:type="dxa" w:w="4320"/>
+            <w:shd w:val="clear" w:color="auto" w:fill="FFFFFF"/>
+            <w:tcW w:w="2835" w:type="dxa"/>
+          </w:tcPr>
+          <w:p>
+            <w:r/>
+            <w:r>
+              <w:rPr>
+                <w:sz w:val="20"/>
+              </w:rPr>
+              <w:t>Activar RX</w:t>
+            </w:r>
+          </w:p>
+        </w:tc>
+        <w:tc>
+          <w:tcPr>
+            <w:tcW w:type="dxa" w:w="4320"/>
+            <w:shd w:val="clear" w:color="auto" w:fill="FFFFFF"/>
+            <w:tcW w:w="6804" w:type="dxa"/>
+          </w:tcPr>
+          <w:p>
+            <w:r/>
+            <w:r>
+              <w:rPr>
+                <w:sz w:val="20"/>
+              </w:rPr>
+              <w:t>Reactiva la reproducción de audio de la sala hacia la radio.</w:t>
+            </w:r>
+          </w:p>
+        </w:tc>
+      </w:tr>
+      <w:tr>
+        <w:tc>
+          <w:tcPr>
+            <w:tcW w:type="dxa" w:w="4320"/>
+            <w:shd w:val="clear" w:color="auto" w:fill="EEF4FB"/>
+            <w:tcW w:w="2835" w:type="dxa"/>
+          </w:tcPr>
+          <w:p>
+            <w:r/>
+            <w:r>
+              <w:rPr>
+                <w:sz w:val="20"/>
+              </w:rPr>
+              <w:t>Reconectar</w:t>
+            </w:r>
+          </w:p>
+        </w:tc>
+        <w:tc>
+          <w:tcPr>
+            <w:tcW w:type="dxa" w:w="4320"/>
+            <w:shd w:val="clear" w:color="auto" w:fill="EEF4FB"/>
+            <w:tcW w:w="6804" w:type="dxa"/>
+          </w:tcPr>
+          <w:p>
+            <w:r/>
+            <w:r>
+              <w:rPr>
+                <w:sz w:val="20"/>
+              </w:rPr>
+              <w:t>Fuerza al daemon a cerrar y reabrir la conexión TCP con el servidor eQSO.</w:t>
+            </w:r>
+          </w:p>
+        </w:tc>
+      </w:tr>
+    </w:tbl>
+    <w:p>
+      <w:pPr>
+        <w:ind w:left="340"/>
+      </w:pPr>
+      <w:r>
+        <w:rPr>
+          <w:i/>
+          <w:color w:val="196019"/>
+          <w:sz w:val="20"/>
+        </w:rPr>
+        <w:t>💡 "Probar PTT" es especialmente útil durante la puesta en marcha para verificar que el cable serie y el pin RTS/DTR están correctamente conectados a la radio.</w:t>
+      </w:r>
+    </w:p>
+    <w:p/>
+    <w:p>
+      <w:pPr>
+        <w:pStyle w:val="Heading2"/>
+      </w:pPr>
+      <w:r>
+        <w:rPr>
+          <w:color w:val="2E74B5"/>
+        </w:rPr>
+        <w:t>10.3 Diferencias entre Operador y Administrador</w:t>
+      </w:r>
+    </w:p>
+    <w:tbl>
+      <w:tblPr>
+        <w:tblStyle w:val="TableGrid"/>
+        <w:tblW w:type="auto" w:w="0"/>
+        <w:tblLook w:firstColumn="1" w:firstRow="1" w:lastColumn="0" w:lastRow="0" w:noHBand="0" w:noVBand="1" w:val="04A0"/>
+      </w:tblPr>
+      <w:tblGrid>
+        <w:gridCol w:w="2880"/>
+        <w:gridCol w:w="2880"/>
+        <w:gridCol w:w="2880"/>
+      </w:tblGrid>
+      <w:tr>
+        <w:tc>
+          <w:tcPr>
+            <w:tcW w:type="dxa" w:w="2880"/>
+            <w:shd w:val="clear" w:color="auto" w:fill="2E74B5"/>
+            <w:tcW w:w="3685" w:type="dxa"/>
+          </w:tcPr>
+          <w:p>
+            <w:r>
+              <w:rPr>
+                <w:b/>
+                <w:color w:val="FFFFFF"/>
+                <w:sz w:val="20"/>
+              </w:rPr>
+              <w:t>Función</w:t>
+            </w:r>
+          </w:p>
+        </w:tc>
+        <w:tc>
+          <w:tcPr>
+            <w:tcW w:type="dxa" w:w="2880"/>
+            <w:shd w:val="clear" w:color="auto" w:fill="2E74B5"/>
+            <w:tcW w:w="2551" w:type="dxa"/>
+          </w:tcPr>
+          <w:p>
+            <w:r>
+              <w:rPr>
+                <w:b/>
+                <w:color w:val="FFFFFF"/>
+                <w:sz w:val="20"/>
+              </w:rPr>
+              <w:t>Operador (relay_operator)</w:t>
+            </w:r>
+          </w:p>
+        </w:tc>
+        <w:tc>
+          <w:tcPr>
+            <w:tcW w:type="dxa" w:w="2880"/>
+            <w:shd w:val="clear" w:color="auto" w:fill="2E74B5"/>
+            <w:tcW w:w="2551" w:type="dxa"/>
+          </w:tcPr>
+          <w:p>
+            <w:r>
+              <w:rPr>
+                <w:b/>
+                <w:color w:val="FFFFFF"/>
+                <w:sz w:val="20"/>
+              </w:rPr>
+              <w:t>Administrador (admin)</w:t>
+            </w:r>
+          </w:p>
+        </w:tc>
+      </w:tr>
+      <w:tr>
+        <w:tc>
+          <w:tcPr>
+            <w:tcW w:type="dxa" w:w="2880"/>
+            <w:shd w:val="clear" w:color="auto" w:fill="FFFFFF"/>
+            <w:tcW w:w="3685" w:type="dxa"/>
+          </w:tcPr>
+          <w:p>
+            <w:r/>
+            <w:r>
+              <w:rPr>
+                <w:sz w:val="20"/>
+              </w:rPr>
+              <w:t>Ver telemetría de su relay</w:t>
+            </w:r>
+          </w:p>
+        </w:tc>
+        <w:tc>
+          <w:tcPr>
+            <w:tcW w:type="dxa" w:w="2880"/>
+            <w:shd w:val="clear" w:color="auto" w:fill="FFFFFF"/>
+            <w:tcW w:w="2551" w:type="dxa"/>
+          </w:tcPr>
+          <w:p>
+            <w:r/>
+            <w:r>
+              <w:rPr>
+                <w:sz w:val="20"/>
+              </w:rPr>
+              <w:t>✅</w:t>
+            </w:r>
+          </w:p>
+        </w:tc>
+        <w:tc>
+          <w:tcPr>
+            <w:tcW w:type="dxa" w:w="2880"/>
+            <w:shd w:val="clear" w:color="auto" w:fill="FFFFFF"/>
+            <w:tcW w:w="2551" w:type="dxa"/>
+          </w:tcPr>
+          <w:p>
+            <w:r/>
+            <w:r>
+              <w:rPr>
+                <w:sz w:val="20"/>
+              </w:rPr>
+              <w:t>✅</w:t>
+            </w:r>
+          </w:p>
+        </w:tc>
+      </w:tr>
+      <w:tr>
+        <w:tc>
+          <w:tcPr>
+            <w:tcW w:type="dxa" w:w="2880"/>
+            <w:shd w:val="clear" w:color="auto" w:fill="EEF4FB"/>
+            <w:tcW w:w="3685" w:type="dxa"/>
+          </w:tcPr>
+          <w:p>
+            <w:r/>
+            <w:r>
+              <w:rPr>
+                <w:sz w:val="20"/>
+              </w:rPr>
+              <w:t>Ver telemetría de todos los relays</w:t>
+            </w:r>
+          </w:p>
+        </w:tc>
+        <w:tc>
+          <w:tcPr>
+            <w:tcW w:type="dxa" w:w="2880"/>
+            <w:shd w:val="clear" w:color="auto" w:fill="EEF4FB"/>
+            <w:tcW w:w="2551" w:type="dxa"/>
+          </w:tcPr>
+          <w:p>
+            <w:r/>
+            <w:r>
+              <w:rPr>
+                <w:sz w:val="20"/>
+              </w:rPr>
+              <w:t>❌</w:t>
+            </w:r>
+          </w:p>
+        </w:tc>
+        <w:tc>
+          <w:tcPr>
+            <w:tcW w:type="dxa" w:w="2880"/>
+            <w:shd w:val="clear" w:color="auto" w:fill="EEF4FB"/>
+            <w:tcW w:w="2551" w:type="dxa"/>
+          </w:tcPr>
+          <w:p>
+            <w:r/>
+            <w:r>
+              <w:rPr>
+                <w:sz w:val="20"/>
+              </w:rPr>
+              <w:t>✅</w:t>
+            </w:r>
+          </w:p>
+        </w:tc>
+      </w:tr>
+      <w:tr>
+        <w:tc>
+          <w:tcPr>
+            <w:tcW w:type="dxa" w:w="2880"/>
+            <w:shd w:val="clear" w:color="auto" w:fill="FFFFFF"/>
+            <w:tcW w:w="3685" w:type="dxa"/>
+          </w:tcPr>
+          <w:p>
+            <w:r/>
+            <w:r>
+              <w:rPr>
+                <w:sz w:val="20"/>
+              </w:rPr>
+              <w:t>Enviar comandos a su relay</w:t>
+            </w:r>
+          </w:p>
+        </w:tc>
+        <w:tc>
+          <w:tcPr>
+            <w:tcW w:type="dxa" w:w="2880"/>
+            <w:shd w:val="clear" w:color="auto" w:fill="FFFFFF"/>
+            <w:tcW w:w="2551" w:type="dxa"/>
+          </w:tcPr>
+          <w:p>
+            <w:r/>
+            <w:r>
+              <w:rPr>
+                <w:sz w:val="20"/>
+              </w:rPr>
+              <w:t>✅</w:t>
+            </w:r>
+          </w:p>
+        </w:tc>
+        <w:tc>
+          <w:tcPr>
+            <w:tcW w:type="dxa" w:w="2880"/>
+            <w:shd w:val="clear" w:color="auto" w:fill="FFFFFF"/>
+            <w:tcW w:w="2551" w:type="dxa"/>
+          </w:tcPr>
+          <w:p>
+            <w:r/>
+            <w:r>
+              <w:rPr>
+                <w:sz w:val="20"/>
+              </w:rPr>
+              <w:t>✅</w:t>
+            </w:r>
+          </w:p>
+        </w:tc>
+      </w:tr>
+      <w:tr>
+        <w:tc>
+          <w:tcPr>
+            <w:tcW w:type="dxa" w:w="2880"/>
+            <w:shd w:val="clear" w:color="auto" w:fill="EEF4FB"/>
+            <w:tcW w:w="3685" w:type="dxa"/>
+          </w:tcPr>
+          <w:p>
+            <w:r/>
+            <w:r>
+              <w:rPr>
+                <w:sz w:val="20"/>
+              </w:rPr>
+              <w:t>Enviar comandos a cualquier relay</w:t>
+            </w:r>
+          </w:p>
+        </w:tc>
+        <w:tc>
+          <w:tcPr>
+            <w:tcW w:type="dxa" w:w="2880"/>
+            <w:shd w:val="clear" w:color="auto" w:fill="EEF4FB"/>
+            <w:tcW w:w="2551" w:type="dxa"/>
+          </w:tcPr>
+          <w:p>
+            <w:r/>
+            <w:r>
+              <w:rPr>
+                <w:sz w:val="20"/>
+              </w:rPr>
+              <w:t>❌</w:t>
+            </w:r>
+          </w:p>
+        </w:tc>
+        <w:tc>
+          <w:tcPr>
+            <w:tcW w:type="dxa" w:w="2880"/>
+            <w:shd w:val="clear" w:color="auto" w:fill="EEF4FB"/>
+            <w:tcW w:w="2551" w:type="dxa"/>
+          </w:tcPr>
+          <w:p>
+            <w:r/>
+            <w:r>
+              <w:rPr>
+                <w:sz w:val="20"/>
+              </w:rPr>
+              <w:t>✅</w:t>
+            </w:r>
+          </w:p>
+        </w:tc>
+      </w:tr>
+      <w:tr>
+        <w:tc>
+          <w:tcPr>
+            <w:tcW w:type="dxa" w:w="2880"/>
+            <w:shd w:val="clear" w:color="auto" w:fill="FFFFFF"/>
+            <w:tcW w:w="3685" w:type="dxa"/>
+          </w:tcPr>
+          <w:p>
+            <w:r/>
+            <w:r>
+              <w:rPr>
+                <w:sz w:val="20"/>
+              </w:rPr>
+              <w:t>Gestionar usuarios</w:t>
+            </w:r>
+          </w:p>
+        </w:tc>
+        <w:tc>
+          <w:tcPr>
+            <w:tcW w:type="dxa" w:w="2880"/>
+            <w:shd w:val="clear" w:color="auto" w:fill="FFFFFF"/>
+            <w:tcW w:w="2551" w:type="dxa"/>
+          </w:tcPr>
+          <w:p>
+            <w:r/>
+            <w:r>
+              <w:rPr>
+                <w:sz w:val="20"/>
+              </w:rPr>
+              <w:t>❌</w:t>
+            </w:r>
+          </w:p>
+        </w:tc>
+        <w:tc>
+          <w:tcPr>
+            <w:tcW w:type="dxa" w:w="2880"/>
+            <w:shd w:val="clear" w:color="auto" w:fill="FFFFFF"/>
+            <w:tcW w:w="2551" w:type="dxa"/>
+          </w:tcPr>
+          <w:p>
+            <w:r/>
+            <w:r>
+              <w:rPr>
+                <w:sz w:val="20"/>
+              </w:rPr>
+              <w:t>✅</w:t>
+            </w:r>
+          </w:p>
+        </w:tc>
+      </w:tr>
+      <w:tr>
+        <w:tc>
+          <w:tcPr>
+            <w:tcW w:type="dxa" w:w="2880"/>
+            <w:shd w:val="clear" w:color="auto" w:fill="EEF4FB"/>
+            <w:tcW w:w="3685" w:type="dxa"/>
+          </w:tcPr>
+          <w:p>
+            <w:r/>
+            <w:r>
+              <w:rPr>
+                <w:sz w:val="20"/>
+              </w:rPr>
+              <w:t>Gestionar servidores externos</w:t>
+            </w:r>
+          </w:p>
+        </w:tc>
+        <w:tc>
+          <w:tcPr>
+            <w:tcW w:type="dxa" w:w="2880"/>
+            <w:shd w:val="clear" w:color="auto" w:fill="EEF4FB"/>
+            <w:tcW w:w="2551" w:type="dxa"/>
+          </w:tcPr>
+          <w:p>
+            <w:r/>
+            <w:r>
+              <w:rPr>
+                <w:sz w:val="20"/>
+              </w:rPr>
+              <w:t>❌</w:t>
+            </w:r>
+          </w:p>
+        </w:tc>
+        <w:tc>
+          <w:tcPr>
+            <w:tcW w:type="dxa" w:w="2880"/>
+            <w:shd w:val="clear" w:color="auto" w:fill="EEF4FB"/>
+            <w:tcW w:w="2551" w:type="dxa"/>
+          </w:tcPr>
+          <w:p>
+            <w:r/>
+            <w:r>
+              <w:rPr>
+                <w:sz w:val="20"/>
+              </w:rPr>
+              <w:t>✅</w:t>
+            </w:r>
+          </w:p>
+        </w:tc>
+      </w:tr>
+      <w:tr>
+        <w:tc>
+          <w:tcPr>
+            <w:tcW w:type="dxa" w:w="2880"/>
+            <w:shd w:val="clear" w:color="auto" w:fill="FFFFFF"/>
+            <w:tcW w:w="3685" w:type="dxa"/>
+          </w:tcPr>
+          <w:p>
+            <w:r/>
+            <w:r>
+              <w:rPr>
+                <w:sz w:val="20"/>
+              </w:rPr>
+              <w:t>Configurar avisos de inactividad</w:t>
+            </w:r>
+          </w:p>
+        </w:tc>
+        <w:tc>
+          <w:tcPr>
+            <w:tcW w:type="dxa" w:w="2880"/>
+            <w:shd w:val="clear" w:color="auto" w:fill="FFFFFF"/>
+            <w:tcW w:w="2551" w:type="dxa"/>
+          </w:tcPr>
+          <w:p>
+            <w:r/>
+            <w:r>
+              <w:rPr>
+                <w:sz w:val="20"/>
+              </w:rPr>
+              <w:t>❌</w:t>
+            </w:r>
+          </w:p>
+        </w:tc>
+        <w:tc>
+          <w:tcPr>
+            <w:tcW w:type="dxa" w:w="2880"/>
+            <w:shd w:val="clear" w:color="auto" w:fill="FFFFFF"/>
+            <w:tcW w:w="2551" w:type="dxa"/>
+          </w:tcPr>
+          <w:p>
+            <w:r/>
+            <w:r>
+              <w:rPr>
+                <w:sz w:val="20"/>
+              </w:rPr>
+              <w:t>✅</w:t>
+            </w:r>
+          </w:p>
+        </w:tc>
+      </w:tr>
+      <w:tr>
+        <w:tc>
+          <w:tcPr>
+            <w:tcW w:type="dxa" w:w="2880"/>
+            <w:shd w:val="clear" w:color="auto" w:fill="EEF4FB"/>
+            <w:tcW w:w="3685" w:type="dxa"/>
+          </w:tcPr>
+          <w:p>
+            <w:r/>
+            <w:r>
+              <w:rPr>
+                <w:sz w:val="20"/>
+              </w:rPr>
+              <w:t>Ver monitor global de la sala</w:t>
+            </w:r>
+          </w:p>
+        </w:tc>
+        <w:tc>
+          <w:tcPr>
+            <w:tcW w:type="dxa" w:w="2880"/>
+            <w:shd w:val="clear" w:color="auto" w:fill="EEF4FB"/>
+            <w:tcW w:w="2551" w:type="dxa"/>
+          </w:tcPr>
+          <w:p>
+            <w:r/>
+            <w:r>
+              <w:rPr>
+                <w:sz w:val="20"/>
+              </w:rPr>
+              <w:t>❌</w:t>
+            </w:r>
+          </w:p>
+        </w:tc>
+        <w:tc>
+          <w:tcPr>
+            <w:tcW w:type="dxa" w:w="2880"/>
+            <w:shd w:val="clear" w:color="auto" w:fill="EEF4FB"/>
+            <w:tcW w:w="2551" w:type="dxa"/>
+          </w:tcPr>
+          <w:p>
+            <w:r/>
+            <w:r>
+              <w:rPr>
+                <w:sz w:val="20"/>
+              </w:rPr>
+              <w:t>✅</w:t>
+            </w:r>
+          </w:p>
+        </w:tc>
+      </w:tr>
+      <w:tr>
+        <w:tc>
+          <w:tcPr>
+            <w:tcW w:type="dxa" w:w="2880"/>
+            <w:shd w:val="clear" w:color="auto" w:fill="FFFFFF"/>
+            <w:tcW w:w="3685" w:type="dxa"/>
+          </w:tcPr>
+          <w:p>
+            <w:r/>
+            <w:r>
+              <w:rPr>
+                <w:sz w:val="20"/>
+              </w:rPr>
+              <w:t>Transmitir en la sala (PTT web)</w:t>
+            </w:r>
+          </w:p>
+        </w:tc>
+        <w:tc>
+          <w:tcPr>
+            <w:tcW w:type="dxa" w:w="2880"/>
+            <w:shd w:val="clear" w:color="auto" w:fill="FFFFFF"/>
+            <w:tcW w:w="2551" w:type="dxa"/>
+          </w:tcPr>
+          <w:p>
+            <w:r/>
+            <w:r>
+              <w:rPr>
+                <w:sz w:val="20"/>
+              </w:rPr>
+              <w:t>✅ (como usuario)</w:t>
+            </w:r>
+          </w:p>
+        </w:tc>
+        <w:tc>
+          <w:tcPr>
+            <w:tcW w:type="dxa" w:w="2880"/>
+            <w:shd w:val="clear" w:color="auto" w:fill="FFFFFF"/>
+            <w:tcW w:w="2551" w:type="dxa"/>
+          </w:tcPr>
+          <w:p>
+            <w:r/>
+            <w:r>
+              <w:rPr>
+                <w:sz w:val="20"/>
+              </w:rPr>
+              <w:t>✅ (como usuario)</w:t>
+            </w:r>
+          </w:p>
+        </w:tc>
+      </w:tr>
+    </w:tbl>
+    <w:p/>
+    <w:p>
+      <w:pPr>
+        <w:pStyle w:val="Heading2"/>
+      </w:pPr>
+      <w:r>
+        <w:rPr>
+          <w:color w:val="2E74B5"/>
+        </w:rPr>
+        <w:t>10.4 Ejemplo de uso del Panel de Operador</w:t>
+      </w:r>
+    </w:p>
+    <w:p>
+      <w:r>
+        <w:t>Escenario: EA5YYY quiere verificar que su relay 0R-IN70WN está funcionando bien.</w:t>
+      </w:r>
+    </w:p>
+    <w:p>
+      <w:pPr>
+        <w:pStyle w:val="ListBullet"/>
+      </w:pPr>
+      <w:r>
+        <w:t>Inicia sesión en el cliente web con su cuenta relay_operator.</w:t>
+      </w:r>
+    </w:p>
+    <w:p>
+      <w:pPr>
+        <w:pStyle w:val="ListBullet"/>
+      </w:pPr>
+      <w:r>
+        <w:t>Ve el Panel de Operador automáticamente (no tiene acceso al panel de admin).</w:t>
+      </w:r>
+    </w:p>
+    <w:p>
+      <w:pPr>
+        <w:pStyle w:val="ListBullet"/>
+      </w:pPr>
+      <w:r>
+        <w:t>Comprueba que el indicador "Estado de conexión" muestra Online.</w:t>
+      </w:r>
+    </w:p>
+    <w:p>
+      <w:pPr>
+        <w:pStyle w:val="ListBullet"/>
+      </w:pPr>
+      <w:r>
+        <w:t>Habla por la radio CB en su ubicación y observa que el nivel RMS sube y el VOX se activa.</w:t>
+      </w:r>
+    </w:p>
+    <w:p>
+      <w:pPr>
+        <w:pStyle w:val="ListBullet"/>
+      </w:pPr>
+      <w:r>
+        <w:t>Verifica que TX Packets aumenta (confirma que el encoder GSM está funcionando).</w:t>
+      </w:r>
+    </w:p>
+    <w:p>
+      <w:pPr>
+        <w:pStyle w:val="ListBullet"/>
+      </w:pPr>
+      <w:r>
+        <w:t>Hace clic en "Probar PTT" para verificar que la radio transmite en RF cuando el server le da canal.</w:t>
+      </w:r>
+    </w:p>
+    <w:p>
+      <w:pPr>
+        <w:pStyle w:val="ListBullet"/>
+      </w:pPr>
+      <w:r>
+        <w:t>Si hay eco, hace clic en "Silenciar RX" temporalmente mientras ajusta el nivel del altavoz.</w:t>
+      </w:r>
+    </w:p>
+    <w:p>
+      <w:pPr>
+        <w:ind w:left="340"/>
+      </w:pPr>
+      <w:r>
+        <w:rPr>
+          <w:i/>
+          <w:color w:val="196019"/>
+          <w:sz w:val="20"/>
+        </w:rPr>
+        <w:t>💡 Si TX Packets no sube al hablar, el problema está en el encoder GSM o en el nivel de audio capturado. Ver sección 6.2.</w:t>
       </w:r>
     </w:p>
     <w:sectPr>

</xml_diff>

<commit_message>
Document current Windows and Linux relay installation
</commit_message>
<xml_diff>
--- a/guia_relay_instalacion.docx
+++ b/guia_relay_instalacion.docx
@@ -33,11 +33,7 @@
         <w:jc w:val="center"/>
       </w:pPr>
       <w:r>
-        <w:rPr>
-          <w:color w:val="606060"/>
-          <w:sz w:val="24"/>
-        </w:rPr>
-        <w:t>Versión 1.3 — Julio 2026</w:t>
+        <w:t>Versión 1.4 — Agosto 2026</w:t>
       </w:r>
     </w:p>
     <w:p>
@@ -283,9 +279,6 @@
         <w:pStyle w:val="Heading1"/>
       </w:pPr>
       <w:r>
-        <w:rPr>
-          <w:color w:val="1F497D"/>
-        </w:rPr>
         <w:t>2. Instalación en Linux / Raspberry Pi</w:t>
       </w:r>
     </w:p>
@@ -294,84 +287,70 @@
         <w:pStyle w:val="Heading2"/>
       </w:pPr>
       <w:r>
-        <w:rPr>
-          <w:color w:val="2E74B5"/>
-        </w:rPr>
-        <w:t>2.1 Script automático (recomendado)</w:t>
+        <w:t>2.1 Requisitos y script automático (recomendado)</w:t>
       </w:r>
     </w:p>
     <w:p>
+      <w:pPr/>
       <w:r>
-        <w:t>Un solo comando instala todo de forma interactiva: Node.js, pnpm, compilación, configuración y servicio systemd.</w:t>
+        <w:t>Este instalador está pensado para Ubuntu, Debian y Raspberry Pi OS. Debe ejecutarse con un usuario normal que tenga permisos sudo; no debe ejecutarse como root.</w:t>
       </w:r>
     </w:p>
     <w:p>
-      <w:pPr>
-        <w:pStyle w:val="NoSpacing"/>
-        <w:ind w:left="454"/>
-        <w:shd w:val="clear" w:color="auto" w:fill="F2F2F2"/>
-      </w:pPr>
+      <w:pPr/>
       <w:r>
-        <w:rPr>
-          <w:rFonts w:ascii="Courier New" w:hAnsi="Courier New"/>
-          <w:color w:val="C7254E"/>
-          <w:sz w:val="18"/>
-        </w:rPr>
-        <w:t>bash &lt;(curl -fsSL https://raw.githubusercontent.com/daycart/eqso-linux/main/artifacts/relay-daemon/install/install-relay.sh)</w:t>
-      </w:r>
-    </w:p>
-    <w:p/>
-    <w:p>
-      <w:r>
-        <w:t>El script realiza automáticamente:</w:t>
+        <w:t>Se necesita conexión a internet, una tarjeta de sonido USB para la radio y, si se desea transmisión RF automática, un cable USB-serie para PTT. El administrador debe facilitar el token del relay.</w:t>
       </w:r>
     </w:p>
     <w:p>
-      <w:pPr>
-        <w:pStyle w:val="ListBullet"/>
-      </w:pPr>
+      <w:pPr/>
       <w:r>
-        <w:t>Instala ffmpeg, git y curl vía apt si no están presentes.</w:t>
+        <w:t>La instalación directa se inicia con un solo comando:</w:t>
       </w:r>
     </w:p>
     <w:p>
       <w:pPr>
-        <w:pStyle w:val="ListBullet"/>
+        <w:pStyle w:val="NoSpacing"/>
       </w:pPr>
       <w:r>
-        <w:t>Instala pnpm y Node.js LTS en el home del usuario (sin permisos root).</w:t>
+        <w:rPr>
+          <w:rFonts w:ascii="Consolas" w:hAnsi="Consolas" w:eastAsia="Consolas"/>
+        </w:rPr>
+        <w:t>bash &lt;(curl -fsSL https://raw.githubusercontent.com/daycart/eqso-linux-client/main/artifacts/relay-daemon/install/install-relay.sh)</w:t>
       </w:r>
     </w:p>
     <w:p>
-      <w:pPr>
-        <w:pStyle w:val="ListBullet"/>
-      </w:pPr>
+      <w:pPr/>
       <w:r>
-        <w:t>Clona o actualiza el repositorio en ~/eqso-linux.</w:t>
+        <w:t>Si el repositorio ya está clonado, también puede ejecutarse desde él:</w:t>
       </w:r>
     </w:p>
     <w:p>
       <w:pPr>
-        <w:pStyle w:val="ListBullet"/>
+        <w:pStyle w:val="NoSpacing"/>
       </w:pPr>
       <w:r>
-        <w:t>Compila el relay daemon.</w:t>
+        <w:rPr>
+          <w:rFonts w:ascii="Consolas" w:hAnsi="Consolas" w:eastAsia="Consolas"/>
+        </w:rPr>
+        <w:t>git clone https://github.com/daycart/eqso-linux-client</w:t>
       </w:r>
     </w:p>
     <w:p>
       <w:pPr>
-        <w:pStyle w:val="ListBullet"/>
+        <w:pStyle w:val="NoSpacing"/>
       </w:pPr>
       <w:r>
-        <w:t>Detecta tarjetas de audio USB y puertos serie disponibles.</w:t>
+        <w:rPr>
+          <w:rFonts w:ascii="Consolas" w:hAnsi="Consolas" w:eastAsia="Consolas"/>
+        </w:rPr>
+        <w:t>bash eqso-linux-client/artifacts/relay-daemon/install/install-relay.sh</w:t>
       </w:r>
     </w:p>
     <w:p>
-      <w:pPr>
-        <w:pStyle w:val="ListBullet"/>
-      </w:pPr>
+      <w:pPr/>
       <w:r>
-        <w:t>Pregunta callsign, sala, servidor, token y dispositivos.</w:t>
+        <w:t>El instalador realiza automáticamente:</w:t>
       </w:r>
     </w:p>
     <w:p>
@@ -379,7 +358,7 @@
         <w:pStyle w:val="ListBullet"/>
       </w:pPr>
       <w:r>
-        <w:t>Crea /etc/eqso-relay/&lt;SALA&gt;.json con la configuración.</w:t>
+        <w:t>Instala vía apt ffmpeg, git, curl y alsa-utils cuando faltan. alsa-utils proporciona aplay y arecord para el audio ALSA.</w:t>
       </w:r>
     </w:p>
     <w:p>
@@ -387,92 +366,131 @@
         <w:pStyle w:val="ListBullet"/>
       </w:pPr>
       <w:r>
-        <w:t>Instala y activa el servicio systemd eqso-relay@&lt;SALA&gt;.</w:t>
-      </w:r>
-    </w:p>
-    <w:p/>
-    <w:p>
-      <w:pPr>
-        <w:pStyle w:val="Heading2"/>
-      </w:pPr>
-      <w:r>
-        <w:rPr>
-          <w:color w:val="2E74B5"/>
-        </w:rPr>
-        <w:t>2.2 Instalación manual paso a paso</w:t>
+        <w:t>Añade el usuario a los grupos audio y dialout. Si se modifican los grupos, puede ser necesario cerrar y abrir sesión.</w:t>
       </w:r>
     </w:p>
     <w:p>
       <w:pPr>
-        <w:pStyle w:val="NoSpacing"/>
-        <w:ind w:left="454"/>
-        <w:shd w:val="clear" w:color="auto" w:fill="F2F2F2"/>
+        <w:pStyle w:val="ListBullet"/>
       </w:pPr>
       <w:r>
-        <w:rPr>
-          <w:rFonts w:ascii="Courier New" w:hAnsi="Courier New"/>
-          <w:color w:val="C7254E"/>
-          <w:sz w:val="18"/>
-        </w:rPr>
-        <w:t># 1. Instalar dependencias del sistema</w:t>
+        <w:t>Instala pnpm y Node.js LTS en el directorio del usuario.</w:t>
       </w:r>
     </w:p>
     <w:p>
       <w:pPr>
-        <w:pStyle w:val="NoSpacing"/>
-        <w:ind w:left="454"/>
-        <w:shd w:val="clear" w:color="auto" w:fill="F2F2F2"/>
+        <w:pStyle w:val="ListBullet"/>
       </w:pPr>
       <w:r>
-        <w:rPr>
-          <w:rFonts w:ascii="Courier New" w:hAnsi="Courier New"/>
-          <w:color w:val="C7254E"/>
-          <w:sz w:val="18"/>
-        </w:rPr>
-        <w:t>sudo apt update &amp;&amp; sudo apt install -y ffmpeg git curl</w:t>
+        <w:t>Clona o actualiza el repositorio en ~/eqso-linux-client.</w:t>
       </w:r>
     </w:p>
     <w:p>
       <w:pPr>
-        <w:pStyle w:val="NoSpacing"/>
-        <w:ind w:left="454"/>
-        <w:shd w:val="clear" w:color="auto" w:fill="F2F2F2"/>
+        <w:pStyle w:val="ListBullet"/>
       </w:pPr>
       <w:r>
-        <w:rPr>
-          <w:rFonts w:ascii="Courier New" w:hAnsi="Courier New"/>
-          <w:color w:val="C7254E"/>
-          <w:sz w:val="18"/>
-        </w:rPr>
-        <w:t xml:space="preserve"> </w:t>
+        <w:t>Instala las dependencias y compila el relay daemon.</w:t>
       </w:r>
     </w:p>
     <w:p>
       <w:pPr>
-        <w:pStyle w:val="NoSpacing"/>
-        <w:ind w:left="454"/>
-        <w:shd w:val="clear" w:color="auto" w:fill="F2F2F2"/>
+        <w:pStyle w:val="ListBullet"/>
       </w:pPr>
       <w:r>
-        <w:rPr>
-          <w:rFonts w:ascii="Courier New" w:hAnsi="Courier New"/>
-          <w:color w:val="C7254E"/>
-          <w:sz w:val="18"/>
-        </w:rPr>
-        <w:t># 2. Instalar pnpm y Node.js LTS</w:t>
+        <w:t>Muestra las tarjetas de audio y los puertos serie disponibles.</w:t>
       </w:r>
     </w:p>
     <w:p>
       <w:pPr>
+        <w:pStyle w:val="ListBullet"/>
+      </w:pPr>
+      <w:r>
+        <w:t>Crea /etc/eqso-relay/&lt;SALA&gt;.json y configura el servicio systemd.</w:t>
+      </w:r>
+    </w:p>
+    <w:p>
+      <w:pPr>
+        <w:pStyle w:val="ListBullet"/>
+      </w:pPr>
+      <w:r>
+        <w:t>Activa y arranca eqso-relay@&lt;SALA&gt; y comprueba si queda activo.</w:t>
+      </w:r>
+    </w:p>
+    <w:p>
+      <w:pPr/>
+      <w:r>
+        <w:t>Durante las preguntas se solicita el callsign, el número de tarjeta ALSA, el puerto PTT opcional, el token, la sala, el servidor y el puerto. Los valores predeterminados son la sala CB, el servidor asorapa.sytes.net y el puerto 2172.</w:t>
+      </w:r>
+    </w:p>
+    <w:p>
+      <w:pPr>
+        <w:pStyle w:val="Heading2"/>
+      </w:pPr>
+      <w:r>
+        <w:t>2.2 Configuración de audio en Linux/Raspberry Pi</w:t>
+      </w:r>
+    </w:p>
+    <w:p>
+      <w:pPr/>
+      <w:r>
+        <w:t>El backend de Linux utiliza ALSA. La tarjeta seleccionada se convierte en un dispositivo plughw:X,0 y se utiliza tanto para capturar como para reproducir audio.</w:t>
+      </w:r>
+    </w:p>
+    <w:p>
+      <w:pPr>
         <w:pStyle w:val="NoSpacing"/>
-        <w:ind w:left="454"/>
-        <w:shd w:val="clear" w:color="auto" w:fill="F2F2F2"/>
       </w:pPr>
       <w:r>
         <w:rPr>
-          <w:rFonts w:ascii="Courier New" w:hAnsi="Courier New"/>
-          <w:color w:val="C7254E"/>
-          <w:sz w:val="18"/>
+          <w:rFonts w:ascii="Consolas" w:hAnsi="Consolas" w:eastAsia="Consolas"/>
+        </w:rPr>
+        <w:t>arecord -l    # tarjetas de captura</w:t>
+      </w:r>
+    </w:p>
+    <w:p>
+      <w:pPr>
+        <w:pStyle w:val="NoSpacing"/>
+      </w:pPr>
+      <w:r>
+        <w:rPr>
+          <w:rFonts w:ascii="Consolas" w:hAnsi="Consolas" w:eastAsia="Consolas"/>
+        </w:rPr>
+        <w:t>aplay -l      # tarjetas de reproducción</w:t>
+      </w:r>
+    </w:p>
+    <w:p>
+      <w:pPr/>
+      <w:r>
+        <w:t>En una Raspberry Pi, conecta primero la tarjeta USB y anota el número que aparece como card X. Sin cable PTT el relay puede recibir audio de la sala y reproducirlo, pero no podrá activar la transmisión RF.</w:t>
+      </w:r>
+    </w:p>
+    <w:p>
+      <w:pPr>
+        <w:pStyle w:val="Heading2"/>
+      </w:pPr>
+      <w:r>
+        <w:t>2.3 Instalación manual paso a paso</w:t>
+      </w:r>
+    </w:p>
+    <w:p>
+      <w:pPr>
+        <w:pStyle w:val="NoSpacing"/>
+      </w:pPr>
+      <w:r>
+        <w:rPr>
+          <w:rFonts w:ascii="Consolas" w:hAnsi="Consolas" w:eastAsia="Consolas"/>
+        </w:rPr>
+        <w:t>sudo apt update &amp;&amp; sudo apt install -y ffmpeg git curl alsa-utils</w:t>
+      </w:r>
+    </w:p>
+    <w:p>
+      <w:pPr>
+        <w:pStyle w:val="NoSpacing"/>
+      </w:pPr>
+      <w:r>
+        <w:rPr>
+          <w:rFonts w:ascii="Consolas" w:hAnsi="Consolas" w:eastAsia="Consolas"/>
         </w:rPr>
         <w:t>curl -fsSL https://get.pnpm.io/install.sh | sh -</w:t>
       </w:r>
@@ -480,14 +498,10 @@
     <w:p>
       <w:pPr>
         <w:pStyle w:val="NoSpacing"/>
-        <w:ind w:left="454"/>
-        <w:shd w:val="clear" w:color="auto" w:fill="F2F2F2"/>
       </w:pPr>
       <w:r>
         <w:rPr>
-          <w:rFonts w:ascii="Courier New" w:hAnsi="Courier New"/>
-          <w:color w:val="C7254E"/>
-          <w:sz w:val="18"/>
+          <w:rFonts w:ascii="Consolas" w:hAnsi="Consolas" w:eastAsia="Consolas"/>
         </w:rPr>
         <w:t>source ~/.bashrc</w:t>
       </w:r>
@@ -495,14 +509,10 @@
     <w:p>
       <w:pPr>
         <w:pStyle w:val="NoSpacing"/>
-        <w:ind w:left="454"/>
-        <w:shd w:val="clear" w:color="auto" w:fill="F2F2F2"/>
       </w:pPr>
       <w:r>
         <w:rPr>
-          <w:rFonts w:ascii="Courier New" w:hAnsi="Courier New"/>
-          <w:color w:val="C7254E"/>
-          <w:sz w:val="18"/>
+          <w:rFonts w:ascii="Consolas" w:hAnsi="Consolas" w:eastAsia="Consolas"/>
         </w:rPr>
         <w:t>pnpm env use --global lts</w:t>
       </w:r>
@@ -510,104 +520,32 @@
     <w:p>
       <w:pPr>
         <w:pStyle w:val="NoSpacing"/>
-        <w:ind w:left="454"/>
-        <w:shd w:val="clear" w:color="auto" w:fill="F2F2F2"/>
       </w:pPr>
       <w:r>
         <w:rPr>
-          <w:rFonts w:ascii="Courier New" w:hAnsi="Courier New"/>
-          <w:color w:val="C7254E"/>
-          <w:sz w:val="18"/>
+          <w:rFonts w:ascii="Consolas" w:hAnsi="Consolas" w:eastAsia="Consolas"/>
         </w:rPr>
-        <w:t xml:space="preserve"> </w:t>
+        <w:t>git clone https://github.com/daycart/eqso-linux-client</w:t>
       </w:r>
     </w:p>
     <w:p>
       <w:pPr>
         <w:pStyle w:val="NoSpacing"/>
-        <w:ind w:left="454"/>
-        <w:shd w:val="clear" w:color="auto" w:fill="F2F2F2"/>
       </w:pPr>
       <w:r>
         <w:rPr>
-          <w:rFonts w:ascii="Courier New" w:hAnsi="Courier New"/>
-          <w:color w:val="C7254E"/>
-          <w:sz w:val="18"/>
+          <w:rFonts w:ascii="Consolas" w:hAnsi="Consolas" w:eastAsia="Consolas"/>
         </w:rPr>
-        <w:t># 3. Clonar el repositorio</w:t>
+        <w:t>cd eqso-linux-client</w:t>
       </w:r>
     </w:p>
     <w:p>
       <w:pPr>
         <w:pStyle w:val="NoSpacing"/>
-        <w:ind w:left="454"/>
-        <w:shd w:val="clear" w:color="auto" w:fill="F2F2F2"/>
       </w:pPr>
       <w:r>
         <w:rPr>
-          <w:rFonts w:ascii="Courier New" w:hAnsi="Courier New"/>
-          <w:color w:val="C7254E"/>
-          <w:sz w:val="18"/>
-        </w:rPr>
-        <w:t>git clone https://github.com/daycart/eqso-linux</w:t>
-      </w:r>
-    </w:p>
-    <w:p>
-      <w:pPr>
-        <w:pStyle w:val="NoSpacing"/>
-        <w:ind w:left="454"/>
-        <w:shd w:val="clear" w:color="auto" w:fill="F2F2F2"/>
-      </w:pPr>
-      <w:r>
-        <w:rPr>
-          <w:rFonts w:ascii="Courier New" w:hAnsi="Courier New"/>
-          <w:color w:val="C7254E"/>
-          <w:sz w:val="18"/>
-        </w:rPr>
-        <w:t>cd eqso-linux</w:t>
-      </w:r>
-    </w:p>
-    <w:p>
-      <w:pPr>
-        <w:pStyle w:val="NoSpacing"/>
-        <w:ind w:left="454"/>
-        <w:shd w:val="clear" w:color="auto" w:fill="F2F2F2"/>
-      </w:pPr>
-      <w:r>
-        <w:rPr>
-          <w:rFonts w:ascii="Courier New" w:hAnsi="Courier New"/>
-          <w:color w:val="C7254E"/>
-          <w:sz w:val="18"/>
-        </w:rPr>
-        <w:t xml:space="preserve"> </w:t>
-      </w:r>
-    </w:p>
-    <w:p>
-      <w:pPr>
-        <w:pStyle w:val="NoSpacing"/>
-        <w:ind w:left="454"/>
-        <w:shd w:val="clear" w:color="auto" w:fill="F2F2F2"/>
-      </w:pPr>
-      <w:r>
-        <w:rPr>
-          <w:rFonts w:ascii="Courier New" w:hAnsi="Courier New"/>
-          <w:color w:val="C7254E"/>
-          <w:sz w:val="18"/>
-        </w:rPr>
-        <w:t># 4. Instalar dependencias y compilar</w:t>
-      </w:r>
-    </w:p>
-    <w:p>
-      <w:pPr>
-        <w:pStyle w:val="NoSpacing"/>
-        <w:ind w:left="454"/>
-        <w:shd w:val="clear" w:color="auto" w:fill="F2F2F2"/>
-      </w:pPr>
-      <w:r>
-        <w:rPr>
-          <w:rFonts w:ascii="Courier New" w:hAnsi="Courier New"/>
-          <w:color w:val="C7254E"/>
-          <w:sz w:val="18"/>
+          <w:rFonts w:ascii="Consolas" w:hAnsi="Consolas" w:eastAsia="Consolas"/>
         </w:rPr>
         <w:t>pnpm install</w:t>
       </w:r>
@@ -615,14 +553,10 @@
     <w:p>
       <w:pPr>
         <w:pStyle w:val="NoSpacing"/>
-        <w:ind w:left="454"/>
-        <w:shd w:val="clear" w:color="auto" w:fill="F2F2F2"/>
       </w:pPr>
       <w:r>
         <w:rPr>
-          <w:rFonts w:ascii="Courier New" w:hAnsi="Courier New"/>
-          <w:color w:val="C7254E"/>
-          <w:sz w:val="18"/>
+          <w:rFonts w:ascii="Consolas" w:hAnsi="Consolas" w:eastAsia="Consolas"/>
         </w:rPr>
         <w:t>pnpm --filter @workspace/relay-daemon run build</w:t>
       </w:r>
@@ -630,134 +564,43 @@
     <w:p>
       <w:pPr>
         <w:pStyle w:val="NoSpacing"/>
-        <w:ind w:left="454"/>
-        <w:shd w:val="clear" w:color="auto" w:fill="F2F2F2"/>
       </w:pPr>
       <w:r>
         <w:rPr>
-          <w:rFonts w:ascii="Courier New" w:hAnsi="Courier New"/>
-          <w:color w:val="C7254E"/>
-          <w:sz w:val="18"/>
+          <w:rFonts w:ascii="Consolas" w:hAnsi="Consolas" w:eastAsia="Consolas"/>
         </w:rPr>
-        <w:t xml:space="preserve"> </w:t>
+        <w:t>arecord -l    # identificar la tarjeta de captura</w:t>
       </w:r>
     </w:p>
     <w:p>
       <w:pPr>
         <w:pStyle w:val="NoSpacing"/>
-        <w:ind w:left="454"/>
-        <w:shd w:val="clear" w:color="auto" w:fill="F2F2F2"/>
       </w:pPr>
       <w:r>
         <w:rPr>
-          <w:rFonts w:ascii="Courier New" w:hAnsi="Courier New"/>
-          <w:color w:val="C7254E"/>
-          <w:sz w:val="18"/>
+          <w:rFonts w:ascii="Consolas" w:hAnsi="Consolas" w:eastAsia="Consolas"/>
         </w:rPr>
-        <w:t># 5. Identificar la tarjeta de audio USB</w:t>
+        <w:t>aplay -l      # identificar la tarjeta de reproducción</w:t>
       </w:r>
     </w:p>
     <w:p>
       <w:pPr>
         <w:pStyle w:val="NoSpacing"/>
-        <w:ind w:left="454"/>
-        <w:shd w:val="clear" w:color="auto" w:fill="F2F2F2"/>
       </w:pPr>
       <w:r>
         <w:rPr>
-          <w:rFonts w:ascii="Courier New" w:hAnsi="Courier New"/>
-          <w:color w:val="C7254E"/>
-          <w:sz w:val="18"/>
+          <w:rFonts w:ascii="Consolas" w:hAnsi="Consolas" w:eastAsia="Consolas"/>
         </w:rPr>
-        <w:t>aplay -l    # buscar "plughw:X,0" donde X es el número de tarjeta</w:t>
+        <w:t>ls /dev/ttyACM* /dev/ttyUSB* 2&gt;/dev/null    # identificar el PTT</w:t>
       </w:r>
     </w:p>
     <w:p>
       <w:pPr>
         <w:pStyle w:val="NoSpacing"/>
-        <w:ind w:left="454"/>
-        <w:shd w:val="clear" w:color="auto" w:fill="F2F2F2"/>
       </w:pPr>
       <w:r>
         <w:rPr>
-          <w:rFonts w:ascii="Courier New" w:hAnsi="Courier New"/>
-          <w:color w:val="C7254E"/>
-          <w:sz w:val="18"/>
-        </w:rPr>
-        <w:t xml:space="preserve"> </w:t>
-      </w:r>
-    </w:p>
-    <w:p>
-      <w:pPr>
-        <w:pStyle w:val="NoSpacing"/>
-        <w:ind w:left="454"/>
-        <w:shd w:val="clear" w:color="auto" w:fill="F2F2F2"/>
-      </w:pPr>
-      <w:r>
-        <w:rPr>
-          <w:rFonts w:ascii="Courier New" w:hAnsi="Courier New"/>
-          <w:color w:val="C7254E"/>
-          <w:sz w:val="18"/>
-        </w:rPr>
-        <w:t># 6. Identificar el puerto serie (PTT)</w:t>
-      </w:r>
-    </w:p>
-    <w:p>
-      <w:pPr>
-        <w:pStyle w:val="NoSpacing"/>
-        <w:ind w:left="454"/>
-        <w:shd w:val="clear" w:color="auto" w:fill="F2F2F2"/>
-      </w:pPr>
-      <w:r>
-        <w:rPr>
-          <w:rFonts w:ascii="Courier New" w:hAnsi="Courier New"/>
-          <w:color w:val="C7254E"/>
-          <w:sz w:val="18"/>
-        </w:rPr>
-        <w:t>ls /dev/ttyACM* /dev/ttyUSB*</w:t>
-      </w:r>
-    </w:p>
-    <w:p>
-      <w:pPr>
-        <w:pStyle w:val="NoSpacing"/>
-        <w:ind w:left="454"/>
-        <w:shd w:val="clear" w:color="auto" w:fill="F2F2F2"/>
-      </w:pPr>
-      <w:r>
-        <w:rPr>
-          <w:rFonts w:ascii="Courier New" w:hAnsi="Courier New"/>
-          <w:color w:val="C7254E"/>
-          <w:sz w:val="18"/>
-        </w:rPr>
-        <w:t xml:space="preserve"> </w:t>
-      </w:r>
-    </w:p>
-    <w:p>
-      <w:pPr>
-        <w:pStyle w:val="NoSpacing"/>
-        <w:ind w:left="454"/>
-        <w:shd w:val="clear" w:color="auto" w:fill="F2F2F2"/>
-      </w:pPr>
-      <w:r>
-        <w:rPr>
-          <w:rFonts w:ascii="Courier New" w:hAnsi="Courier New"/>
-          <w:color w:val="C7254E"/>
-          <w:sz w:val="18"/>
-        </w:rPr>
-        <w:t># 7. Crear el archivo de configuración</w:t>
-      </w:r>
-    </w:p>
-    <w:p>
-      <w:pPr>
-        <w:pStyle w:val="NoSpacing"/>
-        <w:ind w:left="454"/>
-        <w:shd w:val="clear" w:color="auto" w:fill="F2F2F2"/>
-      </w:pPr>
-      <w:r>
-        <w:rPr>
-          <w:rFonts w:ascii="Courier New" w:hAnsi="Courier New"/>
-          <w:color w:val="C7254E"/>
-          <w:sz w:val="18"/>
+          <w:rFonts w:ascii="Consolas" w:hAnsi="Consolas" w:eastAsia="Consolas"/>
         </w:rPr>
         <w:t>sudo mkdir -p /etc/eqso-relay</w:t>
       </w:r>
@@ -765,14 +608,10 @@
     <w:p>
       <w:pPr>
         <w:pStyle w:val="NoSpacing"/>
-        <w:ind w:left="454"/>
-        <w:shd w:val="clear" w:color="auto" w:fill="F2F2F2"/>
       </w:pPr>
       <w:r>
         <w:rPr>
-          <w:rFonts w:ascii="Courier New" w:hAnsi="Courier New"/>
-          <w:color w:val="C7254E"/>
-          <w:sz w:val="18"/>
+          <w:rFonts w:ascii="Consolas" w:hAnsi="Consolas" w:eastAsia="Consolas"/>
         </w:rPr>
         <w:t>sudo cp artifacts/relay-daemon/install/config.example.json /etc/eqso-relay/CB.json</w:t>
       </w:r>
@@ -780,14 +619,10 @@
     <w:p>
       <w:pPr>
         <w:pStyle w:val="NoSpacing"/>
-        <w:ind w:left="454"/>
-        <w:shd w:val="clear" w:color="auto" w:fill="F2F2F2"/>
       </w:pPr>
       <w:r>
         <w:rPr>
-          <w:rFonts w:ascii="Courier New" w:hAnsi="Courier New"/>
-          <w:color w:val="C7254E"/>
-          <w:sz w:val="18"/>
+          <w:rFonts w:ascii="Consolas" w:hAnsi="Consolas" w:eastAsia="Consolas"/>
         </w:rPr>
         <w:t>sudo nano /etc/eqso-relay/CB.json</w:t>
       </w:r>
@@ -795,44 +630,10 @@
     <w:p>
       <w:pPr>
         <w:pStyle w:val="NoSpacing"/>
-        <w:ind w:left="454"/>
-        <w:shd w:val="clear" w:color="auto" w:fill="F2F2F2"/>
       </w:pPr>
       <w:r>
         <w:rPr>
-          <w:rFonts w:ascii="Courier New" w:hAnsi="Courier New"/>
-          <w:color w:val="C7254E"/>
-          <w:sz w:val="18"/>
-        </w:rPr>
-        <w:t xml:space="preserve"> </w:t>
-      </w:r>
-    </w:p>
-    <w:p>
-      <w:pPr>
-        <w:pStyle w:val="NoSpacing"/>
-        <w:ind w:left="454"/>
-        <w:shd w:val="clear" w:color="auto" w:fill="F2F2F2"/>
-      </w:pPr>
-      <w:r>
-        <w:rPr>
-          <w:rFonts w:ascii="Courier New" w:hAnsi="Courier New"/>
-          <w:color w:val="C7254E"/>
-          <w:sz w:val="18"/>
-        </w:rPr>
-        <w:t># 8. Instalar el servicio systemd</w:t>
-      </w:r>
-    </w:p>
-    <w:p>
-      <w:pPr>
-        <w:pStyle w:val="NoSpacing"/>
-        <w:ind w:left="454"/>
-        <w:shd w:val="clear" w:color="auto" w:fill="F2F2F2"/>
-      </w:pPr>
-      <w:r>
-        <w:rPr>
-          <w:rFonts w:ascii="Courier New" w:hAnsi="Courier New"/>
-          <w:color w:val="C7254E"/>
-          <w:sz w:val="18"/>
+          <w:rFonts w:ascii="Consolas" w:hAnsi="Consolas" w:eastAsia="Consolas"/>
         </w:rPr>
         <w:t>sudo cp artifacts/relay-daemon/install/eqso-relay@.service /etc/systemd/system/</w:t>
       </w:r>
@@ -840,14 +641,10 @@
     <w:p>
       <w:pPr>
         <w:pStyle w:val="NoSpacing"/>
-        <w:ind w:left="454"/>
-        <w:shd w:val="clear" w:color="auto" w:fill="F2F2F2"/>
       </w:pPr>
       <w:r>
         <w:rPr>
-          <w:rFonts w:ascii="Courier New" w:hAnsi="Courier New"/>
-          <w:color w:val="C7254E"/>
-          <w:sz w:val="18"/>
+          <w:rFonts w:ascii="Consolas" w:hAnsi="Consolas" w:eastAsia="Consolas"/>
         </w:rPr>
         <w:t>sudo systemctl daemon-reload</w:t>
       </w:r>
@@ -855,101 +652,40 @@
     <w:p>
       <w:pPr>
         <w:pStyle w:val="NoSpacing"/>
-        <w:ind w:left="454"/>
-        <w:shd w:val="clear" w:color="auto" w:fill="F2F2F2"/>
       </w:pPr>
       <w:r>
         <w:rPr>
-          <w:rFonts w:ascii="Courier New" w:hAnsi="Courier New"/>
-          <w:color w:val="C7254E"/>
-          <w:sz w:val="18"/>
+          <w:rFonts w:ascii="Consolas" w:hAnsi="Consolas" w:eastAsia="Consolas"/>
         </w:rPr>
         <w:t>sudo systemctl enable --now eqso-relay@CB</w:t>
       </w:r>
     </w:p>
     <w:p>
       <w:pPr>
-        <w:pStyle w:val="NoSpacing"/>
-        <w:ind w:left="454"/>
-        <w:shd w:val="clear" w:color="auto" w:fill="F2F2F2"/>
+        <w:pStyle w:val="Heading2"/>
       </w:pPr>
       <w:r>
-        <w:rPr>
-          <w:rFonts w:ascii="Courier New" w:hAnsi="Courier New"/>
-          <w:color w:val="C7254E"/>
-          <w:sz w:val="18"/>
-        </w:rPr>
-        <w:t xml:space="preserve"> </w:t>
+        <w:t>2.4 Actualizar y administrar el servicio Linux/Raspberry Pi</w:t>
       </w:r>
     </w:p>
     <w:p>
       <w:pPr>
         <w:pStyle w:val="NoSpacing"/>
-        <w:ind w:left="454"/>
-        <w:shd w:val="clear" w:color="auto" w:fill="F2F2F2"/>
       </w:pPr>
       <w:r>
         <w:rPr>
-          <w:rFonts w:ascii="Courier New" w:hAnsi="Courier New"/>
-          <w:color w:val="C7254E"/>
-          <w:sz w:val="18"/>
+          <w:rFonts w:ascii="Consolas" w:hAnsi="Consolas" w:eastAsia="Consolas"/>
         </w:rPr>
-        <w:t># 9. Ver logs en tiempo real</w:t>
+        <w:t>cd ~/eqso-linux-client</w:t>
       </w:r>
     </w:p>
     <w:p>
       <w:pPr>
         <w:pStyle w:val="NoSpacing"/>
-        <w:ind w:left="454"/>
-        <w:shd w:val="clear" w:color="auto" w:fill="F2F2F2"/>
       </w:pPr>
       <w:r>
         <w:rPr>
-          <w:rFonts w:ascii="Courier New" w:hAnsi="Courier New"/>
-          <w:color w:val="C7254E"/>
-          <w:sz w:val="18"/>
-        </w:rPr>
-        <w:t>sudo journalctl -u eqso-relay@CB -f</w:t>
-      </w:r>
-    </w:p>
-    <w:p/>
-    <w:p>
-      <w:pPr>
-        <w:pStyle w:val="Heading2"/>
-      </w:pPr>
-      <w:r>
-        <w:rPr>
-          <w:color w:val="2E74B5"/>
-        </w:rPr>
-        <w:t>2.3 Actualizar a nueva versión</w:t>
-      </w:r>
-    </w:p>
-    <w:p>
-      <w:pPr>
-        <w:pStyle w:val="NoSpacing"/>
-        <w:ind w:left="454"/>
-        <w:shd w:val="clear" w:color="auto" w:fill="F2F2F2"/>
-      </w:pPr>
-      <w:r>
-        <w:rPr>
-          <w:rFonts w:ascii="Courier New" w:hAnsi="Courier New"/>
-          <w:color w:val="C7254E"/>
-          <w:sz w:val="18"/>
-        </w:rPr>
-        <w:t>cd ~/eqso-linux</w:t>
-      </w:r>
-    </w:p>
-    <w:p>
-      <w:pPr>
-        <w:pStyle w:val="NoSpacing"/>
-        <w:ind w:left="454"/>
-        <w:shd w:val="clear" w:color="auto" w:fill="F2F2F2"/>
-      </w:pPr>
-      <w:r>
-        <w:rPr>
-          <w:rFonts w:ascii="Courier New" w:hAnsi="Courier New"/>
-          <w:color w:val="C7254E"/>
-          <w:sz w:val="18"/>
+          <w:rFonts w:ascii="Consolas" w:hAnsi="Consolas" w:eastAsia="Consolas"/>
         </w:rPr>
         <w:t>git pull</w:t>
       </w:r>
@@ -957,14 +693,10 @@
     <w:p>
       <w:pPr>
         <w:pStyle w:val="NoSpacing"/>
-        <w:ind w:left="454"/>
-        <w:shd w:val="clear" w:color="auto" w:fill="F2F2F2"/>
       </w:pPr>
       <w:r>
         <w:rPr>
-          <w:rFonts w:ascii="Courier New" w:hAnsi="Courier New"/>
-          <w:color w:val="C7254E"/>
-          <w:sz w:val="18"/>
+          <w:rFonts w:ascii="Consolas" w:hAnsi="Consolas" w:eastAsia="Consolas"/>
         </w:rPr>
         <w:t>pnpm install</w:t>
       </w:r>
@@ -972,14 +704,10 @@
     <w:p>
       <w:pPr>
         <w:pStyle w:val="NoSpacing"/>
-        <w:ind w:left="454"/>
-        <w:shd w:val="clear" w:color="auto" w:fill="F2F2F2"/>
       </w:pPr>
       <w:r>
         <w:rPr>
-          <w:rFonts w:ascii="Courier New" w:hAnsi="Courier New"/>
-          <w:color w:val="C7254E"/>
-          <w:sz w:val="18"/>
+          <w:rFonts w:ascii="Consolas" w:hAnsi="Consolas" w:eastAsia="Consolas"/>
         </w:rPr>
         <w:t>pnpm --filter @workspace/relay-daemon run build</w:t>
       </w:r>
@@ -987,31 +715,80 @@
     <w:p>
       <w:pPr>
         <w:pStyle w:val="NoSpacing"/>
-        <w:ind w:left="454"/>
-        <w:shd w:val="clear" w:color="auto" w:fill="F2F2F2"/>
       </w:pPr>
       <w:r>
         <w:rPr>
-          <w:rFonts w:ascii="Courier New" w:hAnsi="Courier New"/>
-          <w:color w:val="C7254E"/>
-          <w:sz w:val="18"/>
+          <w:rFonts w:ascii="Consolas" w:hAnsi="Consolas" w:eastAsia="Consolas"/>
         </w:rPr>
         <w:t>sudo systemctl restart eqso-relay@CB</w:t>
       </w:r>
     </w:p>
     <w:p>
+      <w:pPr/>
       <w:r>
-        <w:br w:type="page"/>
+        <w:t>La configuración está en /etc/eqso-relay/CB.json. Después de modificarla, reinicia el servicio para aplicar los cambios.</w:t>
       </w:r>
     </w:p>
     <w:p>
       <w:pPr>
-        <w:pStyle w:val="Heading1"/>
+        <w:pStyle w:val="NoSpacing"/>
       </w:pPr>
       <w:r>
         <w:rPr>
-          <w:color w:val="1F497D"/>
+          <w:rFonts w:ascii="Consolas" w:hAnsi="Consolas" w:eastAsia="Consolas"/>
         </w:rPr>
+        <w:t>sudo systemctl status eqso-relay@CB</w:t>
+      </w:r>
+    </w:p>
+    <w:p>
+      <w:pPr>
+        <w:pStyle w:val="NoSpacing"/>
+      </w:pPr>
+      <w:r>
+        <w:rPr>
+          <w:rFonts w:ascii="Consolas" w:hAnsi="Consolas" w:eastAsia="Consolas"/>
+        </w:rPr>
+        <w:t>sudo journalctl -u eqso-relay@CB -f</w:t>
+      </w:r>
+    </w:p>
+    <w:p>
+      <w:pPr>
+        <w:pStyle w:val="NoSpacing"/>
+      </w:pPr>
+      <w:r>
+        <w:rPr>
+          <w:rFonts w:ascii="Consolas" w:hAnsi="Consolas" w:eastAsia="Consolas"/>
+        </w:rPr>
+        <w:t>sudo systemctl stop eqso-relay@CB</w:t>
+      </w:r>
+    </w:p>
+    <w:p>
+      <w:pPr>
+        <w:pStyle w:val="NoSpacing"/>
+      </w:pPr>
+      <w:r>
+        <w:rPr>
+          <w:rFonts w:ascii="Consolas" w:hAnsi="Consolas" w:eastAsia="Consolas"/>
+        </w:rPr>
+        <w:t>sudo systemctl restart eqso-relay@CB</w:t>
+      </w:r>
+    </w:p>
+    <w:p>
+      <w:pPr>
+        <w:pStyle w:val="NoSpacing"/>
+      </w:pPr>
+      <w:r>
+        <w:rPr>
+          <w:rFonts w:ascii="Consolas" w:hAnsi="Consolas" w:eastAsia="Consolas"/>
+        </w:rPr>
+        <w:t>curl http://127.0.0.1:8009/status</w:t>
+      </w:r>
+    </w:p>
+    <w:p>
+      <w:pPr>
+        <w:pStyle w:val="Heading1"/>
+      </w:pPr>
+      <w:r>
         <w:t>3. Instalación en Windows 10/11</w:t>
       </w:r>
     </w:p>
@@ -1020,84 +797,67 @@
         <w:pStyle w:val="Heading2"/>
       </w:pPr>
       <w:r>
-        <w:rPr>
-          <w:color w:val="2E74B5"/>
-        </w:rPr>
-        <w:t>3.1 Script automático PowerShell (recomendado)</w:t>
+        <w:t>3.1 Lanzador de doble clic (recomendado)</w:t>
       </w:r>
     </w:p>
     <w:p>
+      <w:pPr/>
       <w:r>
-        <w:t>Abrir PowerShell como Administrador y ejecutar:</w:t>
+        <w:t>Descarga install-relay-windows.cmd desde la carpeta de instalación del repositorio:</w:t>
       </w:r>
     </w:p>
     <w:p>
       <w:pPr>
         <w:pStyle w:val="NoSpacing"/>
-        <w:ind w:left="454"/>
-        <w:shd w:val="clear" w:color="auto" w:fill="F2F2F2"/>
       </w:pPr>
       <w:r>
         <w:rPr>
-          <w:rFonts w:ascii="Courier New" w:hAnsi="Courier New"/>
-          <w:color w:val="C7254E"/>
-          <w:sz w:val="18"/>
+          <w:rFonts w:ascii="Consolas" w:hAnsi="Consolas" w:eastAsia="Consolas"/>
         </w:rPr>
-        <w:t>irm https://raw.githubusercontent.com/daycart/eqso-linux/main/artifacts/relay-daemon/install/install-relay.ps1 | iex</w:t>
-      </w:r>
-    </w:p>
-    <w:p/>
-    <w:p>
-      <w:r>
-        <w:t>El script realiza automáticamente:</w:t>
+        <w:t>https://github.com/daycart/eqso-linux/tree/test/windows-relay-installer/artifacts/relay-daemon/install</w:t>
       </w:r>
     </w:p>
     <w:p>
-      <w:pPr>
-        <w:pStyle w:val="ListBullet"/>
-      </w:pPr>
+      <w:pPr/>
       <w:r>
-        <w:t>Instala git, Node.js LTS y ffmpeg vía winget si no están presentes.</w:t>
+        <w:t>Abre el archivo con doble clic. El lanzador solicita permisos de Administrador, utiliza install-relay.ps1 si está en la misma carpeta y, si se descarga solo, obtiene el script automáticamente desde GitHub. No es necesario escribir comandos en PowerShell.</w:t>
       </w:r>
     </w:p>
     <w:p>
-      <w:pPr>
-        <w:pStyle w:val="ListBullet"/>
-      </w:pPr>
+      <w:pPr/>
       <w:r>
-        <w:t>Instala pnpm vía npm.</w:t>
+        <w:t>Si el navegador guarda el archivo como install-relay-windows.cmd.txt, activa Ver → Mostrar → Extensiones de nombre de archivo en el Explorador y renómbralo para que termine exactamente en .cmd. También se pueden descargar ambos archivos juntos desde la carpeta del repositorio.</w:t>
       </w:r>
     </w:p>
     <w:p>
-      <w:pPr>
-        <w:pStyle w:val="ListBullet"/>
-      </w:pPr>
+      <w:pPr/>
       <w:r>
-        <w:t>Clona o actualiza el repositorio en %USERPROFILE%\eqso-linux.</w:t>
+        <w:t>Como alternativa, puede ejecutarse PowerShell como Administrador con:</w:t>
       </w:r>
     </w:p>
     <w:p>
       <w:pPr>
-        <w:pStyle w:val="ListBullet"/>
+        <w:pStyle w:val="NoSpacing"/>
       </w:pPr>
       <w:r>
-        <w:t>Compila el relay daemon (backend ffmpeg para Windows).</w:t>
+        <w:rPr>
+          <w:rFonts w:ascii="Consolas" w:hAnsi="Consolas" w:eastAsia="Consolas"/>
+        </w:rPr>
+        <w:t>irm https://raw.githubusercontent.com/daycart/eqso-linux/test/windows-relay-installer/artifacts/relay-daemon/install/install-relay.ps1 | iex</w:t>
       </w:r>
     </w:p>
     <w:p>
       <w:pPr>
-        <w:pStyle w:val="ListBullet"/>
+        <w:pStyle w:val="Heading2"/>
       </w:pPr>
       <w:r>
-        <w:t>Lista los dispositivos de audio dshow y puertos COM disponibles.</w:t>
+        <w:t>3.2 Modos PC físico y máquina virtual</w:t>
       </w:r>
     </w:p>
     <w:p>
-      <w:pPr>
-        <w:pStyle w:val="ListBullet"/>
-      </w:pPr>
+      <w:pPr/>
       <w:r>
-        <w:t>Pregunta callsign, sala, servidor, token y dispositivos.</w:t>
+        <w:t>Al comenzar, el instalador pregunta el tipo de equipo. La opción predeterminada es la máquina virtual para evitar abrir dispositivos de audio accidentalmente.</w:t>
       </w:r>
     </w:p>
     <w:p>
@@ -1105,7 +865,7 @@
         <w:pStyle w:val="ListBullet"/>
       </w:pPr>
       <w:r>
-        <w:t>Crea C:\eqso-relay\&lt;SALA&gt;.json con la configuración.</w:t>
+        <w:t>PC físico — seleccionar 1: instala las dependencias con winget, compila, prueba la captura DirectShow y la reproducción FFplay, arranca el relay y activa el inicio automático de sesión.</w:t>
       </w:r>
     </w:p>
     <w:p>
@@ -1113,47 +873,100 @@
         <w:pStyle w:val="ListBullet"/>
       </w:pPr>
       <w:r>
-        <w:t>Registra una tarea programada de Windows que arranca el relay al iniciar sesión y se reinicia si falla.</w:t>
-      </w:r>
-    </w:p>
-    <w:p/>
-    <w:p>
-      <w:pPr>
-        <w:pStyle w:val="Heading2"/>
-      </w:pPr>
-      <w:r>
-        <w:rPr>
-          <w:color w:val="2E74B5"/>
-        </w:rPr>
-        <w:t>3.2 Comandos de gestión en Windows</w:t>
+        <w:t>Máquina virtual — seleccionar 2: instala y configura, pero no abre los dispositivos de audio, no arranca el relay y deja desactivado el inicio automático. Es el modo recomendado para VirtualBox con passthrough USB.</w:t>
       </w:r>
     </w:p>
     <w:p>
-      <w:pPr>
-        <w:pStyle w:val="NoSpacing"/>
-        <w:ind w:left="454"/>
-        <w:shd w:val="clear" w:color="auto" w:fill="F2F2F2"/>
-      </w:pPr>
+      <w:pPr/>
       <w:r>
-        <w:rPr>
-          <w:rFonts w:ascii="Courier New" w:hAnsi="Courier New"/>
-          <w:color w:val="C7254E"/>
-          <w:sz w:val="18"/>
-        </w:rPr>
-        <w:t># Ver logs en tiempo real</w:t>
+        <w:t>Windows utiliza DirectShow para capturar y FFplay/SDL para reproducir. La entrada y la salida de audio se seleccionan por separado. No se debe utilizar wasapi como formato de salida de FFmpeg.</w:t>
       </w:r>
     </w:p>
     <w:p>
       <w:pPr>
+        <w:pStyle w:val="Heading2"/>
+      </w:pPr>
+      <w:r>
+        <w:t>3.3 Qué instala y configura el instalador Windows</w:t>
+      </w:r>
+    </w:p>
+    <w:p>
+      <w:pPr>
+        <w:pStyle w:val="ListBullet"/>
+      </w:pPr>
+      <w:r>
+        <w:t>Instala Git, Node.js LTS y FFmpeg/FFplay mediante winget si no están disponibles.</w:t>
+      </w:r>
+    </w:p>
+    <w:p>
+      <w:pPr>
+        <w:pStyle w:val="ListBullet"/>
+      </w:pPr>
+      <w:r>
+        <w:t>Clona o actualiza el repositorio en %USERPROFILE%\eqso-linux y compila el relay daemon.</w:t>
+      </w:r>
+    </w:p>
+    <w:p>
+      <w:pPr>
+        <w:pStyle w:val="ListBullet"/>
+      </w:pPr>
+      <w:r>
+        <w:t>Lista las entradas DirectShow, las salidas de audio Windows y los puertos COM.</w:t>
+      </w:r>
+    </w:p>
+    <w:p>
+      <w:pPr>
+        <w:pStyle w:val="ListBullet"/>
+      </w:pPr>
+      <w:r>
+        <w:t>Solicita callsign, entrada de captura, salida de reproducción, puerto PTT, token, sala, servidor y puerto.</w:t>
+      </w:r>
+    </w:p>
+    <w:p>
+      <w:pPr>
+        <w:pStyle w:val="ListBullet"/>
+      </w:pPr>
+      <w:r>
+        <w:t>Genera C:\eqso-relay\&lt;SALA&gt;.json en UTF-8 sin BOM y valida el JSON.</w:t>
+      </w:r>
+    </w:p>
+    <w:p>
+      <w:pPr>
+        <w:pStyle w:val="ListBullet"/>
+      </w:pPr>
+      <w:r>
+        <w:t>Crea C:\eqso-relay\start-&lt;SALA&gt;.cmd y la tarea programada eQSO Relay &lt;SALA&gt;.</w:t>
+      </w:r>
+    </w:p>
+    <w:p>
+      <w:pPr>
+        <w:pStyle w:val="ListBullet"/>
+      </w:pPr>
+      <w:r>
+        <w:t>La tarea se reinicia automáticamente si el proceso falla. En PC físico se inicia inmediatamente; en VM queda registrada pero detenida.</w:t>
+      </w:r>
+    </w:p>
+    <w:p>
+      <w:pPr>
+        <w:pStyle w:val="Heading2"/>
+      </w:pPr>
+      <w:r>
+        <w:t>3.4 Administración y actualización en Windows</w:t>
+      </w:r>
+    </w:p>
+    <w:p>
+      <w:pPr/>
+      <w:r>
+        <w:t>El log de la tarea se guarda en C:\eqso-relay\relay-&lt;SALA&gt;.log. Sustituye CB por el nombre real de la sala.</w:t>
+      </w:r>
+    </w:p>
+    <w:p>
+      <w:pPr>
         <w:pStyle w:val="NoSpacing"/>
-        <w:ind w:left="454"/>
-        <w:shd w:val="clear" w:color="auto" w:fill="F2F2F2"/>
       </w:pPr>
       <w:r>
         <w:rPr>
-          <w:rFonts w:ascii="Courier New" w:hAnsi="Courier New"/>
-          <w:color w:val="C7254E"/>
-          <w:sz w:val="18"/>
+          <w:rFonts w:ascii="Consolas" w:hAnsi="Consolas" w:eastAsia="Consolas"/>
         </w:rPr>
         <w:t>Get-Content "C:\eqso-relay\relay-CB.log" -Wait -Tail 20</w:t>
       </w:r>
@@ -1161,89 +974,21 @@
     <w:p>
       <w:pPr>
         <w:pStyle w:val="NoSpacing"/>
-        <w:ind w:left="454"/>
-        <w:shd w:val="clear" w:color="auto" w:fill="F2F2F2"/>
       </w:pPr>
       <w:r>
         <w:rPr>
-          <w:rFonts w:ascii="Courier New" w:hAnsi="Courier New"/>
-          <w:color w:val="C7254E"/>
-          <w:sz w:val="18"/>
+          <w:rFonts w:ascii="Consolas" w:hAnsi="Consolas" w:eastAsia="Consolas"/>
         </w:rPr>
-        <w:t xml:space="preserve"> </w:t>
+        <w:t>Stop-ScheduledTask -TaskName "eQSO Relay CB"</w:t>
       </w:r>
     </w:p>
     <w:p>
       <w:pPr>
         <w:pStyle w:val="NoSpacing"/>
-        <w:ind w:left="454"/>
-        <w:shd w:val="clear" w:color="auto" w:fill="F2F2F2"/>
       </w:pPr>
       <w:r>
         <w:rPr>
-          <w:rFonts w:ascii="Courier New" w:hAnsi="Courier New"/>
-          <w:color w:val="C7254E"/>
-          <w:sz w:val="18"/>
-        </w:rPr>
-        <w:t># Parar el relay</w:t>
-      </w:r>
-    </w:p>
-    <w:p>
-      <w:pPr>
-        <w:pStyle w:val="NoSpacing"/>
-        <w:ind w:left="454"/>
-        <w:shd w:val="clear" w:color="auto" w:fill="F2F2F2"/>
-      </w:pPr>
-      <w:r>
-        <w:rPr>
-          <w:rFonts w:ascii="Courier New" w:hAnsi="Courier New"/>
-          <w:color w:val="C7254E"/>
-          <w:sz w:val="18"/>
-        </w:rPr>
-        <w:t>Stop-ScheduledTask  -TaskName "eQSO Relay CB"</w:t>
-      </w:r>
-    </w:p>
-    <w:p>
-      <w:pPr>
-        <w:pStyle w:val="NoSpacing"/>
-        <w:ind w:left="454"/>
-        <w:shd w:val="clear" w:color="auto" w:fill="F2F2F2"/>
-      </w:pPr>
-      <w:r>
-        <w:rPr>
-          <w:rFonts w:ascii="Courier New" w:hAnsi="Courier New"/>
-          <w:color w:val="C7254E"/>
-          <w:sz w:val="18"/>
-        </w:rPr>
-        <w:t xml:space="preserve"> </w:t>
-      </w:r>
-    </w:p>
-    <w:p>
-      <w:pPr>
-        <w:pStyle w:val="NoSpacing"/>
-        <w:ind w:left="454"/>
-        <w:shd w:val="clear" w:color="auto" w:fill="F2F2F2"/>
-      </w:pPr>
-      <w:r>
-        <w:rPr>
-          <w:rFonts w:ascii="Courier New" w:hAnsi="Courier New"/>
-          <w:color w:val="C7254E"/>
-          <w:sz w:val="18"/>
-        </w:rPr>
-        <w:t># Arrancar el relay</w:t>
-      </w:r>
-    </w:p>
-    <w:p>
-      <w:pPr>
-        <w:pStyle w:val="NoSpacing"/>
-        <w:ind w:left="454"/>
-        <w:shd w:val="clear" w:color="auto" w:fill="F2F2F2"/>
-      </w:pPr>
-      <w:r>
-        <w:rPr>
-          <w:rFonts w:ascii="Courier New" w:hAnsi="Courier New"/>
-          <w:color w:val="C7254E"/>
-          <w:sz w:val="18"/>
+          <w:rFonts w:ascii="Consolas" w:hAnsi="Consolas" w:eastAsia="Consolas"/>
         </w:rPr>
         <w:t>Start-ScheduledTask -TaskName "eQSO Relay CB"</w:t>
       </w:r>
@@ -1251,198 +996,29 @@
     <w:p>
       <w:pPr>
         <w:pStyle w:val="NoSpacing"/>
-        <w:ind w:left="454"/>
-        <w:shd w:val="clear" w:color="auto" w:fill="F2F2F2"/>
       </w:pPr>
       <w:r>
         <w:rPr>
-          <w:rFonts w:ascii="Courier New" w:hAnsi="Courier New"/>
-          <w:color w:val="C7254E"/>
-          <w:sz w:val="18"/>
+          <w:rFonts w:ascii="Consolas" w:hAnsi="Consolas" w:eastAsia="Consolas"/>
         </w:rPr>
-        <w:t xml:space="preserve"> </w:t>
+        <w:t>Stop-ScheduledTask -TaskName "eQSO Relay CB"; Start-ScheduledTask -TaskName "eQSO Relay CB"</w:t>
       </w:r>
     </w:p>
     <w:p>
       <w:pPr>
         <w:pStyle w:val="NoSpacing"/>
-        <w:ind w:left="454"/>
-        <w:shd w:val="clear" w:color="auto" w:fill="F2F2F2"/>
       </w:pPr>
       <w:r>
         <w:rPr>
-          <w:rFonts w:ascii="Courier New" w:hAnsi="Courier New"/>
-          <w:color w:val="C7254E"/>
-          <w:sz w:val="18"/>
-        </w:rPr>
-        <w:t># Desinstalar</w:t>
-      </w:r>
-    </w:p>
-    <w:p>
-      <w:pPr>
-        <w:pStyle w:val="NoSpacing"/>
-        <w:ind w:left="454"/>
-        <w:shd w:val="clear" w:color="auto" w:fill="F2F2F2"/>
-      </w:pPr>
-      <w:r>
-        <w:rPr>
-          <w:rFonts w:ascii="Courier New" w:hAnsi="Courier New"/>
-          <w:color w:val="C7254E"/>
-          <w:sz w:val="18"/>
+          <w:rFonts w:ascii="Consolas" w:hAnsi="Consolas" w:eastAsia="Consolas"/>
         </w:rPr>
         <w:t>Unregister-ScheduledTask -TaskName "eQSO Relay CB" -Confirm:$false</w:t>
       </w:r>
     </w:p>
     <w:p>
-      <w:pPr>
-        <w:pStyle w:val="NoSpacing"/>
-        <w:ind w:left="454"/>
-        <w:shd w:val="clear" w:color="auto" w:fill="F2F2F2"/>
-      </w:pPr>
+      <w:pPr/>
       <w:r>
-        <w:rPr>
-          <w:rFonts w:ascii="Courier New" w:hAnsi="Courier New"/>
-          <w:color w:val="C7254E"/>
-          <w:sz w:val="18"/>
-        </w:rPr>
-        <w:t xml:space="preserve"> </w:t>
-      </w:r>
-    </w:p>
-    <w:p>
-      <w:pPr>
-        <w:pStyle w:val="NoSpacing"/>
-        <w:ind w:left="454"/>
-        <w:shd w:val="clear" w:color="auto" w:fill="F2F2F2"/>
-      </w:pPr>
-      <w:r>
-        <w:rPr>
-          <w:rFonts w:ascii="Courier New" w:hAnsi="Courier New"/>
-          <w:color w:val="C7254E"/>
-          <w:sz w:val="18"/>
-        </w:rPr>
-        <w:t># Listar dispositivos de audio disponibles</w:t>
-      </w:r>
-    </w:p>
-    <w:p>
-      <w:pPr>
-        <w:pStyle w:val="NoSpacing"/>
-        <w:ind w:left="454"/>
-        <w:shd w:val="clear" w:color="auto" w:fill="F2F2F2"/>
-      </w:pPr>
-      <w:r>
-        <w:rPr>
-          <w:rFonts w:ascii="Courier New" w:hAnsi="Courier New"/>
-          <w:color w:val="C7254E"/>
-          <w:sz w:val="18"/>
-        </w:rPr>
-        <w:t>ffmpeg -list_devices true -f dshow -i dummy</w:t>
-      </w:r>
-    </w:p>
-    <w:p/>
-    <w:p>
-      <w:pPr>
-        <w:pStyle w:val="Heading2"/>
-      </w:pPr>
-      <w:r>
-        <w:rPr>
-          <w:color w:val="2E74B5"/>
-        </w:rPr>
-        <w:t>3.3 Actualizar a nueva versión</w:t>
-      </w:r>
-    </w:p>
-    <w:p>
-      <w:pPr>
-        <w:pStyle w:val="NoSpacing"/>
-        <w:ind w:left="454"/>
-        <w:shd w:val="clear" w:color="auto" w:fill="F2F2F2"/>
-      </w:pPr>
-      <w:r>
-        <w:rPr>
-          <w:rFonts w:ascii="Courier New" w:hAnsi="Courier New"/>
-          <w:color w:val="C7254E"/>
-          <w:sz w:val="18"/>
-        </w:rPr>
-        <w:t>cd $env:USERPROFILE\eqso-linux</w:t>
-      </w:r>
-    </w:p>
-    <w:p>
-      <w:pPr>
-        <w:pStyle w:val="NoSpacing"/>
-        <w:ind w:left="454"/>
-        <w:shd w:val="clear" w:color="auto" w:fill="F2F2F2"/>
-      </w:pPr>
-      <w:r>
-        <w:rPr>
-          <w:rFonts w:ascii="Courier New" w:hAnsi="Courier New"/>
-          <w:color w:val="C7254E"/>
-          <w:sz w:val="18"/>
-        </w:rPr>
-        <w:t>git pull</w:t>
-      </w:r>
-    </w:p>
-    <w:p>
-      <w:pPr>
-        <w:pStyle w:val="NoSpacing"/>
-        <w:ind w:left="454"/>
-        <w:shd w:val="clear" w:color="auto" w:fill="F2F2F2"/>
-      </w:pPr>
-      <w:r>
-        <w:rPr>
-          <w:rFonts w:ascii="Courier New" w:hAnsi="Courier New"/>
-          <w:color w:val="C7254E"/>
-          <w:sz w:val="18"/>
-        </w:rPr>
-        <w:t>pnpm install</w:t>
-      </w:r>
-    </w:p>
-    <w:p>
-      <w:pPr>
-        <w:pStyle w:val="NoSpacing"/>
-        <w:ind w:left="454"/>
-        <w:shd w:val="clear" w:color="auto" w:fill="F2F2F2"/>
-      </w:pPr>
-      <w:r>
-        <w:rPr>
-          <w:rFonts w:ascii="Courier New" w:hAnsi="Courier New"/>
-          <w:color w:val="C7254E"/>
-          <w:sz w:val="18"/>
-        </w:rPr>
-        <w:t>pnpm --filter @workspace/relay-daemon run build</w:t>
-      </w:r>
-    </w:p>
-    <w:p>
-      <w:pPr>
-        <w:pStyle w:val="NoSpacing"/>
-        <w:ind w:left="454"/>
-        <w:shd w:val="clear" w:color="auto" w:fill="F2F2F2"/>
-      </w:pPr>
-      <w:r>
-        <w:rPr>
-          <w:rFonts w:ascii="Courier New" w:hAnsi="Courier New"/>
-          <w:color w:val="C7254E"/>
-          <w:sz w:val="18"/>
-        </w:rPr>
-        <w:t>Stop-ScheduledTask -TaskName "eQSO Relay CB"</w:t>
-      </w:r>
-    </w:p>
-    <w:p>
-      <w:pPr>
-        <w:pStyle w:val="NoSpacing"/>
-        <w:ind w:left="454"/>
-        <w:shd w:val="clear" w:color="auto" w:fill="F2F2F2"/>
-      </w:pPr>
-      <w:r>
-        <w:rPr>
-          <w:rFonts w:ascii="Courier New" w:hAnsi="Courier New"/>
-          <w:color w:val="C7254E"/>
-          <w:sz w:val="18"/>
-        </w:rPr>
-        <w:t>Start-ScheduledTask -TaskName "eQSO Relay CB"</w:t>
-      </w:r>
-    </w:p>
-    <w:p>
-      <w:r>
-        <w:br w:type="page"/>
+        <w:t>Para actualizar, vuelve a ejecutar el lanzador. También puede hacerse manualmente desde %USERPROFILE%\eqso-linux, instalando dependencias, compilando y reiniciando la tarea.</w:t>
       </w:r>
     </w:p>
     <w:p>
@@ -2002,12 +1578,7 @@
         <w:shd w:val="clear" w:color="auto" w:fill="F2F2F2"/>
       </w:pPr>
       <w:r>
-        <w:rPr>
-          <w:rFonts w:ascii="Courier New" w:hAnsi="Courier New"/>
-          <w:color w:val="C7254E"/>
-          <w:sz w:val="18"/>
-        </w:rPr>
-        <w:t xml:space="preserve">    "playbackFormat": "wasapi",</w:t>
+        <w:t xml:space="preserve">    "playbackFormat": "ffplay",</w:t>
       </w:r>
     </w:p>
     <w:p>
@@ -2763,12 +2334,8 @@
             <w:tcW w:w="5840" w:type="dxa"/>
           </w:tcPr>
           <w:p>
-            <w:r/>
             <w:r>
-              <w:rPr>
-                <w:sz w:val="20"/>
-              </w:rPr>
-              <w:t>Dispositivo de captura ALSA (Linux) o nombre dshow/wasapi (Windows)</w:t>
+              <w:t>Dispositivo de captura ALSA (Linux) o nombre DirectShow (Windows)</w:t>
             </w:r>
           </w:p>
         </w:tc>
@@ -2913,12 +2480,8 @@
             <w:tcW w:w="5840" w:type="dxa"/>
           </w:tcPr>
           <w:p>
-            <w:r/>
             <w:r>
-              <w:rPr>
-                <w:sz w:val="20"/>
-              </w:rPr>
-              <w:t>Solo backend ffmpeg: "wasapi" (Win), "alsa" (Linux), "coreaudio" (Mac)</w:t>
+              <w:t>Solo backend ffmpeg: "ffplay" (Win), "alsa" (Linux), "coreaudio" (Mac)</w:t>
             </w:r>
           </w:p>
         </w:tc>

</xml_diff>

<commit_message>
Link manual to concrete relay installer downloads
</commit_message>
<xml_diff>
--- a/guia_relay_instalacion.docx
+++ b/guia_relay_instalacion.docx
@@ -309,6 +309,22 @@
       </w:r>
     </w:p>
     <w:p>
+      <w:hyperlink r:id="rId9">
+        <w:r>
+          <w:rPr>
+            <w:color w:val="0563C1"/>
+            <w:u w:val="single"/>
+          </w:rPr>
+          <w:t>https://github.com/daycart/eqso-linux/raw/refs/heads/main/artifacts/relay-daemon/install/install-relay.sh</w:t>
+        </w:r>
+      </w:hyperlink>
+    </w:p>
+    <w:p>
+      <w:r>
+        <w:t>Descarga directa del instalador:</w:t>
+      </w:r>
+    </w:p>
+    <w:p>
       <w:pPr>
         <w:pStyle w:val="NoSpacing"/>
       </w:pPr>
@@ -803,19 +819,38 @@
     <w:p>
       <w:pPr/>
       <w:r>
-        <w:t>Descarga install-relay-windows.cmd desde la carpeta de instalación del repositorio:</w:t>
+        <w:t>Descarga el ZIP del lanzador de Windows:</w:t>
       </w:r>
     </w:p>
     <w:p>
+      <w:r>
+        <w:t>Enlace directo al archivo .cmd:</w:t>
+      </w:r>
+    </w:p>
+    <w:p>
+      <w:hyperlink r:id="rId11">
+        <w:r>
+          <w:rPr>
+            <w:color w:val="0563C1"/>
+            <w:u w:val="single"/>
+          </w:rPr>
+          <w:t>https://github.com/daycart/eqso-linux/raw/refs/heads/test/windows-relay-installer/artifacts/relay-daemon/install/install-relay-windows.cmd</w:t>
+        </w:r>
+      </w:hyperlink>
+    </w:p>
+    <w:p>
       <w:pPr>
         <w:pStyle w:val="NoSpacing"/>
       </w:pPr>
-      <w:r>
-        <w:rPr>
-          <w:rFonts w:ascii="Consolas" w:hAnsi="Consolas" w:eastAsia="Consolas"/>
-        </w:rPr>
-        <w:t>https://github.com/daycart/eqso-linux/tree/test/windows-relay-installer/artifacts/relay-daemon/install</w:t>
-      </w:r>
+      <w:hyperlink r:id="rId10">
+        <w:r>
+          <w:rPr>
+            <w:color w:val="0563C1"/>
+            <w:u w:val="single"/>
+          </w:rPr>
+          <w:t>https://github.com/daycart/eqso-linux/raw/refs/heads/test/windows-relay-installer/artifacts/relay-daemon/install/install-relay-windows.zip</w:t>
+        </w:r>
+      </w:hyperlink>
     </w:p>
     <w:p>
       <w:pPr/>

</xml_diff>

<commit_message>
Explain Linux and Windows relay administration commands
</commit_message>
<xml_diff>
--- a/guia_relay_instalacion.docx
+++ b/guia_relay_instalacion.docx
@@ -33,7 +33,7 @@
         <w:jc w:val="center"/>
       </w:pPr>
       <w:r>
-        <w:t>Versión 1.4 — Agosto 2026</w:t>
+        <w:t>Versión 1.5 — Agosto 2026</w:t>
       </w:r>
     </w:p>
     <w:p>
@@ -685,119 +685,178 @@
       </w:r>
     </w:p>
     <w:p>
-      <w:pPr>
-        <w:pStyle w:val="NoSpacing"/>
-      </w:pPr>
-      <w:r>
-        <w:rPr>
-          <w:rFonts w:ascii="Consolas" w:hAnsi="Consolas" w:eastAsia="Consolas"/>
-        </w:rPr>
+      <w:r>
+        <w:t>Sustituye CB por el nombre real de la sala. El servicio se llama eqso-relay@&lt;SALA&gt; y está gestionado por systemd.</w:t>
+      </w:r>
+    </w:p>
+    <w:p>
+      <w:r>
+        <w:t>Actualizar el software</w:t>
+      </w:r>
+    </w:p>
+    <w:p>
+      <w:r>
+        <w:t>Usa estos pasos cuando quieras traer una versión nueva del repositorio:</w:t>
+      </w:r>
+    </w:p>
+    <w:p>
+      <w:r>
         <w:t>cd ~/eqso-linux-client</w:t>
       </w:r>
     </w:p>
     <w:p>
-      <w:pPr>
-        <w:pStyle w:val="NoSpacing"/>
-      </w:pPr>
-      <w:r>
-        <w:rPr>
-          <w:rFonts w:ascii="Consolas" w:hAnsi="Consolas" w:eastAsia="Consolas"/>
-        </w:rPr>
+      <w:r>
         <w:t>git pull</w:t>
       </w:r>
     </w:p>
     <w:p>
-      <w:pPr>
-        <w:pStyle w:val="NoSpacing"/>
-      </w:pPr>
-      <w:r>
-        <w:rPr>
-          <w:rFonts w:ascii="Consolas" w:hAnsi="Consolas" w:eastAsia="Consolas"/>
-        </w:rPr>
+      <w:r>
         <w:t>pnpm install</w:t>
       </w:r>
     </w:p>
     <w:p>
-      <w:pPr>
-        <w:pStyle w:val="NoSpacing"/>
-      </w:pPr>
-      <w:r>
-        <w:rPr>
-          <w:rFonts w:ascii="Consolas" w:hAnsi="Consolas" w:eastAsia="Consolas"/>
-        </w:rPr>
+      <w:r>
         <w:t>pnpm --filter @workspace/relay-daemon run build</w:t>
       </w:r>
     </w:p>
     <w:p>
-      <w:pPr>
-        <w:pStyle w:val="NoSpacing"/>
-      </w:pPr>
-      <w:r>
-        <w:rPr>
-          <w:rFonts w:ascii="Consolas" w:hAnsi="Consolas" w:eastAsia="Consolas"/>
-        </w:rPr>
+      <w:r>
         <w:t>sudo systemctl restart eqso-relay@CB</w:t>
       </w:r>
     </w:p>
     <w:p>
-      <w:pPr/>
+      <w:r>
+        <w:t>Qué hace cada comando:</w:t>
+      </w:r>
+    </w:p>
+    <w:p>
+      <w:r>
+        <w:t>• cd entra en la copia local del proyecto donde está instalado el relay.</w:t>
+      </w:r>
+    </w:p>
+    <w:p>
+      <w:r>
+        <w:t>• git pull descarga los cambios publicados en GitHub. No reinicia el servicio por sí solo.</w:t>
+      </w:r>
+    </w:p>
+    <w:p>
+      <w:r>
+        <w:t>• pnpm install instala o actualiza las dependencias que necesita el proyecto.</w:t>
+      </w:r>
+    </w:p>
+    <w:p>
+      <w:r>
+        <w:t>• pnpm ... build compila el relay daemon que ejecutará systemd.</w:t>
+      </w:r>
+    </w:p>
+    <w:p>
+      <w:r>
+        <w:t>• systemctl restart detiene la versión anterior y arranca la nueva. También aplica los cambios del archivo JSON.</w:t>
+      </w:r>
+    </w:p>
+    <w:p>
       <w:r>
         <w:t>La configuración está en /etc/eqso-relay/CB.json. Después de modificarla, reinicia el servicio para aplicar los cambios.</w:t>
       </w:r>
     </w:p>
     <w:p>
-      <w:pPr>
-        <w:pStyle w:val="NoSpacing"/>
-      </w:pPr>
-      <w:r>
-        <w:rPr>
-          <w:rFonts w:ascii="Consolas" w:hAnsi="Consolas" w:eastAsia="Consolas"/>
-        </w:rPr>
+      <w:r>
+        <w:t>Consultar el estado y los registros</w:t>
+      </w:r>
+    </w:p>
+    <w:p>
+      <w:r>
         <w:t>sudo systemctl status eqso-relay@CB</w:t>
       </w:r>
     </w:p>
     <w:p>
-      <w:pPr>
-        <w:pStyle w:val="NoSpacing"/>
-      </w:pPr>
-      <w:r>
-        <w:rPr>
-          <w:rFonts w:ascii="Consolas" w:hAnsi="Consolas" w:eastAsia="Consolas"/>
-        </w:rPr>
+      <w:r>
+        <w:t>Muestra si el relay está activo, su PID, el tiempo que lleva funcionando y las últimas líneas del servicio. Solo consulta; no cambia nada.</w:t>
+      </w:r>
+    </w:p>
+    <w:p>
+      <w:r>
         <w:t>sudo journalctl -u eqso-relay@CB -f</w:t>
       </w:r>
     </w:p>
     <w:p>
-      <w:pPr>
-        <w:pStyle w:val="NoSpacing"/>
-      </w:pPr>
-      <w:r>
-        <w:rPr>
-          <w:rFonts w:ascii="Consolas" w:hAnsi="Consolas" w:eastAsia="Consolas"/>
-        </w:rPr>
+      <w:r>
+        <w:t>Muestra en tiempo real los mensajes del relay, incluidos errores de audio, conexión, VOX y PTT. Pulsa Ctrl+C para dejar de verlos; el relay sigue funcionando.</w:t>
+      </w:r>
+    </w:p>
+    <w:p>
+      <w:r>
+        <w:t>curl http://127.0.0.1:8009/status</w:t>
+      </w:r>
+    </w:p>
+    <w:p>
+      <w:r>
+        <w:t>Consulta el estado HTTP local del daemon y sus contadores TX/RX. No reinicia ni modifica el servicio.</w:t>
+      </w:r>
+    </w:p>
+    <w:p>
+      <w:r>
+        <w:t>Parar, iniciar y reiniciar</w:t>
+      </w:r>
+    </w:p>
+    <w:p>
+      <w:r>
         <w:t>sudo systemctl stop eqso-relay@CB</w:t>
       </w:r>
     </w:p>
     <w:p>
-      <w:pPr>
-        <w:pStyle w:val="NoSpacing"/>
-      </w:pPr>
-      <w:r>
-        <w:rPr>
-          <w:rFonts w:ascii="Consolas" w:hAnsi="Consolas" w:eastAsia="Consolas"/>
-        </w:rPr>
+      <w:r>
+        <w:t>Detiene temporalmente el relay para hacer mantenimiento. El servicio sigue instalado y, al ser una parada manual, no se reinicia automáticamente.</w:t>
+      </w:r>
+    </w:p>
+    <w:p>
+      <w:r>
+        <w:t>sudo systemctl start eqso-relay@CB</w:t>
+      </w:r>
+    </w:p>
+    <w:p>
+      <w:r>
+        <w:t>Arranca un relay que estaba parado, sin recompilar ni modificar la configuración.</w:t>
+      </w:r>
+    </w:p>
+    <w:p>
+      <w:r>
         <w:t>sudo systemctl restart eqso-relay@CB</w:t>
       </w:r>
     </w:p>
     <w:p>
-      <w:pPr>
-        <w:pStyle w:val="NoSpacing"/>
-      </w:pPr>
-      <w:r>
-        <w:rPr>
-          <w:rFonts w:ascii="Consolas" w:hAnsi="Consolas" w:eastAsia="Consolas"/>
-        </w:rPr>
-        <w:t>curl http://127.0.0.1:8009/status</w:t>
+      <w:r>
+        <w:t>Hace stop y start seguidos. Es el comando indicado después de cambiar el JSON o compilar una versión nueva.</w:t>
+      </w:r>
+    </w:p>
+    <w:p>
+      <w:r>
+        <w:t>Activar el arranque automático después de reiniciar la Raspberry Pi:</w:t>
+      </w:r>
+    </w:p>
+    <w:p>
+      <w:r>
+        <w:t>sudo systemctl enable eqso-relay@CB</w:t>
+      </w:r>
+    </w:p>
+    <w:p>
+      <w:r>
+        <w:t>Registra el servicio para que se inicie con systemd en el siguiente arranque, pero no lo inicia ahora.</w:t>
+      </w:r>
+    </w:p>
+    <w:p>
+      <w:r>
+        <w:t>Para registrarlo y arrancarlo inmediatamente:</w:t>
+      </w:r>
+    </w:p>
+    <w:p>
+      <w:r>
+        <w:t>sudo systemctl enable --now eqso-relay@CB</w:t>
+      </w:r>
+    </w:p>
+    <w:p>
+      <w:r>
+        <w:t>Sustituye CB por la sala real en todos los comandos. Si solo quieres ver los logs, Ctrl+C cierra únicamente la vista del log y no detiene el relay.</w:t>
       </w:r>
     </w:p>
     <w:p>
@@ -990,70 +1049,98 @@
       </w:r>
     </w:p>
     <w:p>
-      <w:pPr/>
-      <w:r>
-        <w:t>El log de la tarea se guarda en C:\eqso-relay\relay-&lt;SALA&gt;.log. Sustituye CB por el nombre real de la sala.</w:t>
-      </w:r>
-    </w:p>
-    <w:p>
-      <w:pPr>
-        <w:pStyle w:val="NoSpacing"/>
-      </w:pPr>
-      <w:r>
-        <w:rPr>
-          <w:rFonts w:ascii="Consolas" w:hAnsi="Consolas" w:eastAsia="Consolas"/>
-        </w:rPr>
+      <w:r>
+        <w:t>Sustituye CB por el nombre real de la sala. La instalación crea la tarea programada eQSO Relay CB, el archivo C:\eqso-relay\CB.json y el log C:\eqso-relay\relay-CB.log.</w:t>
+      </w:r>
+    </w:p>
+    <w:p>
+      <w:r>
+        <w:t>Consultar el log en tiempo real</w:t>
+      </w:r>
+    </w:p>
+    <w:p>
+      <w:r>
         <w:t>Get-Content "C:\eqso-relay\relay-CB.log" -Wait -Tail 20</w:t>
       </w:r>
     </w:p>
     <w:p>
-      <w:pPr>
-        <w:pStyle w:val="NoSpacing"/>
-      </w:pPr>
-      <w:r>
-        <w:rPr>
-          <w:rFonts w:ascii="Consolas" w:hAnsi="Consolas" w:eastAsia="Consolas"/>
-        </w:rPr>
+      <w:r>
+        <w:t>Muestra las últimas 20 líneas y, gracias a -Wait, sigue mostrando las nuevas líneas a medida que se escriben. Pulsa Ctrl+C para salir de la vista; no detiene el relay.</w:t>
+      </w:r>
+    </w:p>
+    <w:p>
+      <w:r>
+        <w:t>Parar el relay</w:t>
+      </w:r>
+    </w:p>
+    <w:p>
+      <w:r>
         <w:t>Stop-ScheduledTask -TaskName "eQSO Relay CB"</w:t>
       </w:r>
     </w:p>
     <w:p>
-      <w:pPr>
-        <w:pStyle w:val="NoSpacing"/>
-      </w:pPr>
-      <w:r>
-        <w:rPr>
-          <w:rFonts w:ascii="Consolas" w:hAnsi="Consolas" w:eastAsia="Consolas"/>
-        </w:rPr>
+      <w:r>
+        <w:t>Detiene el proceso actual del relay. La tarea sigue registrada, y no se borran ni la configuración, ni los logs, ni el código descargado.</w:t>
+      </w:r>
+    </w:p>
+    <w:p>
+      <w:r>
+        <w:t>Iniciar el relay</w:t>
+      </w:r>
+    </w:p>
+    <w:p>
+      <w:r>
         <w:t>Start-ScheduledTask -TaskName "eQSO Relay CB"</w:t>
       </w:r>
     </w:p>
     <w:p>
-      <w:pPr>
-        <w:pStyle w:val="NoSpacing"/>
-      </w:pPr>
-      <w:r>
-        <w:rPr>
-          <w:rFonts w:ascii="Consolas" w:hAnsi="Consolas" w:eastAsia="Consolas"/>
-        </w:rPr>
+      <w:r>
+        <w:t>Arranca la tarea programada registrada. Es útil después de una parada manual o para iniciar una instalación que se dejó detenida en modo máquina virtual.</w:t>
+      </w:r>
+    </w:p>
+    <w:p>
+      <w:r>
+        <w:t>Reiniciar el relay</w:t>
+      </w:r>
+    </w:p>
+    <w:p>
+      <w:r>
         <w:t>Stop-ScheduledTask -TaskName "eQSO Relay CB"; Start-ScheduledTask -TaskName "eQSO Relay CB"</w:t>
       </w:r>
     </w:p>
     <w:p>
-      <w:pPr>
-        <w:pStyle w:val="NoSpacing"/>
-      </w:pPr>
-      <w:r>
-        <w:rPr>
-          <w:rFonts w:ascii="Consolas" w:hAnsi="Consolas" w:eastAsia="Consolas"/>
-        </w:rPr>
+      <w:r>
+        <w:t>Ejecuta una parada y un inicio seguidos. Úsalo después de modificar C:\eqso-relay\CB.json o de actualizar y recompilar el código.</w:t>
+      </w:r>
+    </w:p>
+    <w:p>
+      <w:r>
+        <w:t>Actualizar el software</w:t>
+      </w:r>
+    </w:p>
+    <w:p>
+      <w:r>
+        <w:t>La forma recomendada es volver a ejecutar install-relay-windows.cmd como Administrador. El lanzador actualiza el repositorio y recompila el daemon. Después, inicia la tarea si la instalación es para un PC físico.</w:t>
+      </w:r>
+    </w:p>
+    <w:p>
+      <w:r>
+        <w:t>Quitar el arranque automático</w:t>
+      </w:r>
+    </w:p>
+    <w:p>
+      <w:r>
         <w:t>Unregister-ScheduledTask -TaskName "eQSO Relay CB" -Confirm:$false</w:t>
       </w:r>
     </w:p>
     <w:p>
-      <w:pPr/>
-      <w:r>
-        <w:t>Para actualizar, vuelve a ejecutar el lanzador. También puede hacerse manualmente desde %USERPROFILE%\eqso-linux, instalando dependencias, compilando y reiniciando la tarea.</w:t>
+      <w:r>
+        <w:t>Elimina la tarea del Programador de tareas y deja de iniciarse automáticamente al iniciar sesión. No borra el JSON, los logs ni el código descargado. Para volver a registrarla hay que ejecutar de nuevo el instalador.</w:t>
+      </w:r>
+    </w:p>
+    <w:p>
+      <w:r>
+        <w:t>Si solo quieres detenerlo temporalmente, utiliza Stop-ScheduledTask; no uses Unregister-ScheduledTask.</w:t>
       </w:r>
     </w:p>
     <w:p>

</xml_diff>

<commit_message>
Document Windows relay log troubleshooting
</commit_message>
<xml_diff>
--- a/guia_relay_instalacion.docx
+++ b/guia_relay_instalacion.docx
@@ -33,7 +33,7 @@
         <w:jc w:val="center"/>
       </w:pPr>
       <w:r>
-        <w:t>Versión 1.5 — Agosto 2026</w:t>
+        <w:t>Versión 1.6 — Agosto 2026</w:t>
       </w:r>
     </w:p>
     <w:p>
@@ -1055,6 +1055,11 @@
     </w:p>
     <w:p>
       <w:r>
+        <w:t>El instalador crea el archivo de log antes de arrancar la tarea. El script de arranque añade una línea de inicio y otra de finalización con el código de salida; así también queda registrado un error de Node, audio o ruta.</w:t>
+      </w:r>
+    </w:p>
+    <w:p>
+      <w:r>
         <w:t>Consultar el log en tiempo real</w:t>
       </w:r>
     </w:p>
@@ -1066,6 +1071,31 @@
     <w:p>
       <w:r>
         <w:t>Muestra las últimas 20 líneas y, gracias a -Wait, sigue mostrando las nuevas líneas a medida que se escriben. Pulsa Ctrl+C para salir de la vista; no detiene el relay.</w:t>
+      </w:r>
+    </w:p>
+    <w:p>
+      <w:r>
+        <w:t>Para comprobar si existe el archivo y cuándo se ejecutó la tarea:</w:t>
+      </w:r>
+    </w:p>
+    <w:p>
+      <w:r>
+        <w:t>Test-Path "C:\eqso-relay\relay-CB.log"</w:t>
+      </w:r>
+    </w:p>
+    <w:p>
+      <w:r>
+        <w:t>Get-ScheduledTaskInfo -TaskName "eQSO Relay CB"</w:t>
+      </w:r>
+    </w:p>
+    <w:p>
+      <w:r>
+        <w:t>Test-Path devuelve True si el archivo existe. Get-ScheduledTaskInfo muestra la última ejecución y el código de resultado de la tarea. Si el log no existe después de instalar, vuelve a ejecutar el instalador actualizado como Administrador.</w:t>
+      </w:r>
+    </w:p>
+    <w:p>
+      <w:r>
+        <w:t>La sintaxis correcta es Get-Content "C:\..."; Get-C:\... no es un comando válido de PowerShell.</w:t>
       </w:r>
     </w:p>
     <w:p>

</xml_diff>

<commit_message>
Document hidden Windows relay daemon startup
</commit_message>
<xml_diff>
--- a/guia_relay_instalacion.docx
+++ b/guia_relay_instalacion.docx
@@ -33,7 +33,7 @@
         <w:jc w:val="center"/>
       </w:pPr>
       <w:r>
-        <w:t>Versión 1.6 — Agosto 2026</w:t>
+        <w:t>Versión 1.7 — Agosto 2026</w:t>
       </w:r>
     </w:p>
     <w:p>
@@ -1038,6 +1038,11 @@
       </w:pPr>
       <w:r>
         <w:t>La tarea se reinicia automáticamente si el proceso falla. En PC físico se inicia inmediatamente; en VM queda registrada pero detenida.</w:t>
+      </w:r>
+    </w:p>
+    <w:p>
+      <w:r>
+        <w:t>La tarea utiliza un lanzador oculto de Windows para que el daemon funcione en segundo plano sin dejar una ventana CMD en primer plano. Si se abre manualmente start-&lt;SALA&gt;.cmd, sí es normal que la ventana permanezca abierta mientras el daemon está funcionando.</w:t>
       </w:r>
     </w:p>
     <w:p>

</xml_diff>

<commit_message>
Document complete Windows relay stop procedure
</commit_message>
<xml_diff>
--- a/guia_relay_instalacion.docx
+++ b/guia_relay_instalacion.docx
@@ -33,7 +33,7 @@
         <w:jc w:val="center"/>
       </w:pPr>
       <w:r>
-        <w:t>Versión 1.7 — Agosto 2026</w:t>
+        <w:t>Versión 1.8 — Agosto 2026</w:t>
       </w:r>
     </w:p>
     <w:p>
@@ -907,7 +907,7 @@
             <w:color w:val="0563C1"/>
             <w:u w:val="single"/>
           </w:rPr>
-          <w:t>https://github.com/daycart/eqso-linux/raw/refs/heads/test/windows-relay-installer/artifacts/relay-daemon/install/install-relay-windows-v1.7.zip</w:t>
+          <w:t>https://github.com/daycart/eqso-linux/raw/refs/heads/test/windows-relay-installer/artifacts/relay-daemon/install/install-relay-windows-v1.8.zip</w:t>
         </w:r>
       </w:hyperlink>
     </w:p>
@@ -1110,12 +1110,17 @@
     </w:p>
     <w:p>
       <w:r>
-        <w:t>Stop-ScheduledTask -TaskName "eQSO Relay CB"</w:t>
-      </w:r>
-    </w:p>
-    <w:p>
-      <w:r>
-        <w:t>Detiene el proceso actual del relay. La tarea sigue registrada, y no se borran ni la configuración, ni los logs, ni el código descargado.</w:t>
+        <w:t>powershell.exe -ExecutionPolicy Bypass -File "C:\eqso-relay\stop-CB.ps1"</w:t>
+      </w:r>
+    </w:p>
+    <w:p>
+      <w:r>
+        <w:t>Detiene la tarea y también el proceso node.exe de esta sala, junto con sus procesos de audio FFmpeg/FFplay. La tarea sigue registrada y no se borran la configuración ni los logs.</w:t>
+      </w:r>
+    </w:p>
+    <w:p>
+      <w:r>
+        <w:t>No utilices Stop-ScheduledTask por sí solo con el lanzador oculto: puede detener la tarea de Windows y dejar vivo el proceso hijo, haciendo que el log continúe recibiendo datos.</w:t>
       </w:r>
     </w:p>
     <w:p>
@@ -1140,12 +1145,12 @@
     </w:p>
     <w:p>
       <w:r>
-        <w:t>Stop-ScheduledTask -TaskName "eQSO Relay CB"; Start-ScheduledTask -TaskName "eQSO Relay CB"</w:t>
-      </w:r>
-    </w:p>
-    <w:p>
-      <w:r>
-        <w:t>Ejecuta una parada y un inicio seguidos. Úsalo después de modificar C:\eqso-relay\CB.json o de actualizar y recompilar el código.</w:t>
+        <w:t>powershell.exe -ExecutionPolicy Bypass -File "C:\eqso-relay\stop-CB.ps1"; Start-ScheduledTask -TaskName "eQSO Relay CB"</w:t>
+      </w:r>
+    </w:p>
+    <w:p>
+      <w:r>
+        <w:t>Ejecuta la parada completa y vuelve a iniciar la tarea. Úsalo después de modificar C:\eqso-relay\CB.json o de actualizar y recompilar el código.</w:t>
       </w:r>
     </w:p>
     <w:p>
@@ -1165,17 +1170,17 @@
     </w:p>
     <w:p>
       <w:r>
-        <w:t>Unregister-ScheduledTask -TaskName "eQSO Relay CB" -Confirm:$false</w:t>
-      </w:r>
-    </w:p>
-    <w:p>
-      <w:r>
-        <w:t>Elimina la tarea del Programador de tareas y deja de iniciarse automáticamente al iniciar sesión. No borra el JSON, los logs ni el código descargado. Para volver a registrarla hay que ejecutar de nuevo el instalador.</w:t>
-      </w:r>
-    </w:p>
-    <w:p>
-      <w:r>
-        <w:t>Si solo quieres detenerlo temporalmente, utiliza Stop-ScheduledTask; no uses Unregister-ScheduledTask.</w:t>
+        <w:t>powershell.exe -ExecutionPolicy Bypass -File "C:\eqso-relay\stop-CB.ps1"; Unregister-ScheduledTask -TaskName "eQSO Relay CB" -Confirm:$false</w:t>
+      </w:r>
+    </w:p>
+    <w:p>
+      <w:r>
+        <w:t>Primero detiene el daemon y sus procesos de audio; después elimina la tarea del Programador de tareas. No borra el JSON, los logs ni el código descargado. Para volver a registrarla hay que ejecutar de nuevo el instalador.</w:t>
+      </w:r>
+    </w:p>
+    <w:p>
+      <w:r>
+        <w:t>Para detenerlo temporalmente utiliza siempre stop-CB.ps1; no uses Unregister-ScheduledTask salvo que quieras quitar también la tarea programada.</w:t>
       </w:r>
     </w:p>
     <w:p>

</xml_diff>